<commit_message>
Start on bayesian network q
</commit_message>
<xml_diff>
--- a/assignment2/A2_COMP9016_Nagle_JohnPaul_R00065426.docx
+++ b/assignment2/A2_COMP9016_Nagle_JohnPaul_R00065426.docx
@@ -56,7 +56,15 @@
         </w:tabs>
       </w:pPr>
       <w:r>
-        <w:t>See code .py file</w:t>
+        <w:t>See code .</w:t>
+      </w:r>
+      <w:proofErr w:type="spellStart"/>
+      <w:r>
+        <w:t>py</w:t>
+      </w:r>
+      <w:proofErr w:type="spellEnd"/>
+      <w:r>
+        <w:t xml:space="preserve"> file</w:t>
       </w:r>
     </w:p>
     <w:p>
@@ -71,7 +79,15 @@
         </w:tabs>
       </w:pPr>
       <w:r>
-        <w:t>See code .py file</w:t>
+        <w:t>See code .</w:t>
+      </w:r>
+      <w:proofErr w:type="spellStart"/>
+      <w:r>
+        <w:t>py</w:t>
+      </w:r>
+      <w:proofErr w:type="spellEnd"/>
+      <w:r>
+        <w:t xml:space="preserve"> file</w:t>
       </w:r>
     </w:p>
     <w:p>
@@ -86,19 +102,27 @@
         </w:tabs>
       </w:pPr>
       <w:r>
-        <w:t>See code .py file</w:t>
-      </w:r>
-    </w:p>
-    <w:p>
-      <w:pPr>
-        <w:pStyle w:val="ListParagraph"/>
-        <w:numPr>
-          <w:ilvl w:val="3"/>
-          <w:numId w:val="1"/>
-        </w:numPr>
-        <w:tabs>
-          <w:tab w:val="left" w:pos="5560"/>
-        </w:tabs>
+        <w:t>See code .</w:t>
+      </w:r>
+      <w:proofErr w:type="spellStart"/>
+      <w:r>
+        <w:t>py</w:t>
+      </w:r>
+      <w:proofErr w:type="spellEnd"/>
+      <w:r>
+        <w:t xml:space="preserve"> file</w:t>
+      </w:r>
+    </w:p>
+    <w:p>
+      <w:pPr>
+        <w:tabs>
+          <w:tab w:val="left" w:pos="5560"/>
+        </w:tabs>
+      </w:pPr>
+    </w:p>
+    <w:p>
+      <w:pPr>
+        <w:pStyle w:val="Heading2"/>
       </w:pPr>
       <w:r>
         <w:t>Forward Chaining</w:t>
@@ -144,42 +168,98 @@
           <w:bCs/>
         </w:rPr>
       </w:pPr>
-      <w:r>
-        <w:rPr>
-          <w:b/>
-          <w:bCs/>
-        </w:rPr>
-        <w:t>TaughtBy relationships:</w:t>
-      </w:r>
-    </w:p>
-    <w:p>
-      <w:pPr>
-        <w:tabs>
-          <w:tab w:val="left" w:pos="5560"/>
-        </w:tabs>
-      </w:pPr>
-      <w:r>
-        <w:t>TaughtBy(Eve, DrDan) — because Eve takes COMP9016, and DrDan teaches it.</w:t>
-      </w:r>
-    </w:p>
-    <w:p>
-      <w:pPr>
-        <w:tabs>
-          <w:tab w:val="left" w:pos="5560"/>
-        </w:tabs>
-      </w:pPr>
-      <w:r>
-        <w:t>TaughtBy(Bob, DrLisa) — because Bob takes COMP9061, and DrLisa teaches it.</w:t>
-      </w:r>
-    </w:p>
-    <w:p>
-      <w:pPr>
-        <w:tabs>
-          <w:tab w:val="left" w:pos="5560"/>
-        </w:tabs>
-      </w:pPr>
-      <w:r>
-        <w:t>TaughtBy(Alice, DrSophie) — because Alice takes COMP9062, and DrSophie teaches it.</w:t>
+      <w:proofErr w:type="spellStart"/>
+      <w:r>
+        <w:rPr>
+          <w:b/>
+          <w:bCs/>
+        </w:rPr>
+        <w:t>TaughtBy</w:t>
+      </w:r>
+      <w:proofErr w:type="spellEnd"/>
+      <w:r>
+        <w:rPr>
+          <w:b/>
+          <w:bCs/>
+        </w:rPr>
+        <w:t xml:space="preserve"> relationships:</w:t>
+      </w:r>
+    </w:p>
+    <w:p>
+      <w:pPr>
+        <w:tabs>
+          <w:tab w:val="left" w:pos="5560"/>
+        </w:tabs>
+      </w:pPr>
+      <w:proofErr w:type="spellStart"/>
+      <w:r>
+        <w:t>TaughtBy</w:t>
+      </w:r>
+      <w:proofErr w:type="spellEnd"/>
+      <w:r>
+        <w:t>(Eve, DrDan) — because Eve takes COMP9016, and DrDan teaches it.</w:t>
+      </w:r>
+    </w:p>
+    <w:p>
+      <w:pPr>
+        <w:tabs>
+          <w:tab w:val="left" w:pos="5560"/>
+        </w:tabs>
+      </w:pPr>
+      <w:proofErr w:type="spellStart"/>
+      <w:r>
+        <w:t>TaughtBy</w:t>
+      </w:r>
+      <w:proofErr w:type="spellEnd"/>
+      <w:r>
+        <w:t xml:space="preserve">(Bob, </w:t>
+      </w:r>
+      <w:proofErr w:type="spellStart"/>
+      <w:r>
+        <w:t>DrLisa</w:t>
+      </w:r>
+      <w:proofErr w:type="spellEnd"/>
+      <w:r>
+        <w:t xml:space="preserve">) — because Bob takes COMP9061, and </w:t>
+      </w:r>
+      <w:proofErr w:type="spellStart"/>
+      <w:r>
+        <w:t>DrLisa</w:t>
+      </w:r>
+      <w:proofErr w:type="spellEnd"/>
+      <w:r>
+        <w:t xml:space="preserve"> teaches it.</w:t>
+      </w:r>
+    </w:p>
+    <w:p>
+      <w:pPr>
+        <w:tabs>
+          <w:tab w:val="left" w:pos="5560"/>
+        </w:tabs>
+      </w:pPr>
+      <w:proofErr w:type="spellStart"/>
+      <w:r>
+        <w:t>TaughtBy</w:t>
+      </w:r>
+      <w:proofErr w:type="spellEnd"/>
+      <w:r>
+        <w:t xml:space="preserve">(Alice, </w:t>
+      </w:r>
+      <w:proofErr w:type="spellStart"/>
+      <w:r>
+        <w:t>DrSophie</w:t>
+      </w:r>
+      <w:proofErr w:type="spellEnd"/>
+      <w:r>
+        <w:t xml:space="preserve">) — because Alice takes COMP9062, and </w:t>
+      </w:r>
+      <w:proofErr w:type="spellStart"/>
+      <w:r>
+        <w:t>DrSophie</w:t>
+      </w:r>
+      <w:proofErr w:type="spellEnd"/>
+      <w:r>
+        <w:t xml:space="preserve"> teaches it.</w:t>
       </w:r>
     </w:p>
     <w:p>
@@ -268,53 +348,77 @@
           <w:tab w:val="left" w:pos="5560"/>
         </w:tabs>
       </w:pPr>
-      <w:r>
-        <w:t>IndirectPrereq(COMP9016, COMP9061) — because COMP9016 is a prerequisite for COMP9062, and COMP9062 is a prerequisite for COMP9061.</w:t>
-      </w:r>
-    </w:p>
-    <w:p>
-      <w:pPr>
-        <w:tabs>
-          <w:tab w:val="left" w:pos="5560"/>
-        </w:tabs>
-      </w:pPr>
-    </w:p>
-    <w:p>
-      <w:pPr>
-        <w:tabs>
-          <w:tab w:val="left" w:pos="5560"/>
-        </w:tabs>
-        <w:rPr>
-          <w:b/>
-          <w:bCs/>
-        </w:rPr>
-      </w:pPr>
-      <w:r>
-        <w:rPr>
-          <w:b/>
-          <w:bCs/>
-        </w:rPr>
-        <w:t>CanEnroll:</w:t>
-      </w:r>
-    </w:p>
-    <w:p>
-      <w:pPr>
-        <w:tabs>
-          <w:tab w:val="left" w:pos="5560"/>
-        </w:tabs>
-      </w:pPr>
-      <w:r>
-        <w:t>CanEnroll(Bob, COMP9061) — Bob is eligible for COMP9061 and has not passed it.</w:t>
-      </w:r>
-    </w:p>
-    <w:p>
-      <w:pPr>
-        <w:tabs>
-          <w:tab w:val="left" w:pos="5560"/>
-        </w:tabs>
-      </w:pPr>
-      <w:r>
-        <w:t>CanEnroll(Alice, COMP9062) — Alice is eligible for COMP9062 and has not passed it.</w:t>
+      <w:proofErr w:type="spellStart"/>
+      <w:r>
+        <w:t>IndirectPrereq</w:t>
+      </w:r>
+      <w:proofErr w:type="spellEnd"/>
+      <w:r>
+        <w:t>(COMP9016, COMP9061) — because COMP9016 is a prerequisite for COMP9062, and COMP9062 is a prerequisite for COMP9061.</w:t>
+      </w:r>
+    </w:p>
+    <w:p>
+      <w:pPr>
+        <w:tabs>
+          <w:tab w:val="left" w:pos="5560"/>
+        </w:tabs>
+      </w:pPr>
+    </w:p>
+    <w:p>
+      <w:pPr>
+        <w:tabs>
+          <w:tab w:val="left" w:pos="5560"/>
+        </w:tabs>
+        <w:rPr>
+          <w:b/>
+          <w:bCs/>
+        </w:rPr>
+      </w:pPr>
+      <w:proofErr w:type="spellStart"/>
+      <w:r>
+        <w:rPr>
+          <w:b/>
+          <w:bCs/>
+        </w:rPr>
+        <w:t>CanEnroll</w:t>
+      </w:r>
+      <w:proofErr w:type="spellEnd"/>
+      <w:r>
+        <w:rPr>
+          <w:b/>
+          <w:bCs/>
+        </w:rPr>
+        <w:t>:</w:t>
+      </w:r>
+    </w:p>
+    <w:p>
+      <w:pPr>
+        <w:tabs>
+          <w:tab w:val="left" w:pos="5560"/>
+        </w:tabs>
+      </w:pPr>
+      <w:proofErr w:type="spellStart"/>
+      <w:r>
+        <w:t>CanEnroll</w:t>
+      </w:r>
+      <w:proofErr w:type="spellEnd"/>
+      <w:r>
+        <w:t>(Bob, COMP9061) — Bob is eligible for COMP9061 and has not passed it.</w:t>
+      </w:r>
+    </w:p>
+    <w:p>
+      <w:pPr>
+        <w:tabs>
+          <w:tab w:val="left" w:pos="5560"/>
+        </w:tabs>
+      </w:pPr>
+      <w:proofErr w:type="spellStart"/>
+      <w:r>
+        <w:t>CanEnroll</w:t>
+      </w:r>
+      <w:proofErr w:type="spellEnd"/>
+      <w:r>
+        <w:t>(Alice, COMP9062) — Alice is eligible for COMP9062 and has not passed it.</w:t>
       </w:r>
     </w:p>
     <w:p>
@@ -338,14 +442,7 @@
     </w:p>
     <w:p>
       <w:pPr>
-        <w:pStyle w:val="ListParagraph"/>
-        <w:numPr>
-          <w:ilvl w:val="3"/>
-          <w:numId w:val="1"/>
-        </w:numPr>
-        <w:tabs>
-          <w:tab w:val="left" w:pos="5560"/>
-        </w:tabs>
+        <w:pStyle w:val="Heading2"/>
       </w:pPr>
       <w:r>
         <w:t>Backward Chaining</w:t>
@@ -418,8 +515,13 @@
       <w:r>
         <w:t xml:space="preserve">: </w:t>
       </w:r>
-      <w:r>
-        <w:t>'Prereq(p, m) &amp; Passed(s, p) ==&gt; Eligible(s, m)'</w:t>
+      <w:proofErr w:type="spellStart"/>
+      <w:r>
+        <w:t>Prereq</w:t>
+      </w:r>
+      <w:proofErr w:type="spellEnd"/>
+      <w:r>
+        <w:t>(p, m) &amp; Passed(s, p) ==&gt; Eligible(s, m)</w:t>
       </w:r>
     </w:p>
     <w:p>
@@ -444,12 +546,21 @@
       <w:r>
         <w:t xml:space="preserve"> </w:t>
       </w:r>
-      <w:r>
-        <w:rPr>
-          <w:b/>
-          <w:bCs/>
-        </w:rPr>
-        <w:t>Prereq(p, m)</w:t>
+      <w:proofErr w:type="spellStart"/>
+      <w:r>
+        <w:rPr>
+          <w:b/>
+          <w:bCs/>
+        </w:rPr>
+        <w:t>Prereq</w:t>
+      </w:r>
+      <w:proofErr w:type="spellEnd"/>
+      <w:r>
+        <w:rPr>
+          <w:b/>
+          <w:bCs/>
+        </w:rPr>
+        <w:t>(p, m)</w:t>
       </w:r>
       <w:r>
         <w:t xml:space="preserve"> and </w:t>
@@ -495,114 +606,111 @@
           <w:iCs/>
         </w:rPr>
       </w:pPr>
+      <w:proofErr w:type="spellStart"/>
       <w:r>
         <w:rPr>
           <w:i/>
           <w:iCs/>
         </w:rPr>
-        <w:t>Prereq(p, COMP9061) and Passed(Alice, p)</w:t>
-      </w:r>
-    </w:p>
-    <w:p>
-      <w:pPr>
-        <w:tabs>
-          <w:tab w:val="left" w:pos="5560"/>
-        </w:tabs>
-      </w:pPr>
-    </w:p>
-    <w:p>
-      <w:pPr>
-        <w:tabs>
-          <w:tab w:val="left" w:pos="5560"/>
-        </w:tabs>
-      </w:pPr>
-      <w:r>
-        <w:t>W</w:t>
-      </w:r>
-      <w:r>
-        <w:t xml:space="preserve">e check for these facts in the KB, and we </w:t>
-      </w:r>
-      <w:r>
-        <w:t xml:space="preserve">find </w:t>
-      </w:r>
+        <w:t>Prereq</w:t>
+      </w:r>
+      <w:proofErr w:type="spellEnd"/>
       <w:r>
         <w:rPr>
           <w:i/>
           <w:iCs/>
         </w:rPr>
-        <w:t>Prereq(COMP9062, COMP9061)</w:t>
-      </w:r>
-    </w:p>
-    <w:p>
-      <w:pPr>
-        <w:tabs>
-          <w:tab w:val="left" w:pos="5560"/>
-        </w:tabs>
-      </w:pPr>
-    </w:p>
-    <w:p>
-      <w:pPr>
-        <w:tabs>
-          <w:tab w:val="left" w:pos="5560"/>
-        </w:tabs>
-      </w:pPr>
-      <w:r>
-        <w:t xml:space="preserve">So, </w:t>
-      </w:r>
-      <w:r>
-        <w:rPr>
-          <w:b/>
-          <w:bCs/>
-        </w:rPr>
-        <w:t xml:space="preserve">p = </w:t>
-      </w:r>
-      <w:r>
-        <w:rPr>
-          <w:b/>
-          <w:bCs/>
-        </w:rPr>
-        <w:t>COMP9062</w:t>
-      </w:r>
-      <w:r>
-        <w:t xml:space="preserve">, and </w:t>
-      </w:r>
-      <w:r>
-        <w:t xml:space="preserve">now we check for the fact in the </w:t>
-      </w:r>
+        <w:t>(p, COMP9061) and Passed(Alice, p)</w:t>
+      </w:r>
+    </w:p>
+    <w:p>
+      <w:pPr>
+        <w:tabs>
+          <w:tab w:val="left" w:pos="5560"/>
+        </w:tabs>
+      </w:pPr>
+    </w:p>
+    <w:p>
+      <w:pPr>
+        <w:tabs>
+          <w:tab w:val="left" w:pos="5560"/>
+        </w:tabs>
+      </w:pPr>
+      <w:r>
+        <w:t>W</w:t>
+      </w:r>
+      <w:r>
+        <w:t xml:space="preserve">e check for these facts in the KB, and we </w:t>
+      </w:r>
+      <w:r>
+        <w:t xml:space="preserve">find </w:t>
+      </w:r>
+      <w:proofErr w:type="spellStart"/>
       <w:r>
         <w:rPr>
           <w:i/>
           <w:iCs/>
         </w:rPr>
-        <w:t>K</w:t>
-      </w:r>
+        <w:t>Prereq</w:t>
+      </w:r>
+      <w:proofErr w:type="spellEnd"/>
       <w:r>
         <w:rPr>
           <w:i/>
           <w:iCs/>
         </w:rPr>
-        <w:t>B</w:t>
+        <w:t>(COMP9062, COMP9061)</w:t>
+      </w:r>
+    </w:p>
+    <w:p>
+      <w:pPr>
+        <w:tabs>
+          <w:tab w:val="left" w:pos="5560"/>
+        </w:tabs>
+      </w:pPr>
+    </w:p>
+    <w:p>
+      <w:pPr>
+        <w:tabs>
+          <w:tab w:val="left" w:pos="5560"/>
+        </w:tabs>
+      </w:pPr>
+      <w:r>
+        <w:t xml:space="preserve">So, </w:t>
+      </w:r>
+      <w:r>
+        <w:rPr>
+          <w:b/>
+          <w:bCs/>
+        </w:rPr>
+        <w:t>p = COMP9062</w:t>
+      </w:r>
+      <w:r>
+        <w:t xml:space="preserve">, and </w:t>
+      </w:r>
+      <w:r>
+        <w:t xml:space="preserve">now we check for the fact in the </w:t>
       </w:r>
       <w:r>
         <w:rPr>
           <w:i/>
           <w:iCs/>
         </w:rPr>
-        <w:t xml:space="preserve"> Passed(Alice, </w:t>
+        <w:t>K</w:t>
       </w:r>
       <w:r>
         <w:rPr>
           <w:i/>
           <w:iCs/>
         </w:rPr>
-        <w:t>COMP9062</w:t>
+        <w:t>B</w:t>
       </w:r>
       <w:r>
         <w:rPr>
           <w:i/>
           <w:iCs/>
         </w:rPr>
-        <w:t>).</w:t>
+        <w:t xml:space="preserve"> Passed(Alice, COMP9062).</w:t>
       </w:r>
     </w:p>
     <w:p>
@@ -657,14 +765,7 @@
           <w:b/>
           <w:bCs/>
         </w:rPr>
-        <w:t>{v_50: Bob, v_49: COMP9061, v_48: COMP9062}</w:t>
-      </w:r>
-      <w:r>
-        <w:rPr>
-          <w:b/>
-          <w:bCs/>
-        </w:rPr>
-        <w:t>”</w:t>
+        <w:t>{v_50: Bob, v_49: COMP9061, v_48: COMP9062}”</w:t>
       </w:r>
     </w:p>
     <w:p>
@@ -701,7 +802,15 @@
         <w:t xml:space="preserve">: </w:t>
       </w:r>
       <w:r>
-        <w:t>'Prereq(p, m) &amp; Passed(s, p) ==&gt; Eligible(s, m)'</w:t>
+        <w:t>'</w:t>
+      </w:r>
+      <w:proofErr w:type="spellStart"/>
+      <w:r>
+        <w:t>Prereq</w:t>
+      </w:r>
+      <w:proofErr w:type="spellEnd"/>
+      <w:r>
+        <w:t>(p, m) &amp; Passed(s, p) ==&gt; Eligible(s, m)'</w:t>
       </w:r>
     </w:p>
     <w:p>
@@ -723,12 +832,21 @@
       <w:r>
         <w:t xml:space="preserve"> </w:t>
       </w:r>
-      <w:r>
-        <w:rPr>
-          <w:b/>
-          <w:bCs/>
-        </w:rPr>
-        <w:t>Prereq(p, m)</w:t>
+      <w:proofErr w:type="spellStart"/>
+      <w:r>
+        <w:rPr>
+          <w:b/>
+          <w:bCs/>
+        </w:rPr>
+        <w:t>Prereq</w:t>
+      </w:r>
+      <w:proofErr w:type="spellEnd"/>
+      <w:r>
+        <w:rPr>
+          <w:b/>
+          <w:bCs/>
+        </w:rPr>
+        <w:t>(p, m)</w:t>
       </w:r>
       <w:r>
         <w:t xml:space="preserve"> and </w:t>
@@ -748,14 +866,7 @@
           <w:b/>
           <w:bCs/>
         </w:rPr>
-        <w:t xml:space="preserve">p = </w:t>
-      </w:r>
-      <w:r>
-        <w:rPr>
-          <w:b/>
-          <w:bCs/>
-        </w:rPr>
-        <w:t>Bob</w:t>
+        <w:t>p = Bob</w:t>
       </w:r>
       <w:r>
         <w:t xml:space="preserve"> and </w:t>
@@ -773,53 +884,57 @@
       <w:r>
         <w:t xml:space="preserve"> </w:t>
       </w:r>
+      <w:proofErr w:type="spellStart"/>
       <w:r>
         <w:rPr>
           <w:i/>
           <w:iCs/>
         </w:rPr>
-        <w:t>Prereq(p, COMP9061) and Passed(</w:t>
-      </w:r>
+        <w:t>Prereq</w:t>
+      </w:r>
+      <w:proofErr w:type="spellEnd"/>
       <w:r>
         <w:rPr>
           <w:i/>
           <w:iCs/>
         </w:rPr>
-        <w:t>Bob</w:t>
-      </w:r>
+        <w:t>(p, COMP9061) and Passed(Bob, p)</w:t>
+      </w:r>
+    </w:p>
+    <w:p>
+      <w:pPr>
+        <w:tabs>
+          <w:tab w:val="left" w:pos="5560"/>
+        </w:tabs>
+      </w:pPr>
+    </w:p>
+    <w:p>
+      <w:pPr>
+        <w:tabs>
+          <w:tab w:val="left" w:pos="5560"/>
+        </w:tabs>
+      </w:pPr>
+      <w:r>
+        <w:t>So, we check for these facts in the KB, and we see</w:t>
+      </w:r>
+      <w:r>
+        <w:t xml:space="preserve"> </w:t>
+      </w:r>
+      <w:proofErr w:type="spellStart"/>
       <w:r>
         <w:rPr>
           <w:i/>
           <w:iCs/>
         </w:rPr>
-        <w:t>, p)</w:t>
-      </w:r>
-    </w:p>
-    <w:p>
-      <w:pPr>
-        <w:tabs>
-          <w:tab w:val="left" w:pos="5560"/>
-        </w:tabs>
-      </w:pPr>
-    </w:p>
-    <w:p>
-      <w:pPr>
-        <w:tabs>
-          <w:tab w:val="left" w:pos="5560"/>
-        </w:tabs>
-      </w:pPr>
-      <w:r>
-        <w:t>So, we check for these facts in the KB, and we see</w:t>
-      </w:r>
-      <w:r>
-        <w:t xml:space="preserve"> </w:t>
-      </w:r>
+        <w:t>Prereq</w:t>
+      </w:r>
+      <w:proofErr w:type="spellEnd"/>
       <w:r>
         <w:rPr>
           <w:i/>
           <w:iCs/>
         </w:rPr>
-        <w:t>Prereq(COMP9062, COMP9061)</w:t>
+        <w:t>(COMP9062, COMP9061)</w:t>
       </w:r>
     </w:p>
     <w:p>
@@ -846,41 +961,24 @@
           <w:i/>
           <w:iCs/>
         </w:rPr>
-        <w:t>Passed(</w:t>
-      </w:r>
-      <w:r>
-        <w:rPr>
-          <w:i/>
-          <w:iCs/>
-        </w:rPr>
-        <w:t>Bob</w:t>
-      </w:r>
-      <w:r>
-        <w:rPr>
-          <w:i/>
-          <w:iCs/>
-        </w:rPr>
-        <w:t>, COMP9062).</w:t>
-      </w:r>
-    </w:p>
-    <w:p>
-      <w:pPr>
-        <w:tabs>
-          <w:tab w:val="left" w:pos="5560"/>
-        </w:tabs>
-      </w:pPr>
-    </w:p>
-    <w:p>
-      <w:pPr>
-        <w:tabs>
-          <w:tab w:val="left" w:pos="5560"/>
-        </w:tabs>
-      </w:pPr>
-      <w:r>
-        <w:t xml:space="preserve">It is </w:t>
-      </w:r>
-      <w:r>
-        <w:t xml:space="preserve">present, so we return the set of facts that make the RULE True i.e. </w:t>
+        <w:t>Passed(Bob, COMP9062).</w:t>
+      </w:r>
+    </w:p>
+    <w:p>
+      <w:pPr>
+        <w:tabs>
+          <w:tab w:val="left" w:pos="5560"/>
+        </w:tabs>
+      </w:pPr>
+    </w:p>
+    <w:p>
+      <w:pPr>
+        <w:tabs>
+          <w:tab w:val="left" w:pos="5560"/>
+        </w:tabs>
+      </w:pPr>
+      <w:r>
+        <w:t xml:space="preserve">It is present, so we return the set of facts that make the RULE True i.e. </w:t>
       </w:r>
       <w:r>
         <w:rPr>
@@ -917,26 +1015,21 @@
           <w:bCs/>
         </w:rPr>
       </w:pPr>
-      <w:r>
-        <w:rPr>
-          <w:b/>
-          <w:bCs/>
-        </w:rPr>
-        <w:t>TaughtBy(Eve, l) -&gt; The code replies “</w:t>
-      </w:r>
-      <w:r>
-        <w:rPr>
-          <w:b/>
-          <w:bCs/>
-        </w:rPr>
-        <w:t>{v_79: Eve, v_81: DrDan, v_80: COMP9016}</w:t>
-      </w:r>
-      <w:r>
-        <w:rPr>
-          <w:b/>
-          <w:bCs/>
-        </w:rPr>
-        <w:t>”</w:t>
+      <w:proofErr w:type="spellStart"/>
+      <w:r>
+        <w:rPr>
+          <w:b/>
+          <w:bCs/>
+        </w:rPr>
+        <w:t>TaughtBy</w:t>
+      </w:r>
+      <w:proofErr w:type="spellEnd"/>
+      <w:r>
+        <w:rPr>
+          <w:b/>
+          <w:bCs/>
+        </w:rPr>
+        <w:t>(Eve, l) -&gt; The code replies “{v_79: Eve, v_81: DrDan, v_80: COMP9016}”</w:t>
       </w:r>
     </w:p>
     <w:p>
@@ -953,7 +1046,15 @@
         <w:t>GOAL</w:t>
       </w:r>
       <w:r>
-        <w:t>: TaughtBy(Eve, l)</w:t>
+        <w:t xml:space="preserve">: </w:t>
+      </w:r>
+      <w:proofErr w:type="spellStart"/>
+      <w:r>
+        <w:t>TaughtBy</w:t>
+      </w:r>
+      <w:proofErr w:type="spellEnd"/>
+      <w:r>
+        <w:t>(Eve, l)</w:t>
       </w:r>
     </w:p>
     <w:p>
@@ -973,24 +1074,40 @@
         <w:t xml:space="preserve">: </w:t>
       </w:r>
       <w:r>
-        <w:t>Takes(s, m) &amp; Teaches(l, m) ==&gt; TaughtBy(s, l)</w:t>
-      </w:r>
-    </w:p>
-    <w:p>
-      <w:pPr>
-        <w:tabs>
-          <w:tab w:val="left" w:pos="5560"/>
-        </w:tabs>
-      </w:pPr>
-    </w:p>
-    <w:p>
-      <w:pPr>
-        <w:tabs>
-          <w:tab w:val="left" w:pos="5560"/>
-        </w:tabs>
-      </w:pPr>
-      <w:r>
-        <w:t>So, we need to prove each element of the LHS of the rule i.e.Takes(s, m) and Teaches(l, m), where s = Eve.</w:t>
+        <w:t xml:space="preserve">Takes(s, m) &amp; Teaches(l, m) ==&gt; </w:t>
+      </w:r>
+      <w:proofErr w:type="spellStart"/>
+      <w:r>
+        <w:t>TaughtBy</w:t>
+      </w:r>
+      <w:proofErr w:type="spellEnd"/>
+      <w:r>
+        <w:t>(s, l)</w:t>
+      </w:r>
+    </w:p>
+    <w:p>
+      <w:pPr>
+        <w:tabs>
+          <w:tab w:val="left" w:pos="5560"/>
+        </w:tabs>
+      </w:pPr>
+    </w:p>
+    <w:p>
+      <w:pPr>
+        <w:tabs>
+          <w:tab w:val="left" w:pos="5560"/>
+        </w:tabs>
+      </w:pPr>
+      <w:r>
+        <w:t xml:space="preserve">So, we need to prove each element of the LHS of the rule </w:t>
+      </w:r>
+      <w:proofErr w:type="spellStart"/>
+      <w:r>
+        <w:t>i.e.Takes</w:t>
+      </w:r>
+      <w:proofErr w:type="spellEnd"/>
+      <w:r>
+        <w:t>(s, m) and Teaches(l, m), where s = Eve.</w:t>
       </w:r>
     </w:p>
     <w:p>
@@ -1249,10 +1366,7 @@
         </w:tabs>
       </w:pPr>
       <w:r>
-        <w:t>-&gt;</w:t>
-      </w:r>
-      <w:r>
-        <w:t xml:space="preserve"> </w:t>
+        <w:t xml:space="preserve">-&gt; </w:t>
       </w:r>
       <w:r>
         <w:rPr>
@@ -1314,7 +1428,7 @@
         </w:tabs>
       </w:pPr>
       <w:r>
-        <w:t>Similarily</w:t>
+        <w:t>Similarly</w:t>
       </w:r>
       <w:r>
         <w:t>, we need to prove the LHS side, which is only one clause, so we can directly search for facts in the KB.</w:t>
@@ -1343,52 +1457,10 @@
         </w:tabs>
       </w:pPr>
     </w:p>
-    <w:p>
-      <w:r>
-        <w:br w:type="page"/>
-      </w:r>
-    </w:p>
-    <w:p>
-      <w:pPr>
-        <w:tabs>
-          <w:tab w:val="left" w:pos="5560"/>
-        </w:tabs>
-      </w:pPr>
-    </w:p>
-    <w:p>
-      <w:pPr>
-        <w:pStyle w:val="ListParagraph"/>
-        <w:numPr>
-          <w:ilvl w:val="3"/>
-          <w:numId w:val="1"/>
-        </w:numPr>
-        <w:tabs>
-          <w:tab w:val="left" w:pos="5560"/>
-        </w:tabs>
-      </w:pPr>
-    </w:p>
-    <w:p>
-      <w:pPr>
-        <w:pStyle w:val="ListParagraph"/>
-        <w:numPr>
-          <w:ilvl w:val="3"/>
-          <w:numId w:val="1"/>
-        </w:numPr>
-        <w:tabs>
-          <w:tab w:val="left" w:pos="5560"/>
-        </w:tabs>
-      </w:pPr>
-    </w:p>
-    <w:p>
-      <w:pPr>
-        <w:pStyle w:val="ListParagraph"/>
-        <w:numPr>
-          <w:ilvl w:val="3"/>
-          <w:numId w:val="1"/>
-        </w:numPr>
-        <w:tabs>
-          <w:tab w:val="left" w:pos="5560"/>
-        </w:tabs>
+    <w:p/>
+    <w:p>
+      <w:pPr>
+        <w:pStyle w:val="Heading2"/>
       </w:pPr>
       <w:r>
         <w:t>Comparison</w:t>
@@ -1490,6 +1562,9 @@
               </w:tabs>
               <w:cnfStyle w:val="000000000000" w:firstRow="0" w:lastRow="0" w:firstColumn="0" w:lastColumn="0" w:oddVBand="0" w:evenVBand="0" w:oddHBand="0" w:evenHBand="0" w:firstRowFirstColumn="0" w:firstRowLastColumn="0" w:lastRowFirstColumn="0" w:lastRowLastColumn="0"/>
             </w:pPr>
+            <w:r>
+              <w:t>Data driven. We always start with the data known to us, and infer all that we can from it.</w:t>
+            </w:r>
           </w:p>
         </w:tc>
         <w:tc>
@@ -1503,6 +1578,9 @@
               </w:tabs>
               <w:cnfStyle w:val="000000000000" w:firstRow="0" w:lastRow="0" w:firstColumn="0" w:lastColumn="0" w:oddVBand="0" w:evenVBand="0" w:oddHBand="0" w:evenHBand="0" w:firstRowFirstColumn="0" w:firstRowLastColumn="0" w:lastRowFirstColumn="0" w:lastRowLastColumn="0"/>
             </w:pPr>
+            <w:r>
+              <w:t>Goal Driven. We always start with the goal, and derive all facts that are required to prove the Goal true or false.</w:t>
+            </w:r>
           </w:p>
         </w:tc>
       </w:tr>
@@ -1534,6 +1612,9 @@
               </w:tabs>
               <w:cnfStyle w:val="000000000000" w:firstRow="0" w:lastRow="0" w:firstColumn="0" w:lastColumn="0" w:oddVBand="0" w:evenVBand="0" w:oddHBand="0" w:evenHBand="0" w:firstRowFirstColumn="0" w:firstRowLastColumn="0" w:lastRowFirstColumn="0" w:lastRowLastColumn="0"/>
             </w:pPr>
+            <w:r>
+              <w:t>This generates all possible intermediate facts from the original facts.</w:t>
+            </w:r>
           </w:p>
         </w:tc>
         <w:tc>
@@ -1547,6 +1628,9 @@
               </w:tabs>
               <w:cnfStyle w:val="000000000000" w:firstRow="0" w:lastRow="0" w:firstColumn="0" w:lastColumn="0" w:oddVBand="0" w:evenVBand="0" w:oddHBand="0" w:evenHBand="0" w:firstRowFirstColumn="0" w:firstRowLastColumn="0" w:lastRowFirstColumn="0" w:lastRowLastColumn="0"/>
             </w:pPr>
+            <w:r>
+              <w:t>This generates only the facts required to prove the goal.</w:t>
+            </w:r>
           </w:p>
         </w:tc>
       </w:tr>
@@ -1578,6 +1662,43 @@
               </w:tabs>
               <w:cnfStyle w:val="000000000000" w:firstRow="0" w:lastRow="0" w:firstColumn="0" w:lastColumn="0" w:oddVBand="0" w:evenVBand="0" w:oddHBand="0" w:evenHBand="0" w:firstRowFirstColumn="0" w:firstRowLastColumn="0" w:lastRowFirstColumn="0" w:lastRowLastColumn="0"/>
             </w:pPr>
+            <w:r>
+              <w:t xml:space="preserve">Given the CWA, if a fact cannot be derived, it is assumed to be False. E.g. </w:t>
+            </w:r>
+            <w:r>
+              <w:t xml:space="preserve">if </w:t>
+            </w:r>
+            <w:proofErr w:type="spellStart"/>
+            <w:r>
+              <w:t>CanEnroll</w:t>
+            </w:r>
+            <w:proofErr w:type="spellEnd"/>
+            <w:r>
+              <w:t xml:space="preserve">(Alice, </w:t>
+            </w:r>
+            <w:r>
+              <w:t>COMP9016</w:t>
+            </w:r>
+            <w:r>
+              <w:t>) cannot be derived, then ¬</w:t>
+            </w:r>
+            <w:proofErr w:type="spellStart"/>
+            <w:r>
+              <w:t>CanEnroll</w:t>
+            </w:r>
+            <w:proofErr w:type="spellEnd"/>
+            <w:r>
+              <w:t xml:space="preserve">(Alice, </w:t>
+            </w:r>
+            <w:r>
+              <w:t>COMP9016</w:t>
+            </w:r>
+            <w:r>
+              <w:t>) is assumed</w:t>
+            </w:r>
+            <w:r>
+              <w:t>. This can lead to many assumed facts, which can be computationally expensive.</w:t>
+            </w:r>
           </w:p>
         </w:tc>
         <w:tc>
@@ -1591,6 +1712,28 @@
               </w:tabs>
               <w:cnfStyle w:val="000000000000" w:firstRow="0" w:lastRow="0" w:firstColumn="0" w:lastColumn="0" w:oddVBand="0" w:evenVBand="0" w:oddHBand="0" w:evenHBand="0" w:firstRowFirstColumn="0" w:firstRowLastColumn="0" w:lastRowFirstColumn="0" w:lastRowLastColumn="0"/>
             </w:pPr>
+            <w:proofErr w:type="spellStart"/>
+            <w:r>
+              <w:t>Similarily</w:t>
+            </w:r>
+            <w:proofErr w:type="spellEnd"/>
+            <w:r>
+              <w:t xml:space="preserve">, if the system cannot prove that e.g. </w:t>
+            </w:r>
+            <w:proofErr w:type="spellStart"/>
+            <w:r>
+              <w:t>CanEnroll</w:t>
+            </w:r>
+            <w:proofErr w:type="spellEnd"/>
+            <w:r>
+              <w:t xml:space="preserve">(Alice, </w:t>
+            </w:r>
+            <w:r>
+              <w:t>COMP9016</w:t>
+            </w:r>
+            <w:r>
+              <w:t>, then is assumes that it is False.</w:t>
+            </w:r>
           </w:p>
         </w:tc>
       </w:tr>
@@ -1625,21 +1768,6 @@
       <w:pPr>
         <w:pStyle w:val="Heading2"/>
       </w:pPr>
-    </w:p>
-    <w:p>
-      <w:pPr>
-        <w:pStyle w:val="Heading2"/>
-      </w:pPr>
-    </w:p>
-    <w:p>
-      <w:pPr>
-        <w:pStyle w:val="Heading2"/>
-      </w:pPr>
-    </w:p>
-    <w:p>
-      <w:pPr>
-        <w:pStyle w:val="Heading2"/>
-      </w:pPr>
       <w:r>
         <w:t>BAYESIAN NETWORKS: AI MARKET ANALYSIS</w:t>
       </w:r>
@@ -1653,20 +1781,475 @@
     </w:p>
     <w:p>
       <w:pPr>
-        <w:tabs>
-          <w:tab w:val="left" w:pos="5560"/>
-        </w:tabs>
-      </w:pPr>
-      <w:r>
-        <w:t>1.2</w:t>
-      </w:r>
-    </w:p>
-    <w:p>
-      <w:pPr>
-        <w:tabs>
-          <w:tab w:val="left" w:pos="5560"/>
-        </w:tabs>
-      </w:pPr>
+        <w:rPr>
+          <w:rFonts w:ascii="Times New Roman" w:eastAsia="Times New Roman" w:hAnsi="Times New Roman" w:cs="Times New Roman"/>
+          <w:kern w:val="0"/>
+          <w:lang w:eastAsia="en-GB"/>
+          <w14:ligatures w14:val="none"/>
+        </w:rPr>
+      </w:pPr>
+      <w:r>
+        <w:rPr>
+          <w:rFonts w:ascii="Times New Roman" w:eastAsia="Times New Roman" w:hAnsi="Times New Roman" w:cs="Times New Roman"/>
+          <w:noProof/>
+          <w:kern w:val="0"/>
+          <w:lang w:eastAsia="en-GB"/>
+          <w14:ligatures w14:val="none"/>
+        </w:rPr>
+        <w:drawing>
+          <wp:inline distT="0" distB="0" distL="0" distR="0" wp14:anchorId="7DB99356" wp14:editId="02F8C5E9">
+            <wp:extent cx="4300855" cy="4191000"/>
+            <wp:effectExtent l="0" t="0" r="4445" b="0"/>
+            <wp:docPr id="1783626543" name="Picture 1" descr="A diagram of a company's process&#10;&#10;AI-generated content may be incorrect."/>
+            <wp:cNvGraphicFramePr>
+              <a:graphicFrameLocks xmlns:a="http://schemas.openxmlformats.org/drawingml/2006/main" noChangeAspect="1"/>
+            </wp:cNvGraphicFramePr>
+            <a:graphic xmlns:a="http://schemas.openxmlformats.org/drawingml/2006/main">
+              <a:graphicData uri="http://schemas.openxmlformats.org/drawingml/2006/picture">
+                <pic:pic xmlns:pic="http://schemas.openxmlformats.org/drawingml/2006/picture">
+                  <pic:nvPicPr>
+                    <pic:cNvPr id="1783626543" name="Picture 1" descr="A diagram of a company's process&#10;&#10;AI-generated content may be incorrect."/>
+                    <pic:cNvPicPr>
+                      <a:picLocks noChangeAspect="1" noChangeArrowheads="1"/>
+                    </pic:cNvPicPr>
+                  </pic:nvPicPr>
+                  <pic:blipFill>
+                    <a:blip r:embed="rId8">
+                      <a:extLst>
+                        <a:ext uri="{28A0092B-C50C-407E-A947-70E740481C1C}">
+                          <a14:useLocalDpi xmlns:a14="http://schemas.microsoft.com/office/drawing/2010/main" val="0"/>
+                        </a:ext>
+                      </a:extLst>
+                    </a:blip>
+                    <a:srcRect/>
+                    <a:stretch>
+                      <a:fillRect/>
+                    </a:stretch>
+                  </pic:blipFill>
+                  <pic:spPr bwMode="auto">
+                    <a:xfrm>
+                      <a:off x="0" y="0"/>
+                      <a:ext cx="4300855" cy="4191000"/>
+                    </a:xfrm>
+                    <a:prstGeom prst="rect">
+                      <a:avLst/>
+                    </a:prstGeom>
+                    <a:noFill/>
+                    <a:ln>
+                      <a:noFill/>
+                    </a:ln>
+                  </pic:spPr>
+                </pic:pic>
+              </a:graphicData>
+            </a:graphic>
+          </wp:inline>
+        </w:drawing>
+      </w:r>
+    </w:p>
+    <w:p>
+      <w:pPr>
+        <w:tabs>
+          <w:tab w:val="left" w:pos="5560"/>
+        </w:tabs>
+      </w:pPr>
+    </w:p>
+    <w:p>
+      <w:pPr>
+        <w:tabs>
+          <w:tab w:val="left" w:pos="5560"/>
+        </w:tabs>
+      </w:pPr>
+      <w:r>
+        <w:rPr>
+          <w:b/>
+          <w:bCs/>
+        </w:rPr>
+        <w:t>Chain structure</w:t>
+      </w:r>
+      <w:r>
+        <w:t xml:space="preserve">: </w:t>
+      </w:r>
+    </w:p>
+    <w:p>
+      <w:pPr>
+        <w:pStyle w:val="ListParagraph"/>
+        <w:numPr>
+          <w:ilvl w:val="0"/>
+          <w:numId w:val="6"/>
+        </w:numPr>
+        <w:tabs>
+          <w:tab w:val="left" w:pos="5560"/>
+        </w:tabs>
+      </w:pPr>
+      <w:proofErr w:type="spellStart"/>
+      <w:r>
+        <w:t>HypeLevel</w:t>
+      </w:r>
+      <w:proofErr w:type="spellEnd"/>
+      <w:r>
+        <w:t xml:space="preserve"> → </w:t>
+      </w:r>
+      <w:proofErr w:type="spellStart"/>
+      <w:r>
+        <w:t>VCInvestment</w:t>
+      </w:r>
+      <w:proofErr w:type="spellEnd"/>
+      <w:r>
+        <w:t xml:space="preserve"> → </w:t>
+      </w:r>
+      <w:proofErr w:type="spellStart"/>
+      <w:r>
+        <w:t>EnterpriseAdoption</w:t>
+      </w:r>
+      <w:proofErr w:type="spellEnd"/>
+    </w:p>
+    <w:p>
+      <w:pPr>
+        <w:tabs>
+          <w:tab w:val="left" w:pos="5560"/>
+        </w:tabs>
+      </w:pPr>
+      <w:r>
+        <w:rPr>
+          <w:b/>
+          <w:bCs/>
+        </w:rPr>
+        <w:t>Common cause (fork):</w:t>
+      </w:r>
+      <w:r>
+        <w:t xml:space="preserve"> </w:t>
+      </w:r>
+    </w:p>
+    <w:p>
+      <w:pPr>
+        <w:pStyle w:val="ListParagraph"/>
+        <w:numPr>
+          <w:ilvl w:val="0"/>
+          <w:numId w:val="5"/>
+        </w:numPr>
+        <w:tabs>
+          <w:tab w:val="left" w:pos="5560"/>
+        </w:tabs>
+      </w:pPr>
+      <w:proofErr w:type="spellStart"/>
+      <w:r>
+        <w:t>RegulatoryPressure</w:t>
+      </w:r>
+      <w:proofErr w:type="spellEnd"/>
+      <w:r>
+        <w:t xml:space="preserve"> → </w:t>
+      </w:r>
+      <w:proofErr w:type="spellStart"/>
+      <w:r>
+        <w:t>EnterpriseAdoption</w:t>
+      </w:r>
+      <w:proofErr w:type="spellEnd"/>
+    </w:p>
+    <w:p>
+      <w:pPr>
+        <w:pStyle w:val="ListParagraph"/>
+        <w:numPr>
+          <w:ilvl w:val="0"/>
+          <w:numId w:val="5"/>
+        </w:numPr>
+        <w:tabs>
+          <w:tab w:val="left" w:pos="5560"/>
+        </w:tabs>
+      </w:pPr>
+      <w:proofErr w:type="spellStart"/>
+      <w:r>
+        <w:t>RegulatoryPressure</w:t>
+      </w:r>
+      <w:proofErr w:type="spellEnd"/>
+      <w:r>
+        <w:t xml:space="preserve"> → </w:t>
+      </w:r>
+      <w:proofErr w:type="spellStart"/>
+      <w:r>
+        <w:t>LabourMarketImpact</w:t>
+      </w:r>
+      <w:proofErr w:type="spellEnd"/>
+    </w:p>
+    <w:p>
+      <w:pPr>
+        <w:tabs>
+          <w:tab w:val="left" w:pos="5560"/>
+        </w:tabs>
+      </w:pPr>
+      <w:r>
+        <w:rPr>
+          <w:b/>
+          <w:bCs/>
+        </w:rPr>
+        <w:t>Common effect (collider):</w:t>
+      </w:r>
+      <w:r>
+        <w:t xml:space="preserve"> </w:t>
+      </w:r>
+    </w:p>
+    <w:p>
+      <w:pPr>
+        <w:pStyle w:val="ListParagraph"/>
+        <w:numPr>
+          <w:ilvl w:val="0"/>
+          <w:numId w:val="7"/>
+        </w:numPr>
+        <w:tabs>
+          <w:tab w:val="left" w:pos="5560"/>
+        </w:tabs>
+      </w:pPr>
+      <w:proofErr w:type="spellStart"/>
+      <w:r>
+        <w:t>ComputeCosts</w:t>
+      </w:r>
+      <w:proofErr w:type="spellEnd"/>
+      <w:r>
+        <w:t xml:space="preserve"> → </w:t>
+      </w:r>
+      <w:proofErr w:type="spellStart"/>
+      <w:r>
+        <w:t>EnterpriseAdoption</w:t>
+      </w:r>
+      <w:proofErr w:type="spellEnd"/>
+      <w:r>
+        <w:t xml:space="preserve"> ← </w:t>
+      </w:r>
+      <w:proofErr w:type="spellStart"/>
+      <w:r>
+        <w:t>RegulatoryPressure</w:t>
+      </w:r>
+      <w:proofErr w:type="spellEnd"/>
+    </w:p>
+    <w:p>
+      <w:pPr>
+        <w:tabs>
+          <w:tab w:val="left" w:pos="5560"/>
+        </w:tabs>
+      </w:pPr>
+    </w:p>
+    <w:p>
+      <w:pPr>
+        <w:pStyle w:val="Heading3"/>
+      </w:pPr>
+      <w:r>
+        <w:t xml:space="preserve">Design </w:t>
+      </w:r>
+      <w:r>
+        <w:t>Justification</w:t>
+      </w:r>
+    </w:p>
+    <w:p>
+      <w:pPr>
+        <w:tabs>
+          <w:tab w:val="left" w:pos="5560"/>
+        </w:tabs>
+      </w:pPr>
+    </w:p>
+    <w:p>
+      <w:pPr>
+        <w:tabs>
+          <w:tab w:val="left" w:pos="5560"/>
+        </w:tabs>
+      </w:pPr>
+      <w:proofErr w:type="spellStart"/>
+      <w:r>
+        <w:rPr>
+          <w:b/>
+          <w:bCs/>
+        </w:rPr>
+        <w:t>HypeLevel</w:t>
+      </w:r>
+      <w:proofErr w:type="spellEnd"/>
+      <w:r>
+        <w:t xml:space="preserve"> </w:t>
+      </w:r>
+      <w:r>
+        <w:t>influences</w:t>
+      </w:r>
+      <w:r>
+        <w:t xml:space="preserve"> </w:t>
+      </w:r>
+      <w:proofErr w:type="spellStart"/>
+      <w:r>
+        <w:rPr>
+          <w:b/>
+          <w:bCs/>
+        </w:rPr>
+        <w:t>VCInvestment</w:t>
+      </w:r>
+      <w:proofErr w:type="spellEnd"/>
+      <w:r>
+        <w:t xml:space="preserve"> due to </w:t>
+      </w:r>
+      <w:r>
+        <w:t>herd mentality and public perception.</w:t>
+      </w:r>
+    </w:p>
+    <w:p>
+      <w:pPr>
+        <w:tabs>
+          <w:tab w:val="left" w:pos="5560"/>
+        </w:tabs>
+      </w:pPr>
+      <w:proofErr w:type="spellStart"/>
+      <w:r>
+        <w:rPr>
+          <w:b/>
+          <w:bCs/>
+        </w:rPr>
+        <w:t>VCInvestment</w:t>
+      </w:r>
+      <w:proofErr w:type="spellEnd"/>
+      <w:r>
+        <w:t xml:space="preserve"> </w:t>
+      </w:r>
+      <w:r>
+        <w:t>increases</w:t>
+      </w:r>
+      <w:r>
+        <w:t xml:space="preserve"> </w:t>
+      </w:r>
+      <w:proofErr w:type="spellStart"/>
+      <w:r>
+        <w:rPr>
+          <w:b/>
+          <w:bCs/>
+        </w:rPr>
+        <w:t>EnterpriseAdoption</w:t>
+      </w:r>
+      <w:proofErr w:type="spellEnd"/>
+      <w:r>
+        <w:t xml:space="preserve"> by funding startups and innovation.</w:t>
+      </w:r>
+    </w:p>
+    <w:p>
+      <w:pPr>
+        <w:tabs>
+          <w:tab w:val="left" w:pos="5560"/>
+        </w:tabs>
+      </w:pPr>
+      <w:proofErr w:type="spellStart"/>
+      <w:r>
+        <w:rPr>
+          <w:b/>
+          <w:bCs/>
+        </w:rPr>
+        <w:t>ComputeCosts</w:t>
+      </w:r>
+      <w:proofErr w:type="spellEnd"/>
+      <w:r>
+        <w:t xml:space="preserve"> </w:t>
+      </w:r>
+      <w:r>
+        <w:t xml:space="preserve">affects </w:t>
+      </w:r>
+      <w:proofErr w:type="spellStart"/>
+      <w:r>
+        <w:rPr>
+          <w:b/>
+          <w:bCs/>
+        </w:rPr>
+        <w:t>EnterpriseAdoption</w:t>
+      </w:r>
+      <w:proofErr w:type="spellEnd"/>
+      <w:r>
+        <w:t xml:space="preserve"> </w:t>
+      </w:r>
+      <w:r>
+        <w:t>by restricting adoption</w:t>
+      </w:r>
+      <w:r>
+        <w:t>.</w:t>
+      </w:r>
+    </w:p>
+    <w:p>
+      <w:pPr>
+        <w:tabs>
+          <w:tab w:val="left" w:pos="5560"/>
+        </w:tabs>
+      </w:pPr>
+      <w:proofErr w:type="spellStart"/>
+      <w:r>
+        <w:rPr>
+          <w:b/>
+          <w:bCs/>
+        </w:rPr>
+        <w:t>RegulatoryPressure</w:t>
+      </w:r>
+      <w:proofErr w:type="spellEnd"/>
+      <w:r>
+        <w:t xml:space="preserve"> can influence the </w:t>
+      </w:r>
+      <w:proofErr w:type="spellStart"/>
+      <w:r>
+        <w:rPr>
+          <w:b/>
+          <w:bCs/>
+        </w:rPr>
+        <w:t>LabourMarketImpact</w:t>
+      </w:r>
+      <w:proofErr w:type="spellEnd"/>
+      <w:r>
+        <w:t xml:space="preserve"> </w:t>
+      </w:r>
+      <w:r>
+        <w:t>by implementing policy that promotes employment in the area.</w:t>
+      </w:r>
+    </w:p>
+    <w:p>
+      <w:pPr>
+        <w:tabs>
+          <w:tab w:val="left" w:pos="5560"/>
+        </w:tabs>
+      </w:pPr>
+      <w:proofErr w:type="spellStart"/>
+      <w:r>
+        <w:rPr>
+          <w:b/>
+          <w:bCs/>
+        </w:rPr>
+        <w:t>LabourMarketImpact</w:t>
+      </w:r>
+      <w:proofErr w:type="spellEnd"/>
+      <w:r>
+        <w:t xml:space="preserve"> is influenced by both </w:t>
+      </w:r>
+      <w:proofErr w:type="spellStart"/>
+      <w:r>
+        <w:rPr>
+          <w:b/>
+          <w:bCs/>
+        </w:rPr>
+        <w:t>HypeLevel</w:t>
+      </w:r>
+      <w:proofErr w:type="spellEnd"/>
+      <w:r>
+        <w:t xml:space="preserve"> (</w:t>
+      </w:r>
+      <w:r>
+        <w:t>more people want to work in the area</w:t>
+      </w:r>
+      <w:r>
+        <w:t xml:space="preserve">) and </w:t>
+      </w:r>
+      <w:proofErr w:type="spellStart"/>
+      <w:r>
+        <w:rPr>
+          <w:b/>
+          <w:bCs/>
+        </w:rPr>
+        <w:t>RegulatoryPressure</w:t>
+      </w:r>
+      <w:proofErr w:type="spellEnd"/>
+      <w:r>
+        <w:t xml:space="preserve"> (polic</w:t>
+      </w:r>
+      <w:r>
+        <w:t>ies might promote employment</w:t>
+      </w:r>
+      <w:r>
+        <w:t>).</w:t>
+      </w:r>
     </w:p>
     <w:p>
       <w:pPr>
@@ -1695,7 +2278,7 @@
         <w:pStyle w:val="ListParagraph"/>
         <w:numPr>
           <w:ilvl w:val="1"/>
-          <w:numId w:val="1"/>
+          <w:numId w:val="4"/>
         </w:numPr>
         <w:tabs>
           <w:tab w:val="left" w:pos="5560"/>
@@ -1710,7 +2293,7 @@
         <w:pStyle w:val="ListParagraph"/>
         <w:numPr>
           <w:ilvl w:val="2"/>
-          <w:numId w:val="1"/>
+          <w:numId w:val="4"/>
         </w:numPr>
         <w:tabs>
           <w:tab w:val="left" w:pos="5560"/>
@@ -1721,7 +2304,7 @@
       </w:r>
     </w:p>
     <w:sectPr>
-      <w:footerReference w:type="default" r:id="rId8"/>
+      <w:footerReference w:type="default" r:id="rId9"/>
       <w:pgSz w:w="11906" w:h="16838"/>
       <w:pgMar w:top="1440" w:right="1440" w:bottom="1440" w:left="1440" w:header="708" w:footer="708" w:gutter="0"/>
       <w:cols w:space="708"/>
@@ -2088,6 +2671,466 @@
       </w:pPr>
     </w:lvl>
   </w:abstractNum>
+  <w:abstractNum w:abstractNumId="3" w15:restartNumberingAfterBreak="0">
+    <w:nsid w:val="4F8017CB"/>
+    <w:multiLevelType w:val="hybridMultilevel"/>
+    <w:tmpl w:val="EAE05A4C"/>
+    <w:lvl w:ilvl="0" w:tplc="08090001">
+      <w:start w:val="1"/>
+      <w:numFmt w:val="bullet"/>
+      <w:lvlText w:val=""/>
+      <w:lvlJc w:val="left"/>
+      <w:pPr>
+        <w:ind w:left="720" w:hanging="360"/>
+      </w:pPr>
+      <w:rPr>
+        <w:rFonts w:ascii="Symbol" w:hAnsi="Symbol" w:hint="default"/>
+      </w:rPr>
+    </w:lvl>
+    <w:lvl w:ilvl="1" w:tplc="08090003" w:tentative="1">
+      <w:start w:val="1"/>
+      <w:numFmt w:val="bullet"/>
+      <w:lvlText w:val="o"/>
+      <w:lvlJc w:val="left"/>
+      <w:pPr>
+        <w:ind w:left="1440" w:hanging="360"/>
+      </w:pPr>
+      <w:rPr>
+        <w:rFonts w:ascii="Courier New" w:hAnsi="Courier New" w:cs="Courier New" w:hint="default"/>
+      </w:rPr>
+    </w:lvl>
+    <w:lvl w:ilvl="2" w:tplc="08090005" w:tentative="1">
+      <w:start w:val="1"/>
+      <w:numFmt w:val="bullet"/>
+      <w:lvlText w:val=""/>
+      <w:lvlJc w:val="left"/>
+      <w:pPr>
+        <w:ind w:left="2160" w:hanging="360"/>
+      </w:pPr>
+      <w:rPr>
+        <w:rFonts w:ascii="Wingdings" w:hAnsi="Wingdings" w:hint="default"/>
+      </w:rPr>
+    </w:lvl>
+    <w:lvl w:ilvl="3" w:tplc="08090001" w:tentative="1">
+      <w:start w:val="1"/>
+      <w:numFmt w:val="bullet"/>
+      <w:lvlText w:val=""/>
+      <w:lvlJc w:val="left"/>
+      <w:pPr>
+        <w:ind w:left="2880" w:hanging="360"/>
+      </w:pPr>
+      <w:rPr>
+        <w:rFonts w:ascii="Symbol" w:hAnsi="Symbol" w:hint="default"/>
+      </w:rPr>
+    </w:lvl>
+    <w:lvl w:ilvl="4" w:tplc="08090003" w:tentative="1">
+      <w:start w:val="1"/>
+      <w:numFmt w:val="bullet"/>
+      <w:lvlText w:val="o"/>
+      <w:lvlJc w:val="left"/>
+      <w:pPr>
+        <w:ind w:left="3600" w:hanging="360"/>
+      </w:pPr>
+      <w:rPr>
+        <w:rFonts w:ascii="Courier New" w:hAnsi="Courier New" w:cs="Courier New" w:hint="default"/>
+      </w:rPr>
+    </w:lvl>
+    <w:lvl w:ilvl="5" w:tplc="08090005" w:tentative="1">
+      <w:start w:val="1"/>
+      <w:numFmt w:val="bullet"/>
+      <w:lvlText w:val=""/>
+      <w:lvlJc w:val="left"/>
+      <w:pPr>
+        <w:ind w:left="4320" w:hanging="360"/>
+      </w:pPr>
+      <w:rPr>
+        <w:rFonts w:ascii="Wingdings" w:hAnsi="Wingdings" w:hint="default"/>
+      </w:rPr>
+    </w:lvl>
+    <w:lvl w:ilvl="6" w:tplc="08090001" w:tentative="1">
+      <w:start w:val="1"/>
+      <w:numFmt w:val="bullet"/>
+      <w:lvlText w:val=""/>
+      <w:lvlJc w:val="left"/>
+      <w:pPr>
+        <w:ind w:left="5040" w:hanging="360"/>
+      </w:pPr>
+      <w:rPr>
+        <w:rFonts w:ascii="Symbol" w:hAnsi="Symbol" w:hint="default"/>
+      </w:rPr>
+    </w:lvl>
+    <w:lvl w:ilvl="7" w:tplc="08090003" w:tentative="1">
+      <w:start w:val="1"/>
+      <w:numFmt w:val="bullet"/>
+      <w:lvlText w:val="o"/>
+      <w:lvlJc w:val="left"/>
+      <w:pPr>
+        <w:ind w:left="5760" w:hanging="360"/>
+      </w:pPr>
+      <w:rPr>
+        <w:rFonts w:ascii="Courier New" w:hAnsi="Courier New" w:cs="Courier New" w:hint="default"/>
+      </w:rPr>
+    </w:lvl>
+    <w:lvl w:ilvl="8" w:tplc="08090005" w:tentative="1">
+      <w:start w:val="1"/>
+      <w:numFmt w:val="bullet"/>
+      <w:lvlText w:val=""/>
+      <w:lvlJc w:val="left"/>
+      <w:pPr>
+        <w:ind w:left="6480" w:hanging="360"/>
+      </w:pPr>
+      <w:rPr>
+        <w:rFonts w:ascii="Wingdings" w:hAnsi="Wingdings" w:hint="default"/>
+      </w:rPr>
+    </w:lvl>
+  </w:abstractNum>
+  <w:abstractNum w:abstractNumId="4" w15:restartNumberingAfterBreak="0">
+    <w:nsid w:val="56C32F0D"/>
+    <w:multiLevelType w:val="hybridMultilevel"/>
+    <w:tmpl w:val="9388486C"/>
+    <w:lvl w:ilvl="0" w:tplc="08090001">
+      <w:start w:val="1"/>
+      <w:numFmt w:val="bullet"/>
+      <w:lvlText w:val=""/>
+      <w:lvlJc w:val="left"/>
+      <w:pPr>
+        <w:ind w:left="720" w:hanging="360"/>
+      </w:pPr>
+      <w:rPr>
+        <w:rFonts w:ascii="Symbol" w:hAnsi="Symbol" w:hint="default"/>
+      </w:rPr>
+    </w:lvl>
+    <w:lvl w:ilvl="1" w:tplc="08090003" w:tentative="1">
+      <w:start w:val="1"/>
+      <w:numFmt w:val="bullet"/>
+      <w:lvlText w:val="o"/>
+      <w:lvlJc w:val="left"/>
+      <w:pPr>
+        <w:ind w:left="1440" w:hanging="360"/>
+      </w:pPr>
+      <w:rPr>
+        <w:rFonts w:ascii="Courier New" w:hAnsi="Courier New" w:cs="Courier New" w:hint="default"/>
+      </w:rPr>
+    </w:lvl>
+    <w:lvl w:ilvl="2" w:tplc="08090005" w:tentative="1">
+      <w:start w:val="1"/>
+      <w:numFmt w:val="bullet"/>
+      <w:lvlText w:val=""/>
+      <w:lvlJc w:val="left"/>
+      <w:pPr>
+        <w:ind w:left="2160" w:hanging="360"/>
+      </w:pPr>
+      <w:rPr>
+        <w:rFonts w:ascii="Wingdings" w:hAnsi="Wingdings" w:hint="default"/>
+      </w:rPr>
+    </w:lvl>
+    <w:lvl w:ilvl="3" w:tplc="08090001" w:tentative="1">
+      <w:start w:val="1"/>
+      <w:numFmt w:val="bullet"/>
+      <w:lvlText w:val=""/>
+      <w:lvlJc w:val="left"/>
+      <w:pPr>
+        <w:ind w:left="2880" w:hanging="360"/>
+      </w:pPr>
+      <w:rPr>
+        <w:rFonts w:ascii="Symbol" w:hAnsi="Symbol" w:hint="default"/>
+      </w:rPr>
+    </w:lvl>
+    <w:lvl w:ilvl="4" w:tplc="08090003" w:tentative="1">
+      <w:start w:val="1"/>
+      <w:numFmt w:val="bullet"/>
+      <w:lvlText w:val="o"/>
+      <w:lvlJc w:val="left"/>
+      <w:pPr>
+        <w:ind w:left="3600" w:hanging="360"/>
+      </w:pPr>
+      <w:rPr>
+        <w:rFonts w:ascii="Courier New" w:hAnsi="Courier New" w:cs="Courier New" w:hint="default"/>
+      </w:rPr>
+    </w:lvl>
+    <w:lvl w:ilvl="5" w:tplc="08090005" w:tentative="1">
+      <w:start w:val="1"/>
+      <w:numFmt w:val="bullet"/>
+      <w:lvlText w:val=""/>
+      <w:lvlJc w:val="left"/>
+      <w:pPr>
+        <w:ind w:left="4320" w:hanging="360"/>
+      </w:pPr>
+      <w:rPr>
+        <w:rFonts w:ascii="Wingdings" w:hAnsi="Wingdings" w:hint="default"/>
+      </w:rPr>
+    </w:lvl>
+    <w:lvl w:ilvl="6" w:tplc="08090001" w:tentative="1">
+      <w:start w:val="1"/>
+      <w:numFmt w:val="bullet"/>
+      <w:lvlText w:val=""/>
+      <w:lvlJc w:val="left"/>
+      <w:pPr>
+        <w:ind w:left="5040" w:hanging="360"/>
+      </w:pPr>
+      <w:rPr>
+        <w:rFonts w:ascii="Symbol" w:hAnsi="Symbol" w:hint="default"/>
+      </w:rPr>
+    </w:lvl>
+    <w:lvl w:ilvl="7" w:tplc="08090003" w:tentative="1">
+      <w:start w:val="1"/>
+      <w:numFmt w:val="bullet"/>
+      <w:lvlText w:val="o"/>
+      <w:lvlJc w:val="left"/>
+      <w:pPr>
+        <w:ind w:left="5760" w:hanging="360"/>
+      </w:pPr>
+      <w:rPr>
+        <w:rFonts w:ascii="Courier New" w:hAnsi="Courier New" w:cs="Courier New" w:hint="default"/>
+      </w:rPr>
+    </w:lvl>
+    <w:lvl w:ilvl="8" w:tplc="08090005" w:tentative="1">
+      <w:start w:val="1"/>
+      <w:numFmt w:val="bullet"/>
+      <w:lvlText w:val=""/>
+      <w:lvlJc w:val="left"/>
+      <w:pPr>
+        <w:ind w:left="6480" w:hanging="360"/>
+      </w:pPr>
+      <w:rPr>
+        <w:rFonts w:ascii="Wingdings" w:hAnsi="Wingdings" w:hint="default"/>
+      </w:rPr>
+    </w:lvl>
+  </w:abstractNum>
+  <w:abstractNum w:abstractNumId="5" w15:restartNumberingAfterBreak="0">
+    <w:nsid w:val="69B221DD"/>
+    <w:multiLevelType w:val="multilevel"/>
+    <w:tmpl w:val="E24AE762"/>
+    <w:lvl w:ilvl="0">
+      <w:start w:val="1"/>
+      <w:numFmt w:val="decimal"/>
+      <w:lvlText w:val="%1."/>
+      <w:lvlJc w:val="left"/>
+      <w:pPr>
+        <w:ind w:left="720" w:hanging="360"/>
+      </w:pPr>
+      <w:rPr>
+        <w:rFonts w:hint="default"/>
+      </w:rPr>
+    </w:lvl>
+    <w:lvl w:ilvl="1">
+      <w:start w:val="1"/>
+      <w:numFmt w:val="decimal"/>
+      <w:isLgl/>
+      <w:lvlText w:val="%1.%2"/>
+      <w:lvlJc w:val="left"/>
+      <w:pPr>
+        <w:ind w:left="740" w:hanging="380"/>
+      </w:pPr>
+      <w:rPr>
+        <w:rFonts w:hint="default"/>
+      </w:rPr>
+    </w:lvl>
+    <w:lvl w:ilvl="2">
+      <w:start w:val="1"/>
+      <w:numFmt w:val="decimal"/>
+      <w:isLgl/>
+      <w:lvlText w:val="%1.%2.%3"/>
+      <w:lvlJc w:val="left"/>
+      <w:pPr>
+        <w:ind w:left="1080" w:hanging="720"/>
+      </w:pPr>
+      <w:rPr>
+        <w:rFonts w:hint="default"/>
+      </w:rPr>
+    </w:lvl>
+    <w:lvl w:ilvl="3">
+      <w:start w:val="1"/>
+      <w:numFmt w:val="decimal"/>
+      <w:isLgl/>
+      <w:lvlText w:val="%1.%2.%3.%4"/>
+      <w:lvlJc w:val="left"/>
+      <w:pPr>
+        <w:ind w:left="1440" w:hanging="1080"/>
+      </w:pPr>
+      <w:rPr>
+        <w:rFonts w:hint="default"/>
+      </w:rPr>
+    </w:lvl>
+    <w:lvl w:ilvl="4">
+      <w:start w:val="1"/>
+      <w:numFmt w:val="decimal"/>
+      <w:isLgl/>
+      <w:lvlText w:val="%1.%2.%3.%4.%5"/>
+      <w:lvlJc w:val="left"/>
+      <w:pPr>
+        <w:ind w:left="1440" w:hanging="1080"/>
+      </w:pPr>
+      <w:rPr>
+        <w:rFonts w:hint="default"/>
+      </w:rPr>
+    </w:lvl>
+    <w:lvl w:ilvl="5">
+      <w:start w:val="1"/>
+      <w:numFmt w:val="decimal"/>
+      <w:isLgl/>
+      <w:lvlText w:val="%1.%2.%3.%4.%5.%6"/>
+      <w:lvlJc w:val="left"/>
+      <w:pPr>
+        <w:ind w:left="1800" w:hanging="1440"/>
+      </w:pPr>
+      <w:rPr>
+        <w:rFonts w:hint="default"/>
+      </w:rPr>
+    </w:lvl>
+    <w:lvl w:ilvl="6">
+      <w:start w:val="1"/>
+      <w:numFmt w:val="decimal"/>
+      <w:isLgl/>
+      <w:lvlText w:val="%1.%2.%3.%4.%5.%6.%7"/>
+      <w:lvlJc w:val="left"/>
+      <w:pPr>
+        <w:ind w:left="1800" w:hanging="1440"/>
+      </w:pPr>
+      <w:rPr>
+        <w:rFonts w:hint="default"/>
+      </w:rPr>
+    </w:lvl>
+    <w:lvl w:ilvl="7">
+      <w:start w:val="1"/>
+      <w:numFmt w:val="decimal"/>
+      <w:isLgl/>
+      <w:lvlText w:val="%1.%2.%3.%4.%5.%6.%7.%8"/>
+      <w:lvlJc w:val="left"/>
+      <w:pPr>
+        <w:ind w:left="2160" w:hanging="1800"/>
+      </w:pPr>
+      <w:rPr>
+        <w:rFonts w:hint="default"/>
+      </w:rPr>
+    </w:lvl>
+    <w:lvl w:ilvl="8">
+      <w:start w:val="1"/>
+      <w:numFmt w:val="decimal"/>
+      <w:isLgl/>
+      <w:lvlText w:val="%1.%2.%3.%4.%5.%6.%7.%8.%9"/>
+      <w:lvlJc w:val="left"/>
+      <w:pPr>
+        <w:ind w:left="2160" w:hanging="1800"/>
+      </w:pPr>
+      <w:rPr>
+        <w:rFonts w:hint="default"/>
+      </w:rPr>
+    </w:lvl>
+  </w:abstractNum>
+  <w:abstractNum w:abstractNumId="6" w15:restartNumberingAfterBreak="0">
+    <w:nsid w:val="6B212E96"/>
+    <w:multiLevelType w:val="hybridMultilevel"/>
+    <w:tmpl w:val="F1ACE154"/>
+    <w:lvl w:ilvl="0" w:tplc="08090001">
+      <w:start w:val="1"/>
+      <w:numFmt w:val="bullet"/>
+      <w:lvlText w:val=""/>
+      <w:lvlJc w:val="left"/>
+      <w:pPr>
+        <w:ind w:left="720" w:hanging="360"/>
+      </w:pPr>
+      <w:rPr>
+        <w:rFonts w:ascii="Symbol" w:hAnsi="Symbol" w:hint="default"/>
+      </w:rPr>
+    </w:lvl>
+    <w:lvl w:ilvl="1" w:tplc="08090003" w:tentative="1">
+      <w:start w:val="1"/>
+      <w:numFmt w:val="bullet"/>
+      <w:lvlText w:val="o"/>
+      <w:lvlJc w:val="left"/>
+      <w:pPr>
+        <w:ind w:left="1440" w:hanging="360"/>
+      </w:pPr>
+      <w:rPr>
+        <w:rFonts w:ascii="Courier New" w:hAnsi="Courier New" w:cs="Courier New" w:hint="default"/>
+      </w:rPr>
+    </w:lvl>
+    <w:lvl w:ilvl="2" w:tplc="08090005" w:tentative="1">
+      <w:start w:val="1"/>
+      <w:numFmt w:val="bullet"/>
+      <w:lvlText w:val=""/>
+      <w:lvlJc w:val="left"/>
+      <w:pPr>
+        <w:ind w:left="2160" w:hanging="360"/>
+      </w:pPr>
+      <w:rPr>
+        <w:rFonts w:ascii="Wingdings" w:hAnsi="Wingdings" w:hint="default"/>
+      </w:rPr>
+    </w:lvl>
+    <w:lvl w:ilvl="3" w:tplc="08090001" w:tentative="1">
+      <w:start w:val="1"/>
+      <w:numFmt w:val="bullet"/>
+      <w:lvlText w:val=""/>
+      <w:lvlJc w:val="left"/>
+      <w:pPr>
+        <w:ind w:left="2880" w:hanging="360"/>
+      </w:pPr>
+      <w:rPr>
+        <w:rFonts w:ascii="Symbol" w:hAnsi="Symbol" w:hint="default"/>
+      </w:rPr>
+    </w:lvl>
+    <w:lvl w:ilvl="4" w:tplc="08090003" w:tentative="1">
+      <w:start w:val="1"/>
+      <w:numFmt w:val="bullet"/>
+      <w:lvlText w:val="o"/>
+      <w:lvlJc w:val="left"/>
+      <w:pPr>
+        <w:ind w:left="3600" w:hanging="360"/>
+      </w:pPr>
+      <w:rPr>
+        <w:rFonts w:ascii="Courier New" w:hAnsi="Courier New" w:cs="Courier New" w:hint="default"/>
+      </w:rPr>
+    </w:lvl>
+    <w:lvl w:ilvl="5" w:tplc="08090005" w:tentative="1">
+      <w:start w:val="1"/>
+      <w:numFmt w:val="bullet"/>
+      <w:lvlText w:val=""/>
+      <w:lvlJc w:val="left"/>
+      <w:pPr>
+        <w:ind w:left="4320" w:hanging="360"/>
+      </w:pPr>
+      <w:rPr>
+        <w:rFonts w:ascii="Wingdings" w:hAnsi="Wingdings" w:hint="default"/>
+      </w:rPr>
+    </w:lvl>
+    <w:lvl w:ilvl="6" w:tplc="08090001" w:tentative="1">
+      <w:start w:val="1"/>
+      <w:numFmt w:val="bullet"/>
+      <w:lvlText w:val=""/>
+      <w:lvlJc w:val="left"/>
+      <w:pPr>
+        <w:ind w:left="5040" w:hanging="360"/>
+      </w:pPr>
+      <w:rPr>
+        <w:rFonts w:ascii="Symbol" w:hAnsi="Symbol" w:hint="default"/>
+      </w:rPr>
+    </w:lvl>
+    <w:lvl w:ilvl="7" w:tplc="08090003" w:tentative="1">
+      <w:start w:val="1"/>
+      <w:numFmt w:val="bullet"/>
+      <w:lvlText w:val="o"/>
+      <w:lvlJc w:val="left"/>
+      <w:pPr>
+        <w:ind w:left="5760" w:hanging="360"/>
+      </w:pPr>
+      <w:rPr>
+        <w:rFonts w:ascii="Courier New" w:hAnsi="Courier New" w:cs="Courier New" w:hint="default"/>
+      </w:rPr>
+    </w:lvl>
+    <w:lvl w:ilvl="8" w:tplc="08090005" w:tentative="1">
+      <w:start w:val="1"/>
+      <w:numFmt w:val="bullet"/>
+      <w:lvlText w:val=""/>
+      <w:lvlJc w:val="left"/>
+      <w:pPr>
+        <w:ind w:left="6480" w:hanging="360"/>
+      </w:pPr>
+      <w:rPr>
+        <w:rFonts w:ascii="Wingdings" w:hAnsi="Wingdings" w:hint="default"/>
+      </w:rPr>
+    </w:lvl>
+  </w:abstractNum>
   <w:num w:numId="1" w16cid:durableId="474102713">
     <w:abstractNumId w:val="1"/>
   </w:num>
@@ -2096,6 +3139,18 @@
   </w:num>
   <w:num w:numId="3" w16cid:durableId="2000451696">
     <w:abstractNumId w:val="2"/>
+  </w:num>
+  <w:num w:numId="4" w16cid:durableId="1276903641">
+    <w:abstractNumId w:val="5"/>
+  </w:num>
+  <w:num w:numId="5" w16cid:durableId="663513180">
+    <w:abstractNumId w:val="3"/>
+  </w:num>
+  <w:num w:numId="6" w16cid:durableId="1229077893">
+    <w:abstractNumId w:val="6"/>
+  </w:num>
+  <w:num w:numId="7" w16cid:durableId="653529978">
+    <w:abstractNumId w:val="4"/>
   </w:num>
 </w:numbering>
 </file>
@@ -2546,7 +3601,6 @@
     <w:next w:val="Normal"/>
     <w:link w:val="Heading3Char"/>
     <w:uiPriority w:val="9"/>
-    <w:semiHidden/>
     <w:unhideWhenUsed/>
     <w:qFormat/>
     <w:rsid w:val="003C63F5"/>
@@ -2751,7 +3805,6 @@
     <w:basedOn w:val="DefaultParagraphFont"/>
     <w:link w:val="Heading3"/>
     <w:uiPriority w:val="9"/>
-    <w:semiHidden/>
     <w:rsid w:val="003C63F5"/>
     <w:rPr>
       <w:rFonts w:eastAsiaTheme="majorEastAsia" w:cstheme="majorBidi"/>

</xml_diff>

<commit_message>
Added bayesnet with queries
</commit_message>
<xml_diff>
--- a/assignment2/A2_COMP9016_Nagle_JohnPaul_R00065426.docx
+++ b/assignment2/A2_COMP9016_Nagle_JohnPaul_R00065426.docx
@@ -1841,6 +1841,7 @@
       <w:r>
         <w:rPr>
           <w:rFonts w:ascii="Times New Roman" w:eastAsia="Times New Roman" w:hAnsi="Times New Roman" w:cs="Times New Roman"/>
+          <w:noProof/>
           <w:kern w:val="0"/>
           <w:lang w:eastAsia="en-GB"/>
           <w14:ligatures w14:val="none"/>
@@ -1950,19 +1951,7 @@
       </w:r>
       <w:proofErr w:type="spellEnd"/>
       <w:r>
-        <w:t xml:space="preserve"> as </w:t>
-      </w:r>
-      <w:r>
-        <w:t xml:space="preserve">more people </w:t>
-      </w:r>
-      <w:r>
-        <w:t xml:space="preserve">will </w:t>
-      </w:r>
-      <w:r>
-        <w:t>want to work in the area</w:t>
-      </w:r>
-      <w:r>
-        <w:t>.</w:t>
+        <w:t xml:space="preserve"> as more people will want to work in the area.</w:t>
       </w:r>
     </w:p>
     <w:p>
@@ -2153,6 +2142,17 @@
             </w:pPr>
             <w:r>
               <w:t>P</w:t>
+            </w:r>
+            <w:r>
+              <w:t>(</w:t>
+            </w:r>
+            <w:proofErr w:type="spellStart"/>
+            <w:r>
+              <w:t>HypeLevel</w:t>
+            </w:r>
+            <w:proofErr w:type="spellEnd"/>
+            <w:r>
+              <w:t>)</w:t>
             </w:r>
           </w:p>
         </w:tc>
@@ -2269,6 +2269,17 @@
             <w:r>
               <w:t>P</w:t>
             </w:r>
+            <w:r>
+              <w:t>(</w:t>
+            </w:r>
+            <w:proofErr w:type="spellStart"/>
+            <w:r>
+              <w:t>ComputeCosts</w:t>
+            </w:r>
+            <w:proofErr w:type="spellEnd"/>
+            <w:r>
+              <w:t>)</w:t>
+            </w:r>
           </w:p>
         </w:tc>
       </w:tr>
@@ -2391,6 +2402,17 @@
             <w:r>
               <w:t>P</w:t>
             </w:r>
+            <w:r>
+              <w:t>(</w:t>
+            </w:r>
+            <w:proofErr w:type="spellStart"/>
+            <w:r>
+              <w:t>RegulatoryPressure</w:t>
+            </w:r>
+            <w:proofErr w:type="spellEnd"/>
+            <w:r>
+              <w:t>)</w:t>
+            </w:r>
           </w:p>
         </w:tc>
       </w:tr>
@@ -2425,10 +2447,7 @@
               <w:cnfStyle w:val="000000000000" w:firstRow="0" w:lastRow="0" w:firstColumn="0" w:lastColumn="0" w:oddVBand="0" w:evenVBand="0" w:oddHBand="0" w:evenHBand="0" w:firstRowFirstColumn="0" w:firstRowLastColumn="0" w:lastRowFirstColumn="0" w:lastRowLastColumn="0"/>
             </w:pPr>
             <w:r>
-              <w:t>0.</w:t>
-            </w:r>
-            <w:r>
-              <w:t>8</w:t>
+              <w:t>0.8</w:t>
             </w:r>
           </w:p>
         </w:tc>
@@ -2464,10 +2483,7 @@
               <w:cnfStyle w:val="000000000000" w:firstRow="0" w:lastRow="0" w:firstColumn="0" w:lastColumn="0" w:oddVBand="0" w:evenVBand="0" w:oddHBand="0" w:evenHBand="0" w:firstRowFirstColumn="0" w:firstRowLastColumn="0" w:lastRowFirstColumn="0" w:lastRowLastColumn="0"/>
             </w:pPr>
             <w:r>
-              <w:t>0.</w:t>
-            </w:r>
-            <w:r>
-              <w:t>2</w:t>
+              <w:t>0.2</w:t>
             </w:r>
           </w:p>
         </w:tc>
@@ -2526,7 +2542,23 @@
               <w:cnfStyle w:val="100000000000" w:firstRow="1" w:lastRow="0" w:firstColumn="0" w:lastColumn="0" w:oddVBand="0" w:evenVBand="0" w:oddHBand="0" w:evenHBand="0" w:firstRowFirstColumn="0" w:firstRowLastColumn="0" w:lastRowFirstColumn="0" w:lastRowLastColumn="0"/>
             </w:pPr>
             <w:r>
-              <w:t>P</w:t>
+              <w:t>P(</w:t>
+            </w:r>
+            <w:proofErr w:type="spellStart"/>
+            <w:r>
+              <w:t>VCInvestment</w:t>
+            </w:r>
+            <w:proofErr w:type="spellEnd"/>
+            <w:r>
+              <w:t xml:space="preserve"> | </w:t>
+            </w:r>
+            <w:proofErr w:type="spellStart"/>
+            <w:r>
+              <w:t>HypeLevel</w:t>
+            </w:r>
+            <w:proofErr w:type="spellEnd"/>
+            <w:r>
+              <w:t>)</w:t>
             </w:r>
           </w:p>
         </w:tc>
@@ -2807,6 +2839,15 @@
             <w:r>
               <w:t>P</w:t>
             </w:r>
+            <w:r>
+              <w:t>(</w:t>
+            </w:r>
+            <w:r>
+              <w:t>Enterprise Adoption</w:t>
+            </w:r>
+            <w:r>
+              <w:t xml:space="preserve"> | others)</w:t>
+            </w:r>
           </w:p>
         </w:tc>
       </w:tr>
@@ -2879,6 +2920,9 @@
             <w:pPr>
               <w:cnfStyle w:val="000000000000" w:firstRow="0" w:lastRow="0" w:firstColumn="0" w:lastColumn="0" w:oddVBand="0" w:evenVBand="0" w:oddHBand="0" w:evenHBand="0" w:firstRowFirstColumn="0" w:firstRowLastColumn="0" w:lastRowFirstColumn="0" w:lastRowLastColumn="0"/>
             </w:pPr>
+            <w:r>
+              <w:t>0.9</w:t>
+            </w:r>
           </w:p>
         </w:tc>
       </w:tr>
@@ -2951,6 +2995,9 @@
             <w:pPr>
               <w:cnfStyle w:val="000000000000" w:firstRow="0" w:lastRow="0" w:firstColumn="0" w:lastColumn="0" w:oddVBand="0" w:evenVBand="0" w:oddHBand="0" w:evenHBand="0" w:firstRowFirstColumn="0" w:firstRowLastColumn="0" w:lastRowFirstColumn="0" w:lastRowLastColumn="0"/>
             </w:pPr>
+            <w:r>
+              <w:t>0.8</w:t>
+            </w:r>
           </w:p>
         </w:tc>
       </w:tr>
@@ -3023,6 +3070,9 @@
             <w:pPr>
               <w:cnfStyle w:val="000000000000" w:firstRow="0" w:lastRow="0" w:firstColumn="0" w:lastColumn="0" w:oddVBand="0" w:evenVBand="0" w:oddHBand="0" w:evenHBand="0" w:firstRowFirstColumn="0" w:firstRowLastColumn="0" w:lastRowFirstColumn="0" w:lastRowLastColumn="0"/>
             </w:pPr>
+            <w:r>
+              <w:t>0.7</w:t>
+            </w:r>
           </w:p>
         </w:tc>
       </w:tr>
@@ -3095,6 +3145,9 @@
             <w:pPr>
               <w:cnfStyle w:val="000000000000" w:firstRow="0" w:lastRow="0" w:firstColumn="0" w:lastColumn="0" w:oddVBand="0" w:evenVBand="0" w:oddHBand="0" w:evenHBand="0" w:firstRowFirstColumn="0" w:firstRowLastColumn="0" w:lastRowFirstColumn="0" w:lastRowLastColumn="0"/>
             </w:pPr>
+            <w:r>
+              <w:t>0.2</w:t>
+            </w:r>
           </w:p>
         </w:tc>
       </w:tr>
@@ -3167,6 +3220,9 @@
             <w:pPr>
               <w:cnfStyle w:val="000000000000" w:firstRow="0" w:lastRow="0" w:firstColumn="0" w:lastColumn="0" w:oddVBand="0" w:evenVBand="0" w:oddHBand="0" w:evenHBand="0" w:firstRowFirstColumn="0" w:firstRowLastColumn="0" w:lastRowFirstColumn="0" w:lastRowLastColumn="0"/>
             </w:pPr>
+            <w:r>
+              <w:t>0.6</w:t>
+            </w:r>
           </w:p>
         </w:tc>
       </w:tr>
@@ -3239,6 +3295,9 @@
             <w:pPr>
               <w:cnfStyle w:val="000000000000" w:firstRow="0" w:lastRow="0" w:firstColumn="0" w:lastColumn="0" w:oddVBand="0" w:evenVBand="0" w:oddHBand="0" w:evenHBand="0" w:firstRowFirstColumn="0" w:firstRowLastColumn="0" w:lastRowFirstColumn="0" w:lastRowLastColumn="0"/>
             </w:pPr>
+            <w:r>
+              <w:t>0.5</w:t>
+            </w:r>
           </w:p>
         </w:tc>
       </w:tr>
@@ -3311,6 +3370,9 @@
             <w:pPr>
               <w:cnfStyle w:val="000000000000" w:firstRow="0" w:lastRow="0" w:firstColumn="0" w:lastColumn="0" w:oddVBand="0" w:evenVBand="0" w:oddHBand="0" w:evenHBand="0" w:firstRowFirstColumn="0" w:firstRowLastColumn="0" w:lastRowFirstColumn="0" w:lastRowLastColumn="0"/>
             </w:pPr>
+            <w:r>
+              <w:t>0.4</w:t>
+            </w:r>
           </w:p>
         </w:tc>
       </w:tr>
@@ -3383,6 +3445,9 @@
             <w:pPr>
               <w:cnfStyle w:val="000000000000" w:firstRow="0" w:lastRow="0" w:firstColumn="0" w:lastColumn="0" w:oddVBand="0" w:evenVBand="0" w:oddHBand="0" w:evenHBand="0" w:firstRowFirstColumn="0" w:firstRowLastColumn="0" w:lastRowFirstColumn="0" w:lastRowLastColumn="0"/>
             </w:pPr>
+            <w:r>
+              <w:t>0.3</w:t>
+            </w:r>
           </w:p>
         </w:tc>
       </w:tr>
@@ -3455,6 +3520,9 @@
             <w:pPr>
               <w:cnfStyle w:val="000000000000" w:firstRow="0" w:lastRow="0" w:firstColumn="0" w:lastColumn="0" w:oddVBand="0" w:evenVBand="0" w:oddHBand="0" w:evenHBand="0" w:firstRowFirstColumn="0" w:firstRowLastColumn="0" w:lastRowFirstColumn="0" w:lastRowLastColumn="0"/>
             </w:pPr>
+            <w:r>
+              <w:t>0.1</w:t>
+            </w:r>
           </w:p>
         </w:tc>
       </w:tr>
@@ -3527,6 +3595,9 @@
             <w:pPr>
               <w:cnfStyle w:val="000000000000" w:firstRow="0" w:lastRow="0" w:firstColumn="0" w:lastColumn="0" w:oddVBand="0" w:evenVBand="0" w:oddHBand="0" w:evenHBand="0" w:firstRowFirstColumn="0" w:firstRowLastColumn="0" w:lastRowFirstColumn="0" w:lastRowLastColumn="0"/>
             </w:pPr>
+            <w:r>
+              <w:t>0.2</w:t>
+            </w:r>
           </w:p>
         </w:tc>
       </w:tr>
@@ -3599,6 +3670,9 @@
             <w:pPr>
               <w:cnfStyle w:val="000000000000" w:firstRow="0" w:lastRow="0" w:firstColumn="0" w:lastColumn="0" w:oddVBand="0" w:evenVBand="0" w:oddHBand="0" w:evenHBand="0" w:firstRowFirstColumn="0" w:firstRowLastColumn="0" w:lastRowFirstColumn="0" w:lastRowLastColumn="0"/>
             </w:pPr>
+            <w:r>
+              <w:t>0.3</w:t>
+            </w:r>
           </w:p>
         </w:tc>
       </w:tr>
@@ -3671,6 +3745,9 @@
             <w:pPr>
               <w:cnfStyle w:val="000000000000" w:firstRow="0" w:lastRow="0" w:firstColumn="0" w:lastColumn="0" w:oddVBand="0" w:evenVBand="0" w:oddHBand="0" w:evenHBand="0" w:firstRowFirstColumn="0" w:firstRowLastColumn="0" w:lastRowFirstColumn="0" w:lastRowLastColumn="0"/>
             </w:pPr>
+            <w:r>
+              <w:t>0.8</w:t>
+            </w:r>
           </w:p>
         </w:tc>
       </w:tr>
@@ -3743,6 +3820,9 @@
             <w:pPr>
               <w:cnfStyle w:val="000000000000" w:firstRow="0" w:lastRow="0" w:firstColumn="0" w:lastColumn="0" w:oddVBand="0" w:evenVBand="0" w:oddHBand="0" w:evenHBand="0" w:firstRowFirstColumn="0" w:firstRowLastColumn="0" w:lastRowFirstColumn="0" w:lastRowLastColumn="0"/>
             </w:pPr>
+            <w:r>
+              <w:t>0.4</w:t>
+            </w:r>
           </w:p>
         </w:tc>
       </w:tr>
@@ -3815,6 +3895,9 @@
             <w:pPr>
               <w:cnfStyle w:val="000000000000" w:firstRow="0" w:lastRow="0" w:firstColumn="0" w:lastColumn="0" w:oddVBand="0" w:evenVBand="0" w:oddHBand="0" w:evenHBand="0" w:firstRowFirstColumn="0" w:firstRowLastColumn="0" w:lastRowFirstColumn="0" w:lastRowLastColumn="0"/>
             </w:pPr>
+            <w:r>
+              <w:t>0.5</w:t>
+            </w:r>
           </w:p>
         </w:tc>
       </w:tr>
@@ -3887,6 +3970,9 @@
             <w:pPr>
               <w:cnfStyle w:val="000000000000" w:firstRow="0" w:lastRow="0" w:firstColumn="0" w:lastColumn="0" w:oddVBand="0" w:evenVBand="0" w:oddHBand="0" w:evenHBand="0" w:firstRowFirstColumn="0" w:firstRowLastColumn="0" w:lastRowFirstColumn="0" w:lastRowLastColumn="0"/>
             </w:pPr>
+            <w:r>
+              <w:t>0.6</w:t>
+            </w:r>
           </w:p>
         </w:tc>
       </w:tr>
@@ -3959,6 +4045,9 @@
             <w:pPr>
               <w:cnfStyle w:val="000000000000" w:firstRow="0" w:lastRow="0" w:firstColumn="0" w:lastColumn="0" w:oddVBand="0" w:evenVBand="0" w:oddHBand="0" w:evenHBand="0" w:firstRowFirstColumn="0" w:firstRowLastColumn="0" w:lastRowFirstColumn="0" w:lastRowLastColumn="0"/>
             </w:pPr>
+            <w:r>
+              <w:t>0.7</w:t>
+            </w:r>
           </w:p>
         </w:tc>
       </w:tr>
@@ -4026,7 +4115,13 @@
               <w:cnfStyle w:val="100000000000" w:firstRow="1" w:lastRow="0" w:firstColumn="0" w:lastColumn="0" w:oddVBand="0" w:evenVBand="0" w:oddHBand="0" w:evenHBand="0" w:firstRowFirstColumn="0" w:firstRowLastColumn="0" w:lastRowFirstColumn="0" w:lastRowLastColumn="0"/>
             </w:pPr>
             <w:r>
-              <w:t xml:space="preserve">P </w:t>
+              <w:t>P</w:t>
+            </w:r>
+            <w:r>
+              <w:t>(Labour Market Impact | others)</w:t>
+            </w:r>
+            <w:r>
+              <w:t xml:space="preserve"> </w:t>
             </w:r>
           </w:p>
         </w:tc>
@@ -4087,6 +4182,9 @@
             <w:pPr>
               <w:cnfStyle w:val="000000000000" w:firstRow="0" w:lastRow="0" w:firstColumn="0" w:lastColumn="0" w:oddVBand="0" w:evenVBand="0" w:oddHBand="0" w:evenHBand="0" w:firstRowFirstColumn="0" w:firstRowLastColumn="0" w:lastRowFirstColumn="0" w:lastRowLastColumn="0"/>
             </w:pPr>
+            <w:r>
+              <w:t>0.6</w:t>
+            </w:r>
           </w:p>
         </w:tc>
       </w:tr>
@@ -4146,6 +4244,9 @@
             <w:pPr>
               <w:cnfStyle w:val="000000000000" w:firstRow="0" w:lastRow="0" w:firstColumn="0" w:lastColumn="0" w:oddVBand="0" w:evenVBand="0" w:oddHBand="0" w:evenHBand="0" w:firstRowFirstColumn="0" w:firstRowLastColumn="0" w:lastRowFirstColumn="0" w:lastRowLastColumn="0"/>
             </w:pPr>
+            <w:r>
+              <w:t>0.9</w:t>
+            </w:r>
           </w:p>
         </w:tc>
       </w:tr>
@@ -4205,6 +4306,9 @@
             <w:pPr>
               <w:cnfStyle w:val="000000000000" w:firstRow="0" w:lastRow="0" w:firstColumn="0" w:lastColumn="0" w:oddVBand="0" w:evenVBand="0" w:oddHBand="0" w:evenHBand="0" w:firstRowFirstColumn="0" w:firstRowLastColumn="0" w:lastRowFirstColumn="0" w:lastRowLastColumn="0"/>
             </w:pPr>
+            <w:r>
+              <w:t>0.2</w:t>
+            </w:r>
           </w:p>
         </w:tc>
       </w:tr>
@@ -4264,6 +4368,9 @@
             <w:pPr>
               <w:cnfStyle w:val="000000000000" w:firstRow="0" w:lastRow="0" w:firstColumn="0" w:lastColumn="0" w:oddVBand="0" w:evenVBand="0" w:oddHBand="0" w:evenHBand="0" w:firstRowFirstColumn="0" w:firstRowLastColumn="0" w:lastRowFirstColumn="0" w:lastRowLastColumn="0"/>
             </w:pPr>
+            <w:r>
+              <w:t>0.5</w:t>
+            </w:r>
           </w:p>
         </w:tc>
       </w:tr>
@@ -4323,6 +4430,9 @@
             <w:pPr>
               <w:cnfStyle w:val="000000000000" w:firstRow="0" w:lastRow="0" w:firstColumn="0" w:lastColumn="0" w:oddVBand="0" w:evenVBand="0" w:oddHBand="0" w:evenHBand="0" w:firstRowFirstColumn="0" w:firstRowLastColumn="0" w:lastRowFirstColumn="0" w:lastRowLastColumn="0"/>
             </w:pPr>
+            <w:r>
+              <w:t>0.4</w:t>
+            </w:r>
           </w:p>
         </w:tc>
       </w:tr>
@@ -4382,6 +4492,9 @@
             <w:pPr>
               <w:cnfStyle w:val="000000000000" w:firstRow="0" w:lastRow="0" w:firstColumn="0" w:lastColumn="0" w:oddVBand="0" w:evenVBand="0" w:oddHBand="0" w:evenHBand="0" w:firstRowFirstColumn="0" w:firstRowLastColumn="0" w:lastRowFirstColumn="0" w:lastRowLastColumn="0"/>
             </w:pPr>
+            <w:r>
+              <w:t>0.1</w:t>
+            </w:r>
           </w:p>
         </w:tc>
       </w:tr>
@@ -4441,6 +4554,9 @@
             <w:pPr>
               <w:cnfStyle w:val="000000000000" w:firstRow="0" w:lastRow="0" w:firstColumn="0" w:lastColumn="0" w:oddVBand="0" w:evenVBand="0" w:oddHBand="0" w:evenHBand="0" w:firstRowFirstColumn="0" w:firstRowLastColumn="0" w:lastRowFirstColumn="0" w:lastRowLastColumn="0"/>
             </w:pPr>
+            <w:r>
+              <w:t>0.8</w:t>
+            </w:r>
           </w:p>
         </w:tc>
       </w:tr>
@@ -4500,6 +4616,9 @@
             <w:pPr>
               <w:cnfStyle w:val="000000000000" w:firstRow="0" w:lastRow="0" w:firstColumn="0" w:lastColumn="0" w:oddVBand="0" w:evenVBand="0" w:oddHBand="0" w:evenHBand="0" w:firstRowFirstColumn="0" w:firstRowLastColumn="0" w:lastRowFirstColumn="0" w:lastRowLastColumn="0"/>
             </w:pPr>
+            <w:r>
+              <w:t>0.5</w:t>
+            </w:r>
           </w:p>
         </w:tc>
       </w:tr>
@@ -4510,6 +4629,7 @@
         <w:pStyle w:val="Heading2"/>
       </w:pPr>
       <w:r>
+        <w:lastRenderedPageBreak/>
         <w:t>IMPLEMENTATION AND ANALYSIS OF NAÏVE BAYES CLASSIFIERS</w:t>
       </w:r>
     </w:p>
@@ -4540,7 +4660,6 @@
         </w:tabs>
       </w:pPr>
       <w:r>
-        <w:lastRenderedPageBreak/>
         <w:t>NAÏVE BAYES CLASSIFICATION</w:t>
       </w:r>
     </w:p>
@@ -6000,6 +6119,7 @@
   <w:style w:type="table" w:default="1" w:styleId="TableNormal">
     <w:name w:val="Normal Table"/>
     <w:uiPriority w:val="99"/>
+    <w:semiHidden/>
     <w:unhideWhenUsed/>
     <w:tblPr>
       <w:tblInd w:w="0" w:type="dxa"/>

</xml_diff>

<commit_message>
MOre work on the word doc
</commit_message>
<xml_diff>
--- a/assignment2/A2_COMP9016_Nagle_JohnPaul_R00065426.docx
+++ b/assignment2/A2_COMP9016_Nagle_JohnPaul_R00065426.docx
@@ -2840,13 +2840,7 @@
               <w:t>P</w:t>
             </w:r>
             <w:r>
-              <w:t>(</w:t>
-            </w:r>
-            <w:r>
-              <w:t>Enterprise Adoption</w:t>
-            </w:r>
-            <w:r>
-              <w:t xml:space="preserve"> | others)</w:t>
+              <w:t>(Enterprise Adoption | others)</w:t>
             </w:r>
           </w:p>
         </w:tc>
@@ -4624,12 +4618,456 @@
       </w:tr>
     </w:tbl>
     <w:p/>
+    <w:p/>
+    <w:p>
+      <w:r>
+        <w:t xml:space="preserve">A Bayesian Network is a type of probabilistic graphical model that maps variables to Nodes and their conditional dependencies to Edges in a directed acyclic graph. </w:t>
+      </w:r>
+    </w:p>
+    <w:p>
+      <w:r>
+        <w:lastRenderedPageBreak/>
+        <w:t xml:space="preserve">Bayesian Networks are used for probabilistic predictions of random variables in the graph, having observed other variables and the conditional dependencies. </w:t>
+      </w:r>
+    </w:p>
+    <w:p/>
+    <w:p>
+      <w:r>
+        <w:t>Bayesian Networks solve the issues encountered w</w:t>
+      </w:r>
+      <w:r>
+        <w:t xml:space="preserve">hen using </w:t>
+      </w:r>
+      <w:r>
+        <w:t xml:space="preserve">full joint distribution </w:t>
+      </w:r>
+      <w:r>
+        <w:t>table</w:t>
+      </w:r>
+      <w:r>
+        <w:t>s</w:t>
+      </w:r>
+      <w:r>
+        <w:t xml:space="preserve"> and the naïve Bayes algorithm for predicting values</w:t>
+      </w:r>
+      <w:r>
+        <w:t xml:space="preserve"> i.e.</w:t>
+      </w:r>
+      <w:r>
+        <w:t xml:space="preserve"> the amount of computation involved becomes very large</w:t>
+      </w:r>
+      <w:r>
+        <w:t>, and if there are more than a small number of variables, then the joint becomes impossibly big.</w:t>
+      </w:r>
+    </w:p>
+    <w:p/>
+    <w:p>
+      <w:r>
+        <w:t xml:space="preserve">Breaking the </w:t>
+      </w:r>
+      <w:r>
+        <w:t>complex joint distributions</w:t>
+      </w:r>
+      <w:r>
+        <w:t xml:space="preserve"> down into nodes and dependencies reduce</w:t>
+      </w:r>
+      <w:r>
+        <w:t>s</w:t>
+      </w:r>
+      <w:r>
+        <w:t xml:space="preserve"> the amount of effort needed. Variables become conditionally independent, reducing the complexity, and the time required for the calculations.</w:t>
+      </w:r>
+      <w:r>
+        <w:t xml:space="preserve"> </w:t>
+      </w:r>
+    </w:p>
+    <w:p/>
+    <w:p>
+      <w:r>
+        <w:t>The Bayesian Network Chain Rule is a way to express the joint probability distribution of all variables in a Bayesian Network</w:t>
+      </w:r>
+      <w:r>
+        <w:t xml:space="preserve"> and use the conditional independence built into the network to factor it down into more manageable conditionals.</w:t>
+      </w:r>
+    </w:p>
+    <w:p/>
+    <w:p>
+      <w:r>
+        <w:t>For example</w:t>
+      </w:r>
+      <w:r>
+        <w:t xml:space="preserve"> </w:t>
+      </w:r>
+      <w:r>
+        <w:t xml:space="preserve">in a </w:t>
+      </w:r>
+      <w:r>
+        <w:t>network with three variables:</w:t>
+      </w:r>
+    </w:p>
+    <w:p/>
+    <w:p>
+      <w:r>
+        <w:t>Rain</w:t>
+      </w:r>
+    </w:p>
+    <w:p>
+      <w:r>
+        <w:t>Sprinkler (depends on Rain)</w:t>
+      </w:r>
+    </w:p>
+    <w:p>
+      <w:proofErr w:type="spellStart"/>
+      <w:r>
+        <w:t>WetGrass</w:t>
+      </w:r>
+      <w:proofErr w:type="spellEnd"/>
+      <w:r>
+        <w:t xml:space="preserve"> (depends on both Rain and Sprinkler)</w:t>
+      </w:r>
+    </w:p>
+    <w:p/>
+    <w:p>
+      <w:r>
+        <w:t>P(</w:t>
+      </w:r>
+      <w:proofErr w:type="spellStart"/>
+      <w:r>
+        <w:t>Rain,Sprinkler,WetGrass</w:t>
+      </w:r>
+      <w:proofErr w:type="spellEnd"/>
+      <w:r>
+        <w:t>)</w:t>
+      </w:r>
+      <w:r>
+        <w:t xml:space="preserve"> </w:t>
+      </w:r>
+      <w:r>
+        <w:t>=</w:t>
+      </w:r>
+      <w:r>
+        <w:t xml:space="preserve"> </w:t>
+      </w:r>
+      <w:r>
+        <w:t>P(Rain)</w:t>
+      </w:r>
+      <w:r>
+        <w:rPr>
+          <w:rFonts w:ascii="Cambria Math" w:hAnsi="Cambria Math" w:cs="Cambria Math"/>
+        </w:rPr>
+        <w:t xml:space="preserve"> * </w:t>
+      </w:r>
+      <w:r>
+        <w:t>P(</w:t>
+      </w:r>
+      <w:proofErr w:type="spellStart"/>
+      <w:r>
+        <w:t>Sprinkler</w:t>
+      </w:r>
+      <w:r>
+        <w:rPr>
+          <w:rFonts w:ascii="Cambria Math" w:hAnsi="Cambria Math" w:cs="Cambria Math"/>
+        </w:rPr>
+        <w:t>∣</w:t>
+      </w:r>
+      <w:r>
+        <w:t>Rain</w:t>
+      </w:r>
+      <w:proofErr w:type="spellEnd"/>
+      <w:r>
+        <w:t>)</w:t>
+      </w:r>
+      <w:r>
+        <w:rPr>
+          <w:rFonts w:ascii="Cambria Math" w:hAnsi="Cambria Math" w:cs="Cambria Math"/>
+        </w:rPr>
+        <w:t xml:space="preserve"> * </w:t>
+      </w:r>
+      <w:r>
+        <w:t>P(</w:t>
+      </w:r>
+      <w:proofErr w:type="spellStart"/>
+      <w:r>
+        <w:t>WetGrass</w:t>
+      </w:r>
+      <w:r>
+        <w:rPr>
+          <w:rFonts w:ascii="Cambria Math" w:hAnsi="Cambria Math" w:cs="Cambria Math"/>
+        </w:rPr>
+        <w:t>∣</w:t>
+      </w:r>
+      <w:r>
+        <w:t>Rain,Sprinkler</w:t>
+      </w:r>
+      <w:proofErr w:type="spellEnd"/>
+      <w:r>
+        <w:t>)</w:t>
+      </w:r>
+    </w:p>
+    <w:p/>
+    <w:p>
+      <w:r>
+        <w:t xml:space="preserve">This type of factorization makes the </w:t>
+      </w:r>
+      <w:r>
+        <w:t>computations</w:t>
+      </w:r>
+      <w:r>
+        <w:t xml:space="preserve"> much more </w:t>
+      </w:r>
+      <w:r>
+        <w:t>efficient</w:t>
+      </w:r>
+      <w:r>
+        <w:t xml:space="preserve"> than a brute force approach.</w:t>
+      </w:r>
+    </w:p>
+    <w:p/>
+    <w:tbl>
+      <w:tblPr>
+        <w:tblStyle w:val="ListTable3"/>
+        <w:tblW w:w="0" w:type="auto"/>
+        <w:tblLook w:val="04A0" w:firstRow="1" w:lastRow="0" w:firstColumn="1" w:lastColumn="0" w:noHBand="0" w:noVBand="1"/>
+      </w:tblPr>
+      <w:tblGrid>
+        <w:gridCol w:w="4508"/>
+        <w:gridCol w:w="4508"/>
+      </w:tblGrid>
+      <w:tr>
+        <w:trPr>
+          <w:cnfStyle w:val="100000000000" w:firstRow="1" w:lastRow="0" w:firstColumn="0" w:lastColumn="0" w:oddVBand="0" w:evenVBand="0" w:oddHBand="0" w:evenHBand="0" w:firstRowFirstColumn="0" w:firstRowLastColumn="0" w:lastRowFirstColumn="0" w:lastRowLastColumn="0"/>
+        </w:trPr>
+        <w:tc>
+          <w:tcPr>
+            <w:cnfStyle w:val="001000000100" w:firstRow="0" w:lastRow="0" w:firstColumn="1" w:lastColumn="0" w:oddVBand="0" w:evenVBand="0" w:oddHBand="0" w:evenHBand="0" w:firstRowFirstColumn="1" w:firstRowLastColumn="0" w:lastRowFirstColumn="0" w:lastRowLastColumn="0"/>
+            <w:tcW w:w="4508" w:type="dxa"/>
+          </w:tcPr>
+          <w:p>
+            <w:pPr>
+              <w:rPr>
+                <w:b w:val="0"/>
+                <w:bCs w:val="0"/>
+              </w:rPr>
+            </w:pPr>
+            <w:r>
+              <w:rPr>
+                <w:b w:val="0"/>
+                <w:bCs w:val="0"/>
+              </w:rPr>
+              <w:t>Pros</w:t>
+            </w:r>
+          </w:p>
+        </w:tc>
+        <w:tc>
+          <w:tcPr>
+            <w:tcW w:w="4508" w:type="dxa"/>
+          </w:tcPr>
+          <w:p>
+            <w:pPr>
+              <w:cnfStyle w:val="100000000000" w:firstRow="1" w:lastRow="0" w:firstColumn="0" w:lastColumn="0" w:oddVBand="0" w:evenVBand="0" w:oddHBand="0" w:evenHBand="0" w:firstRowFirstColumn="0" w:firstRowLastColumn="0" w:lastRowFirstColumn="0" w:lastRowLastColumn="0"/>
+              <w:rPr>
+                <w:b w:val="0"/>
+                <w:bCs w:val="0"/>
+              </w:rPr>
+            </w:pPr>
+            <w:r>
+              <w:rPr>
+                <w:b w:val="0"/>
+                <w:bCs w:val="0"/>
+              </w:rPr>
+              <w:t>Cons</w:t>
+            </w:r>
+          </w:p>
+        </w:tc>
+      </w:tr>
+      <w:tr>
+        <w:trPr>
+          <w:cnfStyle w:val="000000100000" w:firstRow="0" w:lastRow="0" w:firstColumn="0" w:lastColumn="0" w:oddVBand="0" w:evenVBand="0" w:oddHBand="1" w:evenHBand="0" w:firstRowFirstColumn="0" w:firstRowLastColumn="0" w:lastRowFirstColumn="0" w:lastRowLastColumn="0"/>
+        </w:trPr>
+        <w:tc>
+          <w:tcPr>
+            <w:cnfStyle w:val="001000000000" w:firstRow="0" w:lastRow="0" w:firstColumn="1" w:lastColumn="0" w:oddVBand="0" w:evenVBand="0" w:oddHBand="0" w:evenHBand="0" w:firstRowFirstColumn="0" w:firstRowLastColumn="0" w:lastRowFirstColumn="0" w:lastRowLastColumn="0"/>
+            <w:tcW w:w="4508" w:type="dxa"/>
+          </w:tcPr>
+          <w:p>
+            <w:pPr>
+              <w:rPr>
+                <w:b w:val="0"/>
+                <w:bCs w:val="0"/>
+              </w:rPr>
+            </w:pPr>
+            <w:r>
+              <w:rPr>
+                <w:b w:val="0"/>
+                <w:bCs w:val="0"/>
+              </w:rPr>
+              <w:t>Graphical nature makes understanding</w:t>
+            </w:r>
+            <w:r>
+              <w:rPr>
+                <w:b w:val="0"/>
+                <w:bCs w:val="0"/>
+              </w:rPr>
+              <w:t xml:space="preserve"> dependencies</w:t>
+            </w:r>
+            <w:r>
+              <w:rPr>
+                <w:b w:val="0"/>
+                <w:bCs w:val="0"/>
+              </w:rPr>
+              <w:t xml:space="preserve"> intuitive</w:t>
+            </w:r>
+          </w:p>
+        </w:tc>
+        <w:tc>
+          <w:tcPr>
+            <w:tcW w:w="4508" w:type="dxa"/>
+          </w:tcPr>
+          <w:p>
+            <w:pPr>
+              <w:cnfStyle w:val="000000100000" w:firstRow="0" w:lastRow="0" w:firstColumn="0" w:lastColumn="0" w:oddVBand="0" w:evenVBand="0" w:oddHBand="1" w:evenHBand="0" w:firstRowFirstColumn="0" w:firstRowLastColumn="0" w:lastRowFirstColumn="0" w:lastRowLastColumn="0"/>
+            </w:pPr>
+            <w:r>
+              <w:t>T</w:t>
+            </w:r>
+            <w:r>
+              <w:t xml:space="preserve">here </w:t>
+            </w:r>
+            <w:r>
+              <w:t xml:space="preserve">seems to be </w:t>
+            </w:r>
+            <w:r>
+              <w:t>no universally accepted method for constructing a network from data</w:t>
+            </w:r>
+            <w:r>
+              <w:t xml:space="preserve"> [1]</w:t>
+            </w:r>
+          </w:p>
+        </w:tc>
+      </w:tr>
+      <w:tr>
+        <w:tc>
+          <w:tcPr>
+            <w:cnfStyle w:val="001000000000" w:firstRow="0" w:lastRow="0" w:firstColumn="1" w:lastColumn="0" w:oddVBand="0" w:evenVBand="0" w:oddHBand="0" w:evenHBand="0" w:firstRowFirstColumn="0" w:firstRowLastColumn="0" w:lastRowFirstColumn="0" w:lastRowLastColumn="0"/>
+            <w:tcW w:w="4508" w:type="dxa"/>
+          </w:tcPr>
+          <w:p>
+            <w:pPr>
+              <w:rPr>
+                <w:b w:val="0"/>
+                <w:bCs w:val="0"/>
+              </w:rPr>
+            </w:pPr>
+            <w:r>
+              <w:rPr>
+                <w:b w:val="0"/>
+                <w:bCs w:val="0"/>
+              </w:rPr>
+              <w:t>Easy to add new information to the graph</w:t>
+            </w:r>
+          </w:p>
+        </w:tc>
+        <w:tc>
+          <w:tcPr>
+            <w:tcW w:w="4508" w:type="dxa"/>
+          </w:tcPr>
+          <w:p>
+            <w:pPr>
+              <w:cnfStyle w:val="000000000000" w:firstRow="0" w:lastRow="0" w:firstColumn="0" w:lastColumn="0" w:oddVBand="0" w:evenVBand="0" w:oddHBand="0" w:evenHBand="0" w:firstRowFirstColumn="0" w:firstRowLastColumn="0" w:lastRowFirstColumn="0" w:lastRowLastColumn="0"/>
+            </w:pPr>
+            <w:r>
+              <w:t>Exponential growth of computational requirements, depending on the number of nodes etc.</w:t>
+            </w:r>
+          </w:p>
+        </w:tc>
+      </w:tr>
+      <w:tr>
+        <w:trPr>
+          <w:cnfStyle w:val="000000100000" w:firstRow="0" w:lastRow="0" w:firstColumn="0" w:lastColumn="0" w:oddVBand="0" w:evenVBand="0" w:oddHBand="1" w:evenHBand="0" w:firstRowFirstColumn="0" w:firstRowLastColumn="0" w:lastRowFirstColumn="0" w:lastRowLastColumn="0"/>
+        </w:trPr>
+        <w:tc>
+          <w:tcPr>
+            <w:cnfStyle w:val="001000000000" w:firstRow="0" w:lastRow="0" w:firstColumn="1" w:lastColumn="0" w:oddVBand="0" w:evenVBand="0" w:oddHBand="0" w:evenHBand="0" w:firstRowFirstColumn="0" w:firstRowLastColumn="0" w:lastRowFirstColumn="0" w:lastRowLastColumn="0"/>
+            <w:tcW w:w="4508" w:type="dxa"/>
+          </w:tcPr>
+          <w:p>
+            <w:pPr>
+              <w:rPr>
+                <w:b w:val="0"/>
+                <w:bCs w:val="0"/>
+              </w:rPr>
+            </w:pPr>
+            <w:r>
+              <w:rPr>
+                <w:b w:val="0"/>
+                <w:bCs w:val="0"/>
+              </w:rPr>
+              <w:t>Allows the incorporation of domain knowledge</w:t>
+            </w:r>
+          </w:p>
+        </w:tc>
+        <w:tc>
+          <w:tcPr>
+            <w:tcW w:w="4508" w:type="dxa"/>
+          </w:tcPr>
+          <w:p>
+            <w:pPr>
+              <w:cnfStyle w:val="000000100000" w:firstRow="0" w:lastRow="0" w:firstColumn="0" w:lastColumn="0" w:oddVBand="0" w:evenVBand="0" w:oddHBand="1" w:evenHBand="0" w:firstRowFirstColumn="0" w:firstRowLastColumn="0" w:lastRowFirstColumn="0" w:lastRowLastColumn="0"/>
+            </w:pPr>
+            <w:r>
+              <w:t>Incorporated domain knowledge can be subjective.</w:t>
+            </w:r>
+          </w:p>
+        </w:tc>
+      </w:tr>
+      <w:tr>
+        <w:tc>
+          <w:tcPr>
+            <w:cnfStyle w:val="001000000000" w:firstRow="0" w:lastRow="0" w:firstColumn="1" w:lastColumn="0" w:oddVBand="0" w:evenVBand="0" w:oddHBand="0" w:evenHBand="0" w:firstRowFirstColumn="0" w:firstRowLastColumn="0" w:lastRowFirstColumn="0" w:lastRowLastColumn="0"/>
+            <w:tcW w:w="4508" w:type="dxa"/>
+          </w:tcPr>
+          <w:p/>
+        </w:tc>
+        <w:tc>
+          <w:tcPr>
+            <w:tcW w:w="4508" w:type="dxa"/>
+          </w:tcPr>
+          <w:p>
+            <w:pPr>
+              <w:cnfStyle w:val="000000000000" w:firstRow="0" w:lastRow="0" w:firstColumn="0" w:lastColumn="0" w:oddVBand="0" w:evenVBand="0" w:oddHBand="0" w:evenHBand="0" w:firstRowFirstColumn="0" w:firstRowLastColumn="0" w:lastRowFirstColumn="0" w:lastRowLastColumn="0"/>
+            </w:pPr>
+          </w:p>
+        </w:tc>
+      </w:tr>
+      <w:tr>
+        <w:trPr>
+          <w:cnfStyle w:val="000000100000" w:firstRow="0" w:lastRow="0" w:firstColumn="0" w:lastColumn="0" w:oddVBand="0" w:evenVBand="0" w:oddHBand="1" w:evenHBand="0" w:firstRowFirstColumn="0" w:firstRowLastColumn="0" w:lastRowFirstColumn="0" w:lastRowLastColumn="0"/>
+        </w:trPr>
+        <w:tc>
+          <w:tcPr>
+            <w:cnfStyle w:val="001000000000" w:firstRow="0" w:lastRow="0" w:firstColumn="1" w:lastColumn="0" w:oddVBand="0" w:evenVBand="0" w:oddHBand="0" w:evenHBand="0" w:firstRowFirstColumn="0" w:firstRowLastColumn="0" w:lastRowFirstColumn="0" w:lastRowLastColumn="0"/>
+            <w:tcW w:w="4508" w:type="dxa"/>
+          </w:tcPr>
+          <w:p/>
+        </w:tc>
+        <w:tc>
+          <w:tcPr>
+            <w:tcW w:w="4508" w:type="dxa"/>
+          </w:tcPr>
+          <w:p>
+            <w:pPr>
+              <w:cnfStyle w:val="000000100000" w:firstRow="0" w:lastRow="0" w:firstColumn="0" w:lastColumn="0" w:oddVBand="0" w:evenVBand="0" w:oddHBand="1" w:evenHBand="0" w:firstRowFirstColumn="0" w:firstRowLastColumn="0" w:lastRowFirstColumn="0" w:lastRowLastColumn="0"/>
+            </w:pPr>
+          </w:p>
+        </w:tc>
+      </w:tr>
+    </w:tbl>
+    <w:p/>
     <w:p>
       <w:pPr>
         <w:pStyle w:val="Heading2"/>
       </w:pPr>
       <w:r>
-        <w:lastRenderedPageBreak/>
         <w:t>IMPLEMENTATION AND ANALYSIS OF NAÏVE BAYES CLASSIFIERS</w:t>
       </w:r>
     </w:p>
@@ -4661,6 +5099,80 @@
       </w:pPr>
       <w:r>
         <w:t>NAÏVE BAYES CLASSIFICATION</w:t>
+      </w:r>
+    </w:p>
+    <w:p>
+      <w:pPr>
+        <w:tabs>
+          <w:tab w:val="left" w:pos="5560"/>
+        </w:tabs>
+      </w:pPr>
+    </w:p>
+    <w:p>
+      <w:pPr>
+        <w:tabs>
+          <w:tab w:val="left" w:pos="5560"/>
+        </w:tabs>
+      </w:pPr>
+    </w:p>
+    <w:p>
+      <w:pPr>
+        <w:tabs>
+          <w:tab w:val="left" w:pos="5560"/>
+        </w:tabs>
+      </w:pPr>
+    </w:p>
+    <w:p>
+      <w:pPr>
+        <w:tabs>
+          <w:tab w:val="left" w:pos="5560"/>
+        </w:tabs>
+      </w:pPr>
+    </w:p>
+    <w:p>
+      <w:pPr>
+        <w:tabs>
+          <w:tab w:val="left" w:pos="5560"/>
+        </w:tabs>
+      </w:pPr>
+    </w:p>
+    <w:p>
+      <w:pPr>
+        <w:tabs>
+          <w:tab w:val="left" w:pos="5560"/>
+        </w:tabs>
+      </w:pPr>
+    </w:p>
+    <w:p>
+      <w:pPr>
+        <w:tabs>
+          <w:tab w:val="left" w:pos="5560"/>
+        </w:tabs>
+      </w:pPr>
+    </w:p>
+    <w:p>
+      <w:pPr>
+        <w:tabs>
+          <w:tab w:val="left" w:pos="5560"/>
+        </w:tabs>
+      </w:pPr>
+      <w:r>
+        <w:t>References</w:t>
+      </w:r>
+    </w:p>
+    <w:p>
+      <w:pPr>
+        <w:pStyle w:val="ListParagraph"/>
+        <w:numPr>
+          <w:ilvl w:val="0"/>
+          <w:numId w:val="8"/>
+        </w:numPr>
+        <w:tabs>
+          <w:tab w:val="left" w:pos="5560"/>
+        </w:tabs>
+      </w:pPr>
+      <w:r>
+        <w:t>https://cim.mcgill.ca/~scott/RIT/researchPaper.html</w:t>
       </w:r>
     </w:p>
     <w:sectPr>
@@ -5035,6 +5547,95 @@
     </w:lvl>
   </w:abstractNum>
   <w:abstractNum w:abstractNumId="3" w15:restartNumberingAfterBreak="0">
+    <w:nsid w:val="48A77BC7"/>
+    <w:multiLevelType w:val="hybridMultilevel"/>
+    <w:tmpl w:val="4BA442A0"/>
+    <w:lvl w:ilvl="0" w:tplc="0809000F">
+      <w:start w:val="1"/>
+      <w:numFmt w:val="decimal"/>
+      <w:lvlText w:val="%1."/>
+      <w:lvlJc w:val="left"/>
+      <w:pPr>
+        <w:ind w:left="720" w:hanging="360"/>
+      </w:pPr>
+      <w:rPr>
+        <w:rFonts w:hint="default"/>
+      </w:rPr>
+    </w:lvl>
+    <w:lvl w:ilvl="1" w:tplc="08090019" w:tentative="1">
+      <w:start w:val="1"/>
+      <w:numFmt w:val="lowerLetter"/>
+      <w:lvlText w:val="%2."/>
+      <w:lvlJc w:val="left"/>
+      <w:pPr>
+        <w:ind w:left="1440" w:hanging="360"/>
+      </w:pPr>
+    </w:lvl>
+    <w:lvl w:ilvl="2" w:tplc="0809001B" w:tentative="1">
+      <w:start w:val="1"/>
+      <w:numFmt w:val="lowerRoman"/>
+      <w:lvlText w:val="%3."/>
+      <w:lvlJc w:val="right"/>
+      <w:pPr>
+        <w:ind w:left="2160" w:hanging="180"/>
+      </w:pPr>
+    </w:lvl>
+    <w:lvl w:ilvl="3" w:tplc="0809000F" w:tentative="1">
+      <w:start w:val="1"/>
+      <w:numFmt w:val="decimal"/>
+      <w:lvlText w:val="%4."/>
+      <w:lvlJc w:val="left"/>
+      <w:pPr>
+        <w:ind w:left="2880" w:hanging="360"/>
+      </w:pPr>
+    </w:lvl>
+    <w:lvl w:ilvl="4" w:tplc="08090019" w:tentative="1">
+      <w:start w:val="1"/>
+      <w:numFmt w:val="lowerLetter"/>
+      <w:lvlText w:val="%5."/>
+      <w:lvlJc w:val="left"/>
+      <w:pPr>
+        <w:ind w:left="3600" w:hanging="360"/>
+      </w:pPr>
+    </w:lvl>
+    <w:lvl w:ilvl="5" w:tplc="0809001B" w:tentative="1">
+      <w:start w:val="1"/>
+      <w:numFmt w:val="lowerRoman"/>
+      <w:lvlText w:val="%6."/>
+      <w:lvlJc w:val="right"/>
+      <w:pPr>
+        <w:ind w:left="4320" w:hanging="180"/>
+      </w:pPr>
+    </w:lvl>
+    <w:lvl w:ilvl="6" w:tplc="0809000F" w:tentative="1">
+      <w:start w:val="1"/>
+      <w:numFmt w:val="decimal"/>
+      <w:lvlText w:val="%7."/>
+      <w:lvlJc w:val="left"/>
+      <w:pPr>
+        <w:ind w:left="5040" w:hanging="360"/>
+      </w:pPr>
+    </w:lvl>
+    <w:lvl w:ilvl="7" w:tplc="08090019" w:tentative="1">
+      <w:start w:val="1"/>
+      <w:numFmt w:val="lowerLetter"/>
+      <w:lvlText w:val="%8."/>
+      <w:lvlJc w:val="left"/>
+      <w:pPr>
+        <w:ind w:left="5760" w:hanging="360"/>
+      </w:pPr>
+    </w:lvl>
+    <w:lvl w:ilvl="8" w:tplc="0809001B" w:tentative="1">
+      <w:start w:val="1"/>
+      <w:numFmt w:val="lowerRoman"/>
+      <w:lvlText w:val="%9."/>
+      <w:lvlJc w:val="right"/>
+      <w:pPr>
+        <w:ind w:left="6480" w:hanging="180"/>
+      </w:pPr>
+    </w:lvl>
+  </w:abstractNum>
+  <w:abstractNum w:abstractNumId="4" w15:restartNumberingAfterBreak="0">
     <w:nsid w:val="4F8017CB"/>
     <w:multiLevelType w:val="hybridMultilevel"/>
     <w:tmpl w:val="EAE05A4C"/>
@@ -5147,7 +5748,7 @@
       </w:rPr>
     </w:lvl>
   </w:abstractNum>
-  <w:abstractNum w:abstractNumId="4" w15:restartNumberingAfterBreak="0">
+  <w:abstractNum w:abstractNumId="5" w15:restartNumberingAfterBreak="0">
     <w:nsid w:val="56C32F0D"/>
     <w:multiLevelType w:val="hybridMultilevel"/>
     <w:tmpl w:val="9388486C"/>
@@ -5260,7 +5861,7 @@
       </w:rPr>
     </w:lvl>
   </w:abstractNum>
-  <w:abstractNum w:abstractNumId="5" w15:restartNumberingAfterBreak="0">
+  <w:abstractNum w:abstractNumId="6" w15:restartNumberingAfterBreak="0">
     <w:nsid w:val="69B221DD"/>
     <w:multiLevelType w:val="multilevel"/>
     <w:tmpl w:val="E24AE762"/>
@@ -5381,7 +5982,7 @@
       </w:rPr>
     </w:lvl>
   </w:abstractNum>
-  <w:abstractNum w:abstractNumId="6" w15:restartNumberingAfterBreak="0">
+  <w:abstractNum w:abstractNumId="7" w15:restartNumberingAfterBreak="0">
     <w:nsid w:val="6B212E96"/>
     <w:multiLevelType w:val="hybridMultilevel"/>
     <w:tmpl w:val="F1ACE154"/>
@@ -5504,16 +6105,19 @@
     <w:abstractNumId w:val="2"/>
   </w:num>
   <w:num w:numId="4" w16cid:durableId="1276903641">
+    <w:abstractNumId w:val="6"/>
+  </w:num>
+  <w:num w:numId="5" w16cid:durableId="663513180">
+    <w:abstractNumId w:val="4"/>
+  </w:num>
+  <w:num w:numId="6" w16cid:durableId="1229077893">
+    <w:abstractNumId w:val="7"/>
+  </w:num>
+  <w:num w:numId="7" w16cid:durableId="653529978">
     <w:abstractNumId w:val="5"/>
   </w:num>
-  <w:num w:numId="5" w16cid:durableId="663513180">
+  <w:num w:numId="8" w16cid:durableId="966856912">
     <w:abstractNumId w:val="3"/>
-  </w:num>
-  <w:num w:numId="6" w16cid:durableId="1229077893">
-    <w:abstractNumId w:val="6"/>
-  </w:num>
-  <w:num w:numId="7" w16cid:durableId="653529978">
-    <w:abstractNumId w:val="4"/>
   </w:num>
 </w:numbering>
 </file>
@@ -7189,6 +7793,127 @@
       </w:tcPr>
     </w:tblStylePr>
   </w:style>
+  <w:style w:type="table" w:styleId="ListTable3">
+    <w:name w:val="List Table 3"/>
+    <w:basedOn w:val="TableNormal"/>
+    <w:uiPriority w:val="48"/>
+    <w:rsid w:val="005967AB"/>
+    <w:tblPr>
+      <w:tblStyleRowBandSize w:val="1"/>
+      <w:tblStyleColBandSize w:val="1"/>
+      <w:tblBorders>
+        <w:top w:val="single" w:sz="4" w:space="0" w:color="000000" w:themeColor="text1"/>
+        <w:left w:val="single" w:sz="4" w:space="0" w:color="000000" w:themeColor="text1"/>
+        <w:bottom w:val="single" w:sz="4" w:space="0" w:color="000000" w:themeColor="text1"/>
+        <w:right w:val="single" w:sz="4" w:space="0" w:color="000000" w:themeColor="text1"/>
+      </w:tblBorders>
+    </w:tblPr>
+    <w:tblStylePr w:type="firstRow">
+      <w:rPr>
+        <w:b/>
+        <w:bCs/>
+        <w:color w:val="FFFFFF" w:themeColor="background1"/>
+      </w:rPr>
+      <w:tblPr/>
+      <w:tcPr>
+        <w:shd w:val="clear" w:color="auto" w:fill="000000" w:themeFill="text1"/>
+      </w:tcPr>
+    </w:tblStylePr>
+    <w:tblStylePr w:type="lastRow">
+      <w:rPr>
+        <w:b/>
+        <w:bCs/>
+      </w:rPr>
+      <w:tblPr/>
+      <w:tcPr>
+        <w:tcBorders>
+          <w:top w:val="double" w:sz="4" w:space="0" w:color="000000" w:themeColor="text1"/>
+        </w:tcBorders>
+        <w:shd w:val="clear" w:color="auto" w:fill="FFFFFF" w:themeFill="background1"/>
+      </w:tcPr>
+    </w:tblStylePr>
+    <w:tblStylePr w:type="firstCol">
+      <w:rPr>
+        <w:b/>
+        <w:bCs/>
+      </w:rPr>
+      <w:tblPr/>
+      <w:tcPr>
+        <w:tcBorders>
+          <w:right w:val="nil"/>
+        </w:tcBorders>
+        <w:shd w:val="clear" w:color="auto" w:fill="FFFFFF" w:themeFill="background1"/>
+      </w:tcPr>
+    </w:tblStylePr>
+    <w:tblStylePr w:type="lastCol">
+      <w:rPr>
+        <w:b/>
+        <w:bCs/>
+      </w:rPr>
+      <w:tblPr/>
+      <w:tcPr>
+        <w:tcBorders>
+          <w:left w:val="nil"/>
+        </w:tcBorders>
+        <w:shd w:val="clear" w:color="auto" w:fill="FFFFFF" w:themeFill="background1"/>
+      </w:tcPr>
+    </w:tblStylePr>
+    <w:tblStylePr w:type="band1Vert">
+      <w:tblPr/>
+      <w:tcPr>
+        <w:tcBorders>
+          <w:left w:val="single" w:sz="4" w:space="0" w:color="000000" w:themeColor="text1"/>
+          <w:right w:val="single" w:sz="4" w:space="0" w:color="000000" w:themeColor="text1"/>
+        </w:tcBorders>
+      </w:tcPr>
+    </w:tblStylePr>
+    <w:tblStylePr w:type="band1Horz">
+      <w:tblPr/>
+      <w:tcPr>
+        <w:tcBorders>
+          <w:top w:val="single" w:sz="4" w:space="0" w:color="000000" w:themeColor="text1"/>
+          <w:bottom w:val="single" w:sz="4" w:space="0" w:color="000000" w:themeColor="text1"/>
+          <w:insideH w:val="nil"/>
+        </w:tcBorders>
+      </w:tcPr>
+    </w:tblStylePr>
+    <w:tblStylePr w:type="neCell">
+      <w:tblPr/>
+      <w:tcPr>
+        <w:tcBorders>
+          <w:left w:val="nil"/>
+          <w:bottom w:val="nil"/>
+        </w:tcBorders>
+      </w:tcPr>
+    </w:tblStylePr>
+    <w:tblStylePr w:type="nwCell">
+      <w:tblPr/>
+      <w:tcPr>
+        <w:tcBorders>
+          <w:bottom w:val="nil"/>
+          <w:right w:val="nil"/>
+        </w:tcBorders>
+      </w:tcPr>
+    </w:tblStylePr>
+    <w:tblStylePr w:type="seCell">
+      <w:tblPr/>
+      <w:tcPr>
+        <w:tcBorders>
+          <w:top w:val="double" w:sz="4" w:space="0" w:color="000000" w:themeColor="text1"/>
+          <w:left w:val="nil"/>
+        </w:tcBorders>
+      </w:tcPr>
+    </w:tblStylePr>
+    <w:tblStylePr w:type="swCell">
+      <w:tblPr/>
+      <w:tcPr>
+        <w:tcBorders>
+          <w:top w:val="double" w:sz="4" w:space="0" w:color="000000" w:themeColor="text1"/>
+          <w:right w:val="nil"/>
+        </w:tcBorders>
+      </w:tcPr>
+    </w:tblStylePr>
+  </w:style>
 </w:styles>
 </file>
 
@@ -7488,11 +8213,19 @@
 </file>
 
 <file path=customXml/item1.xml><?xml version="1.0" encoding="utf-8"?>
-<b:Sources xmlns:b="http://schemas.openxmlformats.org/officeDocument/2006/bibliography" xmlns="http://schemas.openxmlformats.org/officeDocument/2006/bibliography" SelectedStyle="/APASixthEditionOfficeOnline.xsl" StyleName="APA" Version="6"/>
+<b:Sources xmlns:b="http://schemas.openxmlformats.org/officeDocument/2006/bibliography" xmlns="http://schemas.openxmlformats.org/officeDocument/2006/bibliography" SelectedStyle="/APASixthEditionOfficeOnline.xsl" StyleName="APA" Version="6">
+  <b:Source>
+    <b:Tag>htt</b:Tag>
+    <b:SourceType>InternetSite</b:SourceType>
+    <b:Guid>{97CD4237-F095-1945-B600-66050124CBE9}</b:Guid>
+    <b:URL>https://cim.mcgill.ca/~scott/RIT/researchPaper.html</b:URL>
+    <b:RefOrder>1</b:RefOrder>
+  </b:Source>
+</b:Sources>
 </file>
 
 <file path=customXml/itemProps1.xml><?xml version="1.0" encoding="utf-8"?>
-<ds:datastoreItem xmlns:ds="http://schemas.openxmlformats.org/officeDocument/2006/customXml" ds:itemID="{E97C891E-73BA-B94D-AA5B-AAC80C280841}">
+<ds:datastoreItem xmlns:ds="http://schemas.openxmlformats.org/officeDocument/2006/customXml" ds:itemID="{A79B854A-0EBA-B14B-887A-0EC5D3C102D0}">
   <ds:schemaRefs>
     <ds:schemaRef ds:uri="http://schemas.openxmlformats.org/officeDocument/2006/bibliography"/>
   </ds:schemaRefs>

</xml_diff>

<commit_message>
MOve to cars set, updated docs, prior probs
</commit_message>
<xml_diff>
--- a/assignment2/A2_COMP9016_Nagle_JohnPaul_R00065426.docx
+++ b/assignment2/A2_COMP9016_Nagle_JohnPaul_R00065426.docx
@@ -33,6 +33,9 @@
         <w:pStyle w:val="Heading1"/>
       </w:pPr>
       <w:r>
+        <w:t xml:space="preserve">1.1 </w:t>
+      </w:r>
+      <w:r>
         <w:t>Logical Reasoning</w:t>
       </w:r>
     </w:p>
@@ -62,6 +65,9 @@
       <w:pPr>
         <w:pStyle w:val="Heading2"/>
       </w:pPr>
+      <w:r>
+        <w:t xml:space="preserve">1.1.3.1 </w:t>
+      </w:r>
       <w:r>
         <w:t>Forward Chaining</w:t>
       </w:r>
@@ -99,106 +105,42 @@
           <w:bCs/>
         </w:rPr>
       </w:pPr>
-      <w:proofErr w:type="spellStart"/>
       <w:r>
         <w:rPr>
           <w:b/>
           <w:bCs/>
         </w:rPr>
-        <w:t>TaughtBy</w:t>
-      </w:r>
-      <w:proofErr w:type="spellEnd"/>
-      <w:r>
-        <w:rPr>
-          <w:b/>
-          <w:bCs/>
-        </w:rPr>
-        <w:t xml:space="preserve"> relationships:</w:t>
-      </w:r>
-    </w:p>
-    <w:p>
-      <w:pPr>
-        <w:tabs>
-          <w:tab w:val="left" w:pos="5560"/>
-        </w:tabs>
-      </w:pPr>
-      <w:proofErr w:type="spellStart"/>
-      <w:r>
-        <w:t>TaughtBy</w:t>
-      </w:r>
-      <w:proofErr w:type="spellEnd"/>
-      <w:r>
-        <w:t xml:space="preserve">(Eve, </w:t>
-      </w:r>
-      <w:proofErr w:type="spellStart"/>
-      <w:r>
-        <w:t>DrDan</w:t>
-      </w:r>
-      <w:proofErr w:type="spellEnd"/>
-      <w:r>
-        <w:t>) — because Eve takes COMP9016, and DrDan teaches it.</w:t>
-      </w:r>
-    </w:p>
-    <w:p>
-      <w:pPr>
-        <w:tabs>
-          <w:tab w:val="left" w:pos="5560"/>
-        </w:tabs>
-      </w:pPr>
-      <w:proofErr w:type="spellStart"/>
-      <w:r>
-        <w:t>TaughtBy</w:t>
-      </w:r>
-      <w:proofErr w:type="spellEnd"/>
-      <w:r>
-        <w:t xml:space="preserve">(Bob, </w:t>
-      </w:r>
-      <w:proofErr w:type="spellStart"/>
-      <w:r>
-        <w:t>DrLisa</w:t>
-      </w:r>
-      <w:proofErr w:type="spellEnd"/>
-      <w:r>
-        <w:t xml:space="preserve">) — because Bob takes COMP9061, and </w:t>
-      </w:r>
-      <w:proofErr w:type="spellStart"/>
-      <w:r>
-        <w:t>DrLisa</w:t>
-      </w:r>
-      <w:proofErr w:type="spellEnd"/>
-      <w:r>
-        <w:t xml:space="preserve"> teaches it.</w:t>
-      </w:r>
-    </w:p>
-    <w:p>
-      <w:pPr>
-        <w:tabs>
-          <w:tab w:val="left" w:pos="5560"/>
-        </w:tabs>
-      </w:pPr>
-      <w:proofErr w:type="spellStart"/>
-      <w:r>
-        <w:t>TaughtBy</w:t>
-      </w:r>
-      <w:proofErr w:type="spellEnd"/>
-      <w:r>
-        <w:t xml:space="preserve">(Alice, </w:t>
-      </w:r>
-      <w:proofErr w:type="spellStart"/>
-      <w:r>
-        <w:t>DrSophie</w:t>
-      </w:r>
-      <w:proofErr w:type="spellEnd"/>
-      <w:r>
-        <w:t xml:space="preserve">) — because Alice takes COMP9062, and </w:t>
-      </w:r>
-      <w:proofErr w:type="spellStart"/>
-      <w:r>
-        <w:t>DrSophie</w:t>
-      </w:r>
-      <w:proofErr w:type="spellEnd"/>
-      <w:r>
-        <w:t xml:space="preserve"> teaches it.</w:t>
+        <w:t>TaughtBy relationships:</w:t>
+      </w:r>
+    </w:p>
+    <w:p>
+      <w:pPr>
+        <w:tabs>
+          <w:tab w:val="left" w:pos="5560"/>
+        </w:tabs>
+      </w:pPr>
+      <w:r>
+        <w:t>TaughtBy(Eve, DrDan) — because Eve takes COMP9016, and DrDan teaches it.</w:t>
+      </w:r>
+    </w:p>
+    <w:p>
+      <w:pPr>
+        <w:tabs>
+          <w:tab w:val="left" w:pos="5560"/>
+        </w:tabs>
+      </w:pPr>
+      <w:r>
+        <w:t>TaughtBy(Bob, DrLisa) — because Bob takes COMP9061, and DrLisa teaches it.</w:t>
+      </w:r>
+    </w:p>
+    <w:p>
+      <w:pPr>
+        <w:tabs>
+          <w:tab w:val="left" w:pos="5560"/>
+        </w:tabs>
+      </w:pPr>
+      <w:r>
+        <w:t>TaughtBy(Alice, DrSophie) — because Alice takes COMP9062, and DrSophie teaches it.</w:t>
       </w:r>
     </w:p>
     <w:p>
@@ -287,13 +229,8 @@
           <w:tab w:val="left" w:pos="5560"/>
         </w:tabs>
       </w:pPr>
-      <w:proofErr w:type="spellStart"/>
-      <w:r>
-        <w:t>IndirectPrereq</w:t>
-      </w:r>
-      <w:proofErr w:type="spellEnd"/>
-      <w:r>
-        <w:t>(COMP9016, COMP9061) — because COMP9016 is a prerequisite for COMP9062, and COMP9062 is a prerequisite for COMP9061.</w:t>
+      <w:r>
+        <w:t>IndirectPrereq(COMP9016, COMP9061) — because COMP9016 is a prerequisite for COMP9062, and COMP9062 is a prerequisite for COMP9061.</w:t>
       </w:r>
     </w:p>
     <w:p>
@@ -313,51 +250,32 @@
           <w:bCs/>
         </w:rPr>
       </w:pPr>
-      <w:proofErr w:type="spellStart"/>
       <w:r>
         <w:rPr>
           <w:b/>
           <w:bCs/>
         </w:rPr>
-        <w:t>CanEnroll</w:t>
-      </w:r>
-      <w:proofErr w:type="spellEnd"/>
-      <w:r>
-        <w:rPr>
-          <w:b/>
-          <w:bCs/>
-        </w:rPr>
-        <w:t>:</w:t>
-      </w:r>
-    </w:p>
-    <w:p>
-      <w:pPr>
-        <w:tabs>
-          <w:tab w:val="left" w:pos="5560"/>
-        </w:tabs>
-      </w:pPr>
-      <w:proofErr w:type="spellStart"/>
-      <w:r>
-        <w:t>CanEnroll</w:t>
-      </w:r>
-      <w:proofErr w:type="spellEnd"/>
-      <w:r>
-        <w:t>(Bob, COMP9061) — Bob is eligible for COMP9061 and has not passed it.</w:t>
-      </w:r>
-    </w:p>
-    <w:p>
-      <w:pPr>
-        <w:tabs>
-          <w:tab w:val="left" w:pos="5560"/>
-        </w:tabs>
-      </w:pPr>
-      <w:proofErr w:type="spellStart"/>
-      <w:r>
-        <w:t>CanEnroll</w:t>
-      </w:r>
-      <w:proofErr w:type="spellEnd"/>
-      <w:r>
-        <w:t>(Alice, COMP9062) — Alice is eligible for COMP9062 and has not passed it.</w:t>
+        <w:t>CanEnroll:</w:t>
+      </w:r>
+    </w:p>
+    <w:p>
+      <w:pPr>
+        <w:tabs>
+          <w:tab w:val="left" w:pos="5560"/>
+        </w:tabs>
+      </w:pPr>
+      <w:r>
+        <w:t>CanEnroll(Bob, COMP9061) — Bob is eligible for COMP9061 and has not passed it.</w:t>
+      </w:r>
+    </w:p>
+    <w:p>
+      <w:pPr>
+        <w:tabs>
+          <w:tab w:val="left" w:pos="5560"/>
+        </w:tabs>
+      </w:pPr>
+      <w:r>
+        <w:t>CanEnroll(Alice, COMP9062) — Alice is eligible for COMP9062 and has not passed it.</w:t>
       </w:r>
     </w:p>
     <w:p>
@@ -371,6 +289,9 @@
       <w:pPr>
         <w:pStyle w:val="Heading2"/>
       </w:pPr>
+      <w:r>
+        <w:t xml:space="preserve">1.1.3.2 </w:t>
+      </w:r>
       <w:r>
         <w:t>Backward Chaining</w:t>
       </w:r>
@@ -440,15 +361,7 @@
         <w:t>RULE</w:t>
       </w:r>
       <w:r>
-        <w:t xml:space="preserve">: </w:t>
-      </w:r>
-      <w:proofErr w:type="spellStart"/>
-      <w:r>
-        <w:t>Prereq</w:t>
-      </w:r>
-      <w:proofErr w:type="spellEnd"/>
-      <w:r>
-        <w:t>(p, m) &amp; Passed(s, p) ==&gt; Eligible(s, m)</w:t>
+        <w:t>: Prereq(p, m) &amp; Passed(s, p) ==&gt; Eligible(s, m)</w:t>
       </w:r>
     </w:p>
     <w:p>
@@ -473,21 +386,12 @@
       <w:r>
         <w:t xml:space="preserve"> </w:t>
       </w:r>
-      <w:proofErr w:type="spellStart"/>
       <w:r>
         <w:rPr>
           <w:b/>
           <w:bCs/>
         </w:rPr>
-        <w:t>Prereq</w:t>
-      </w:r>
-      <w:proofErr w:type="spellEnd"/>
-      <w:r>
-        <w:rPr>
-          <w:b/>
-          <w:bCs/>
-        </w:rPr>
-        <w:t>(p, m)</w:t>
+        <w:t>Prereq(p, m)</w:t>
       </w:r>
       <w:r>
         <w:t xml:space="preserve"> and </w:t>
@@ -533,60 +437,42 @@
           <w:iCs/>
         </w:rPr>
       </w:pPr>
-      <w:proofErr w:type="spellStart"/>
       <w:r>
         <w:rPr>
           <w:i/>
           <w:iCs/>
         </w:rPr>
-        <w:t>Prereq</w:t>
-      </w:r>
-      <w:proofErr w:type="spellEnd"/>
+        <w:t>Prereq(p, COMP9061) and Passed(Alice, p)</w:t>
+      </w:r>
+    </w:p>
+    <w:p>
+      <w:pPr>
+        <w:tabs>
+          <w:tab w:val="left" w:pos="5560"/>
+        </w:tabs>
+      </w:pPr>
+    </w:p>
+    <w:p>
+      <w:pPr>
+        <w:tabs>
+          <w:tab w:val="left" w:pos="5560"/>
+        </w:tabs>
+      </w:pPr>
+      <w:r>
+        <w:t>W</w:t>
+      </w:r>
+      <w:r>
+        <w:t xml:space="preserve">e check for these facts in the KB, and we </w:t>
+      </w:r>
+      <w:r>
+        <w:t xml:space="preserve">find </w:t>
+      </w:r>
       <w:r>
         <w:rPr>
           <w:i/>
           <w:iCs/>
         </w:rPr>
-        <w:t>(p, COMP9061) and Passed(Alice, p)</w:t>
-      </w:r>
-    </w:p>
-    <w:p>
-      <w:pPr>
-        <w:tabs>
-          <w:tab w:val="left" w:pos="5560"/>
-        </w:tabs>
-      </w:pPr>
-    </w:p>
-    <w:p>
-      <w:pPr>
-        <w:tabs>
-          <w:tab w:val="left" w:pos="5560"/>
-        </w:tabs>
-      </w:pPr>
-      <w:r>
-        <w:t>W</w:t>
-      </w:r>
-      <w:r>
-        <w:t xml:space="preserve">e check for these facts in the KB, and we </w:t>
-      </w:r>
-      <w:r>
-        <w:t xml:space="preserve">find </w:t>
-      </w:r>
-      <w:proofErr w:type="spellStart"/>
-      <w:r>
-        <w:rPr>
-          <w:i/>
-          <w:iCs/>
-        </w:rPr>
-        <w:t>Prereq</w:t>
-      </w:r>
-      <w:proofErr w:type="spellEnd"/>
-      <w:r>
-        <w:rPr>
-          <w:i/>
-          <w:iCs/>
-        </w:rPr>
-        <w:t>(COMP9062, COMP9061)</w:t>
+        <w:t>Prereq(COMP9062, COMP9061)</w:t>
       </w:r>
     </w:p>
     <w:p>
@@ -729,15 +615,7 @@
         <w:t xml:space="preserve">: </w:t>
       </w:r>
       <w:r>
-        <w:t>'</w:t>
-      </w:r>
-      <w:proofErr w:type="spellStart"/>
-      <w:r>
-        <w:t>Prereq</w:t>
-      </w:r>
-      <w:proofErr w:type="spellEnd"/>
-      <w:r>
-        <w:t>(p, m) &amp; Passed(s, p) ==&gt; Eligible(s, m)'</w:t>
+        <w:t>'Prereq(p, m) &amp; Passed(s, p) ==&gt; Eligible(s, m)'</w:t>
       </w:r>
     </w:p>
     <w:p>
@@ -759,21 +637,12 @@
       <w:r>
         <w:t xml:space="preserve"> </w:t>
       </w:r>
-      <w:proofErr w:type="spellStart"/>
       <w:r>
         <w:rPr>
           <w:b/>
           <w:bCs/>
         </w:rPr>
-        <w:t>Prereq</w:t>
-      </w:r>
-      <w:proofErr w:type="spellEnd"/>
-      <w:r>
-        <w:rPr>
-          <w:b/>
-          <w:bCs/>
-        </w:rPr>
-        <w:t>(p, m)</w:t>
+        <w:t>Prereq(p, m)</w:t>
       </w:r>
       <w:r>
         <w:t xml:space="preserve"> and </w:t>
@@ -811,57 +680,39 @@
       <w:r>
         <w:t xml:space="preserve"> </w:t>
       </w:r>
-      <w:proofErr w:type="spellStart"/>
       <w:r>
         <w:rPr>
           <w:i/>
           <w:iCs/>
         </w:rPr>
-        <w:t>Prereq</w:t>
-      </w:r>
-      <w:proofErr w:type="spellEnd"/>
+        <w:t>Prereq(p, COMP9061) and Passed(Bob, p)</w:t>
+      </w:r>
+    </w:p>
+    <w:p>
+      <w:pPr>
+        <w:tabs>
+          <w:tab w:val="left" w:pos="5560"/>
+        </w:tabs>
+      </w:pPr>
+    </w:p>
+    <w:p>
+      <w:pPr>
+        <w:tabs>
+          <w:tab w:val="left" w:pos="5560"/>
+        </w:tabs>
+      </w:pPr>
+      <w:r>
+        <w:t>So, we check for these facts in the KB, and we see</w:t>
+      </w:r>
+      <w:r>
+        <w:t xml:space="preserve"> </w:t>
+      </w:r>
       <w:r>
         <w:rPr>
           <w:i/>
           <w:iCs/>
         </w:rPr>
-        <w:t>(p, COMP9061) and Passed(Bob, p)</w:t>
-      </w:r>
-    </w:p>
-    <w:p>
-      <w:pPr>
-        <w:tabs>
-          <w:tab w:val="left" w:pos="5560"/>
-        </w:tabs>
-      </w:pPr>
-    </w:p>
-    <w:p>
-      <w:pPr>
-        <w:tabs>
-          <w:tab w:val="left" w:pos="5560"/>
-        </w:tabs>
-      </w:pPr>
-      <w:r>
-        <w:t>So, we check for these facts in the KB, and we see</w:t>
-      </w:r>
-      <w:r>
-        <w:t xml:space="preserve"> </w:t>
-      </w:r>
-      <w:proofErr w:type="spellStart"/>
-      <w:r>
-        <w:rPr>
-          <w:i/>
-          <w:iCs/>
-        </w:rPr>
-        <w:t>Prereq</w:t>
-      </w:r>
-      <w:proofErr w:type="spellEnd"/>
-      <w:r>
-        <w:rPr>
-          <w:i/>
-          <w:iCs/>
-        </w:rPr>
-        <w:t>(COMP9062, COMP9061)</w:t>
+        <w:t>Prereq(COMP9062, COMP9061)</w:t>
       </w:r>
     </w:p>
     <w:p>
@@ -942,21 +793,12 @@
           <w:bCs/>
         </w:rPr>
       </w:pPr>
-      <w:proofErr w:type="spellStart"/>
       <w:r>
         <w:rPr>
           <w:b/>
           <w:bCs/>
         </w:rPr>
-        <w:t>TaughtBy</w:t>
-      </w:r>
-      <w:proofErr w:type="spellEnd"/>
-      <w:r>
-        <w:rPr>
-          <w:b/>
-          <w:bCs/>
-        </w:rPr>
-        <w:t>(Eve, l) -&gt; The code replies “{v_79: Eve, v_81: DrDan, v_80: COMP9016}”</w:t>
+        <w:t>TaughtBy(Eve, l) -&gt; The code replies “{v_79: Eve, v_81: DrDan, v_80: COMP9016}”</w:t>
       </w:r>
     </w:p>
     <w:p>
@@ -973,15 +815,7 @@
         <w:t>GOAL</w:t>
       </w:r>
       <w:r>
-        <w:t xml:space="preserve">: </w:t>
-      </w:r>
-      <w:proofErr w:type="spellStart"/>
-      <w:r>
-        <w:t>TaughtBy</w:t>
-      </w:r>
-      <w:proofErr w:type="spellEnd"/>
-      <w:r>
-        <w:t>(Eve, l)</w:t>
+        <w:t>: TaughtBy(Eve, l)</w:t>
       </w:r>
     </w:p>
     <w:p>
@@ -1001,40 +835,24 @@
         <w:t xml:space="preserve">: </w:t>
       </w:r>
       <w:r>
-        <w:t xml:space="preserve">Takes(s, m) &amp; Teaches(l, m) ==&gt; </w:t>
-      </w:r>
-      <w:proofErr w:type="spellStart"/>
-      <w:r>
-        <w:t>TaughtBy</w:t>
-      </w:r>
-      <w:proofErr w:type="spellEnd"/>
-      <w:r>
-        <w:t>(s, l)</w:t>
-      </w:r>
-    </w:p>
-    <w:p>
-      <w:pPr>
-        <w:tabs>
-          <w:tab w:val="left" w:pos="5560"/>
-        </w:tabs>
-      </w:pPr>
-    </w:p>
-    <w:p>
-      <w:pPr>
-        <w:tabs>
-          <w:tab w:val="left" w:pos="5560"/>
-        </w:tabs>
-      </w:pPr>
-      <w:r>
-        <w:t xml:space="preserve">So, we need to prove each element of the LHS of the rule </w:t>
-      </w:r>
-      <w:proofErr w:type="spellStart"/>
-      <w:r>
-        <w:t>i.e.Takes</w:t>
-      </w:r>
-      <w:proofErr w:type="spellEnd"/>
-      <w:r>
-        <w:t>(s, m) and Teaches(l, m), where s = Eve.</w:t>
+        <w:t>Takes(s, m) &amp; Teaches(l, m) ==&gt; TaughtBy(s, l)</w:t>
+      </w:r>
+    </w:p>
+    <w:p>
+      <w:pPr>
+        <w:tabs>
+          <w:tab w:val="left" w:pos="5560"/>
+        </w:tabs>
+      </w:pPr>
+    </w:p>
+    <w:p>
+      <w:pPr>
+        <w:tabs>
+          <w:tab w:val="left" w:pos="5560"/>
+        </w:tabs>
+      </w:pPr>
+      <w:r>
+        <w:t>So, we need to prove each element of the LHS of the rule i.e.Takes(s, m) and Teaches(l, m), where s = Eve.</w:t>
       </w:r>
     </w:p>
     <w:p>
@@ -1382,6 +1200,9 @@
       <w:pPr>
         <w:pStyle w:val="Heading2"/>
       </w:pPr>
+      <w:r>
+        <w:t xml:space="preserve">1.1.3.3 </w:t>
+      </w:r>
       <w:r>
         <w:t>Comparison</w:t>
       </w:r>
@@ -1579,29 +1400,13 @@
               <w:t xml:space="preserve">Given the CWA, if a fact cannot be derived, it is assumed to be False. E.g. </w:t>
             </w:r>
             <w:r>
-              <w:t xml:space="preserve">if </w:t>
-            </w:r>
-            <w:proofErr w:type="spellStart"/>
-            <w:r>
-              <w:t>CanEnroll</w:t>
-            </w:r>
-            <w:proofErr w:type="spellEnd"/>
-            <w:r>
-              <w:t xml:space="preserve">(Alice, </w:t>
+              <w:t xml:space="preserve">if CanEnroll(Alice, </w:t>
             </w:r>
             <w:r>
               <w:t>COMP9016</w:t>
             </w:r>
             <w:r>
-              <w:t>) cannot be derived, then ¬</w:t>
-            </w:r>
-            <w:proofErr w:type="spellStart"/>
-            <w:r>
-              <w:t>CanEnroll</w:t>
-            </w:r>
-            <w:proofErr w:type="spellEnd"/>
-            <w:r>
-              <w:t xml:space="preserve">(Alice, </w:t>
+              <w:t xml:space="preserve">) cannot be derived, then ¬CanEnroll(Alice, </w:t>
             </w:r>
             <w:r>
               <w:t>COMP9016</w:t>
@@ -1625,21 +1430,11 @@
               </w:tabs>
               <w:cnfStyle w:val="000000000000" w:firstRow="0" w:lastRow="0" w:firstColumn="0" w:lastColumn="0" w:oddVBand="0" w:evenVBand="0" w:oddHBand="0" w:evenHBand="0" w:firstRowFirstColumn="0" w:firstRowLastColumn="0" w:lastRowFirstColumn="0" w:lastRowLastColumn="0"/>
             </w:pPr>
-            <w:proofErr w:type="spellStart"/>
-            <w:r>
-              <w:t>Similarily</w:t>
-            </w:r>
-            <w:proofErr w:type="spellEnd"/>
-            <w:r>
-              <w:t xml:space="preserve">, if the system cannot prove that e.g. </w:t>
-            </w:r>
-            <w:proofErr w:type="spellStart"/>
-            <w:r>
-              <w:t>CanEnroll</w:t>
-            </w:r>
-            <w:proofErr w:type="spellEnd"/>
-            <w:r>
-              <w:t xml:space="preserve">(Alice, </w:t>
+            <w:r>
+              <w:t xml:space="preserve">Similarily, if the system cannot prove that e.g. </w:t>
+            </w:r>
+            <w:r>
+              <w:t xml:space="preserve">CanEnroll(Alice, </w:t>
             </w:r>
             <w:r>
               <w:t>COMP9016, then is assumes that it is False.</w:t>
@@ -1659,6 +1454,9 @@
       <w:pPr>
         <w:pStyle w:val="Heading2"/>
       </w:pPr>
+      <w:r>
+        <w:t xml:space="preserve">1.2 </w:t>
+      </w:r>
       <w:r>
         <w:t>BAYESIAN NETWORKS: AI MARKET ANALYSIS</w:t>
       </w:r>
@@ -1691,27 +1489,9 @@
           <w:tab w:val="left" w:pos="5560"/>
         </w:tabs>
       </w:pPr>
-      <w:proofErr w:type="spellStart"/>
-      <w:r>
-        <w:t>HypeLevel</w:t>
-      </w:r>
-      <w:proofErr w:type="spellEnd"/>
-      <w:r>
-        <w:t xml:space="preserve"> -&gt; </w:t>
-      </w:r>
-      <w:proofErr w:type="spellStart"/>
-      <w:r>
-        <w:t>VCInvestment</w:t>
-      </w:r>
-      <w:proofErr w:type="spellEnd"/>
-      <w:r>
-        <w:t xml:space="preserve"> -&gt; </w:t>
-      </w:r>
-      <w:proofErr w:type="spellStart"/>
-      <w:r>
-        <w:t>EnterpriseAdoption</w:t>
-      </w:r>
-      <w:proofErr w:type="spellEnd"/>
+      <w:r>
+        <w:t>HypeLevel -&gt; VCInvestment -&gt; EnterpriseAdoption</w:t>
+      </w:r>
     </w:p>
     <w:p>
       <w:pPr>
@@ -1741,19 +1521,9 @@
           <w:tab w:val="left" w:pos="5560"/>
         </w:tabs>
       </w:pPr>
-      <w:proofErr w:type="spellStart"/>
-      <w:r>
-        <w:t>RegulatoryPressure</w:t>
-      </w:r>
-      <w:proofErr w:type="spellEnd"/>
-      <w:r>
-        <w:t xml:space="preserve"> -&gt; </w:t>
-      </w:r>
-      <w:proofErr w:type="spellStart"/>
-      <w:r>
-        <w:t>EnterpriseAdoption</w:t>
-      </w:r>
-      <w:proofErr w:type="spellEnd"/>
+      <w:r>
+        <w:t>RegulatoryPressure -&gt; EnterpriseAdoption</w:t>
+      </w:r>
     </w:p>
     <w:p>
       <w:pPr>
@@ -1766,19 +1536,9 @@
           <w:tab w:val="left" w:pos="5560"/>
         </w:tabs>
       </w:pPr>
-      <w:proofErr w:type="spellStart"/>
-      <w:r>
-        <w:t>RegulatoryPressure</w:t>
-      </w:r>
-      <w:proofErr w:type="spellEnd"/>
-      <w:r>
-        <w:t xml:space="preserve"> -&gt; </w:t>
-      </w:r>
-      <w:proofErr w:type="spellStart"/>
-      <w:r>
-        <w:t>LabourMarketImpact</w:t>
-      </w:r>
-      <w:proofErr w:type="spellEnd"/>
+      <w:r>
+        <w:t>RegulatoryPressure -&gt; LabourMarketImpact</w:t>
+      </w:r>
     </w:p>
     <w:p>
       <w:pPr>
@@ -1808,27 +1568,9 @@
           <w:tab w:val="left" w:pos="5560"/>
         </w:tabs>
       </w:pPr>
-      <w:proofErr w:type="spellStart"/>
-      <w:r>
-        <w:t>ComputeCosts</w:t>
-      </w:r>
-      <w:proofErr w:type="spellEnd"/>
-      <w:r>
-        <w:t xml:space="preserve"> -&gt; </w:t>
-      </w:r>
-      <w:proofErr w:type="spellStart"/>
-      <w:r>
-        <w:t>EnterpriseAdoption</w:t>
-      </w:r>
-      <w:proofErr w:type="spellEnd"/>
-      <w:r>
-        <w:t xml:space="preserve"> &lt;- </w:t>
-      </w:r>
-      <w:proofErr w:type="spellStart"/>
-      <w:r>
-        <w:t>RegulatoryPressure</w:t>
-      </w:r>
-      <w:proofErr w:type="spellEnd"/>
+      <w:r>
+        <w:t>ComputeCosts -&gt; EnterpriseAdoption &lt;- RegulatoryPressure</w:t>
+      </w:r>
     </w:p>
     <w:p>
       <w:pPr>
@@ -1906,7 +1648,6 @@
           <w:tab w:val="left" w:pos="5560"/>
         </w:tabs>
       </w:pPr>
-      <w:proofErr w:type="spellStart"/>
       <w:r>
         <w:rPr>
           <w:b/>
@@ -1914,11 +1655,9 @@
         </w:rPr>
         <w:t>HypeLevel</w:t>
       </w:r>
-      <w:proofErr w:type="spellEnd"/>
       <w:r>
         <w:t xml:space="preserve"> influences </w:t>
       </w:r>
-      <w:proofErr w:type="spellStart"/>
       <w:r>
         <w:rPr>
           <w:b/>
@@ -1926,7 +1665,6 @@
         </w:rPr>
         <w:t>VCInvestment</w:t>
       </w:r>
-      <w:proofErr w:type="spellEnd"/>
       <w:r>
         <w:t xml:space="preserve"> due to herd mentality and public perception.</w:t>
       </w:r>
@@ -1937,7 +1675,6 @@
           <w:tab w:val="left" w:pos="5560"/>
         </w:tabs>
       </w:pPr>
-      <w:proofErr w:type="spellStart"/>
       <w:r>
         <w:rPr>
           <w:b/>
@@ -1945,11 +1682,9 @@
         </w:rPr>
         <w:t>HypeLevel</w:t>
       </w:r>
-      <w:proofErr w:type="spellEnd"/>
       <w:r>
         <w:t xml:space="preserve"> influences </w:t>
       </w:r>
-      <w:proofErr w:type="spellStart"/>
       <w:r>
         <w:rPr>
           <w:b/>
@@ -1957,7 +1692,6 @@
         </w:rPr>
         <w:t>LabourMarketImpact</w:t>
       </w:r>
-      <w:proofErr w:type="spellEnd"/>
       <w:r>
         <w:t xml:space="preserve"> as more people will want to work in the area.</w:t>
       </w:r>
@@ -1968,7 +1702,6 @@
           <w:tab w:val="left" w:pos="5560"/>
         </w:tabs>
       </w:pPr>
-      <w:proofErr w:type="spellStart"/>
       <w:r>
         <w:rPr>
           <w:b/>
@@ -1976,11 +1709,9 @@
         </w:rPr>
         <w:t>RegulatoryPressure</w:t>
       </w:r>
-      <w:proofErr w:type="spellEnd"/>
       <w:r>
         <w:t xml:space="preserve"> can influence the </w:t>
       </w:r>
-      <w:proofErr w:type="spellStart"/>
       <w:r>
         <w:rPr>
           <w:b/>
@@ -1988,7 +1719,6 @@
         </w:rPr>
         <w:t>LabourMarketImpact</w:t>
       </w:r>
-      <w:proofErr w:type="spellEnd"/>
       <w:r>
         <w:t xml:space="preserve"> by implementing policy that promotes employment in the area.</w:t>
       </w:r>
@@ -1999,7 +1729,6 @@
           <w:tab w:val="left" w:pos="5560"/>
         </w:tabs>
       </w:pPr>
-      <w:proofErr w:type="spellStart"/>
       <w:r>
         <w:rPr>
           <w:b/>
@@ -2007,11 +1736,9 @@
         </w:rPr>
         <w:t>RegulatoryPressure</w:t>
       </w:r>
-      <w:proofErr w:type="spellEnd"/>
       <w:r>
         <w:t xml:space="preserve"> can influence the </w:t>
       </w:r>
-      <w:proofErr w:type="spellStart"/>
       <w:r>
         <w:rPr>
           <w:b/>
@@ -2019,7 +1746,6 @@
         </w:rPr>
         <w:t>EnterpriseAdoption</w:t>
       </w:r>
-      <w:proofErr w:type="spellEnd"/>
       <w:r>
         <w:t xml:space="preserve"> by implementing policy that </w:t>
       </w:r>
@@ -2039,7 +1765,6 @@
           <w:tab w:val="left" w:pos="5560"/>
         </w:tabs>
       </w:pPr>
-      <w:proofErr w:type="spellStart"/>
       <w:r>
         <w:rPr>
           <w:b/>
@@ -2047,11 +1772,9 @@
         </w:rPr>
         <w:t>VCInvestment</w:t>
       </w:r>
-      <w:proofErr w:type="spellEnd"/>
       <w:r>
         <w:t xml:space="preserve"> increases </w:t>
       </w:r>
-      <w:proofErr w:type="spellStart"/>
       <w:r>
         <w:rPr>
           <w:b/>
@@ -2059,7 +1782,6 @@
         </w:rPr>
         <w:t>EnterpriseAdoption</w:t>
       </w:r>
-      <w:proofErr w:type="spellEnd"/>
       <w:r>
         <w:t xml:space="preserve"> by funding startups and innovation.</w:t>
       </w:r>
@@ -2070,7 +1792,6 @@
           <w:tab w:val="left" w:pos="5560"/>
         </w:tabs>
       </w:pPr>
-      <w:proofErr w:type="spellStart"/>
       <w:r>
         <w:rPr>
           <w:b/>
@@ -2078,11 +1799,9 @@
         </w:rPr>
         <w:t>ComputeCosts</w:t>
       </w:r>
-      <w:proofErr w:type="spellEnd"/>
       <w:r>
         <w:t xml:space="preserve"> affects </w:t>
       </w:r>
-      <w:proofErr w:type="spellStart"/>
       <w:r>
         <w:rPr>
           <w:b/>
@@ -2090,7 +1809,6 @@
         </w:rPr>
         <w:t>EnterpriseAdoption</w:t>
       </w:r>
-      <w:proofErr w:type="spellEnd"/>
       <w:r>
         <w:t xml:space="preserve"> by restricting adoption.</w:t>
       </w:r>
@@ -2133,11 +1851,9 @@
             <w:pPr>
               <w:ind w:firstLine="720"/>
             </w:pPr>
-            <w:proofErr w:type="spellStart"/>
             <w:r>
               <w:t>HypeLevel</w:t>
             </w:r>
-            <w:proofErr w:type="spellEnd"/>
           </w:p>
         </w:tc>
         <w:tc>
@@ -2152,15 +1868,7 @@
               <w:t>P</w:t>
             </w:r>
             <w:r>
-              <w:t>(</w:t>
-            </w:r>
-            <w:proofErr w:type="spellStart"/>
-            <w:r>
-              <w:t>HypeLevel</w:t>
-            </w:r>
-            <w:proofErr w:type="spellEnd"/>
-            <w:r>
-              <w:t>)</w:t>
+              <w:t>(HypeLevel)</w:t>
             </w:r>
           </w:p>
         </w:tc>
@@ -2259,11 +1967,9 @@
             <w:tcW w:w="4508" w:type="dxa"/>
           </w:tcPr>
           <w:p>
-            <w:proofErr w:type="spellStart"/>
             <w:r>
               <w:t>ComputeCosts</w:t>
             </w:r>
-            <w:proofErr w:type="spellEnd"/>
           </w:p>
         </w:tc>
         <w:tc>
@@ -2278,15 +1984,7 @@
               <w:t>P</w:t>
             </w:r>
             <w:r>
-              <w:t>(</w:t>
-            </w:r>
-            <w:proofErr w:type="spellStart"/>
-            <w:r>
-              <w:t>ComputeCosts</w:t>
-            </w:r>
-            <w:proofErr w:type="spellEnd"/>
-            <w:r>
-              <w:t>)</w:t>
+              <w:t>(ComputeCosts)</w:t>
             </w:r>
           </w:p>
         </w:tc>
@@ -2391,11 +2089,9 @@
             <w:tcW w:w="4508" w:type="dxa"/>
           </w:tcPr>
           <w:p>
-            <w:proofErr w:type="spellStart"/>
             <w:r>
               <w:t>RegulatoryPressure</w:t>
             </w:r>
-            <w:proofErr w:type="spellEnd"/>
           </w:p>
         </w:tc>
         <w:tc>
@@ -2410,15 +2106,7 @@
               <w:t>P</w:t>
             </w:r>
             <w:r>
-              <w:t>(</w:t>
-            </w:r>
-            <w:proofErr w:type="spellStart"/>
-            <w:r>
-              <w:t>RegulatoryPressure</w:t>
-            </w:r>
-            <w:proofErr w:type="spellEnd"/>
-            <w:r>
-              <w:t>)</w:t>
+              <w:t>(RegulatoryPressure)</w:t>
             </w:r>
           </w:p>
         </w:tc>
@@ -2518,12 +2206,10 @@
             <w:tcW w:w="3005" w:type="dxa"/>
           </w:tcPr>
           <w:p>
-            <w:proofErr w:type="spellStart"/>
             <w:r>
               <w:lastRenderedPageBreak/>
               <w:t>VCInvestment</w:t>
             </w:r>
-            <w:proofErr w:type="spellEnd"/>
           </w:p>
         </w:tc>
         <w:tc>
@@ -2534,11 +2220,9 @@
             <w:pPr>
               <w:cnfStyle w:val="100000000000" w:firstRow="1" w:lastRow="0" w:firstColumn="0" w:lastColumn="0" w:oddVBand="0" w:evenVBand="0" w:oddHBand="0" w:evenHBand="0" w:firstRowFirstColumn="0" w:firstRowLastColumn="0" w:lastRowFirstColumn="0" w:lastRowLastColumn="0"/>
             </w:pPr>
-            <w:proofErr w:type="spellStart"/>
             <w:r>
               <w:t>HypeLevel</w:t>
             </w:r>
-            <w:proofErr w:type="spellEnd"/>
           </w:p>
         </w:tc>
         <w:tc>
@@ -2550,23 +2234,7 @@
               <w:cnfStyle w:val="100000000000" w:firstRow="1" w:lastRow="0" w:firstColumn="0" w:lastColumn="0" w:oddVBand="0" w:evenVBand="0" w:oddHBand="0" w:evenHBand="0" w:firstRowFirstColumn="0" w:firstRowLastColumn="0" w:lastRowFirstColumn="0" w:lastRowLastColumn="0"/>
             </w:pPr>
             <w:r>
-              <w:t>P(</w:t>
-            </w:r>
-            <w:proofErr w:type="spellStart"/>
-            <w:r>
-              <w:t>VCInvestment</w:t>
-            </w:r>
-            <w:proofErr w:type="spellEnd"/>
-            <w:r>
-              <w:t xml:space="preserve"> | </w:t>
-            </w:r>
-            <w:proofErr w:type="spellStart"/>
-            <w:r>
-              <w:t>HypeLevel</w:t>
-            </w:r>
-            <w:proofErr w:type="spellEnd"/>
-            <w:r>
-              <w:t>)</w:t>
+              <w:t>P(VCInvestment | HypeLevel)</w:t>
             </w:r>
           </w:p>
         </w:tc>
@@ -4724,13 +4392,8 @@
       <w:r>
         <w:t xml:space="preserve">,  </w:t>
       </w:r>
-      <w:proofErr w:type="spellStart"/>
-      <w:r>
-        <w:t>WetGrass</w:t>
-      </w:r>
-      <w:proofErr w:type="spellEnd"/>
-      <w:r>
-        <w:t xml:space="preserve"> (depends on both Rain and Sprinkler)</w:t>
+      <w:r>
+        <w:t>WetGrass (depends on both Rain and Sprinkler)</w:t>
       </w:r>
     </w:p>
     <w:p/>
@@ -4747,13 +4410,8 @@
       <w:r>
         <w:t xml:space="preserve"> </w:t>
       </w:r>
-      <w:proofErr w:type="spellStart"/>
-      <w:r>
-        <w:t>WetGrass</w:t>
-      </w:r>
-      <w:proofErr w:type="spellEnd"/>
-      <w:r>
-        <w:t>)</w:t>
+      <w:r>
+        <w:t>WetGrass)</w:t>
       </w:r>
       <w:r>
         <w:t xml:space="preserve"> </w:t>
@@ -4801,13 +4459,8 @@
         <w:t xml:space="preserve"> * </w:t>
       </w:r>
       <w:r>
-        <w:t>P(</w:t>
-      </w:r>
-      <w:proofErr w:type="spellStart"/>
-      <w:r>
-        <w:t>WetGrass</w:t>
-      </w:r>
-      <w:proofErr w:type="spellEnd"/>
+        <w:t>P(WetGrass</w:t>
+      </w:r>
       <w:r>
         <w:t xml:space="preserve"> </w:t>
       </w:r>
@@ -5077,22 +4730,10 @@
         <w:pStyle w:val="Heading2"/>
       </w:pPr>
       <w:r>
+        <w:t xml:space="preserve">1.3 </w:t>
+      </w:r>
+      <w:r>
         <w:t>IMPLEMENTATION AND ANALYSIS OF NAÏVE BAYES CLASSIFIERS</w:t>
-      </w:r>
-    </w:p>
-    <w:p>
-      <w:pPr>
-        <w:pStyle w:val="ListParagraph"/>
-        <w:numPr>
-          <w:ilvl w:val="1"/>
-          <w:numId w:val="4"/>
-        </w:numPr>
-        <w:tabs>
-          <w:tab w:val="left" w:pos="5560"/>
-        </w:tabs>
-      </w:pPr>
-      <w:r>
-        <w:t>DATA SELECTION AND PREPROCESSING</w:t>
       </w:r>
     </w:p>
     <w:p>
@@ -5100,7 +4741,339 @@
         <w:pStyle w:val="ListParagraph"/>
         <w:numPr>
           <w:ilvl w:val="2"/>
-          <w:numId w:val="4"/>
+          <w:numId w:val="9"/>
+        </w:numPr>
+        <w:tabs>
+          <w:tab w:val="left" w:pos="5560"/>
+        </w:tabs>
+      </w:pPr>
+      <w:r>
+        <w:t>DATA SELECTION AND PREPROCESSING</w:t>
+      </w:r>
+    </w:p>
+    <w:p>
+      <w:pPr>
+        <w:tabs>
+          <w:tab w:val="left" w:pos="5560"/>
+        </w:tabs>
+        <w:ind w:left="360"/>
+      </w:pPr>
+    </w:p>
+    <w:tbl>
+      <w:tblPr>
+        <w:tblStyle w:val="GridTable5Dark"/>
+        <w:tblW w:w="0" w:type="auto"/>
+        <w:tblLook w:val="04A0" w:firstRow="1" w:lastRow="0" w:firstColumn="1" w:lastColumn="0" w:noHBand="0" w:noVBand="1"/>
+      </w:tblPr>
+      <w:tblGrid>
+        <w:gridCol w:w="3005"/>
+        <w:gridCol w:w="3005"/>
+        <w:gridCol w:w="3006"/>
+      </w:tblGrid>
+      <w:tr>
+        <w:trPr>
+          <w:cnfStyle w:val="100000000000" w:firstRow="1" w:lastRow="0" w:firstColumn="0" w:lastColumn="0" w:oddVBand="0" w:evenVBand="0" w:oddHBand="0" w:evenHBand="0" w:firstRowFirstColumn="0" w:firstRowLastColumn="0" w:lastRowFirstColumn="0" w:lastRowLastColumn="0"/>
+        </w:trPr>
+        <w:tc>
+          <w:tcPr>
+            <w:cnfStyle w:val="001000000000" w:firstRow="0" w:lastRow="0" w:firstColumn="1" w:lastColumn="0" w:oddVBand="0" w:evenVBand="0" w:oddHBand="0" w:evenHBand="0" w:firstRowFirstColumn="0" w:firstRowLastColumn="0" w:lastRowFirstColumn="0" w:lastRowLastColumn="0"/>
+            <w:tcW w:w="3005" w:type="dxa"/>
+          </w:tcPr>
+          <w:p>
+            <w:pPr>
+              <w:tabs>
+                <w:tab w:val="left" w:pos="5560"/>
+              </w:tabs>
+            </w:pPr>
+          </w:p>
+        </w:tc>
+        <w:tc>
+          <w:tcPr>
+            <w:tcW w:w="3005" w:type="dxa"/>
+          </w:tcPr>
+          <w:p>
+            <w:pPr>
+              <w:tabs>
+                <w:tab w:val="left" w:pos="5560"/>
+              </w:tabs>
+              <w:cnfStyle w:val="100000000000" w:firstRow="1" w:lastRow="0" w:firstColumn="0" w:lastColumn="0" w:oddVBand="0" w:evenVBand="0" w:oddHBand="0" w:evenHBand="0" w:firstRowFirstColumn="0" w:firstRowLastColumn="0" w:lastRowFirstColumn="0" w:lastRowLastColumn="0"/>
+            </w:pPr>
+            <w:r>
+              <w:t>Bayesian Networks</w:t>
+            </w:r>
+          </w:p>
+        </w:tc>
+        <w:tc>
+          <w:tcPr>
+            <w:tcW w:w="3006" w:type="dxa"/>
+          </w:tcPr>
+          <w:p>
+            <w:pPr>
+              <w:tabs>
+                <w:tab w:val="left" w:pos="5560"/>
+              </w:tabs>
+              <w:cnfStyle w:val="100000000000" w:firstRow="1" w:lastRow="0" w:firstColumn="0" w:lastColumn="0" w:oddVBand="0" w:evenVBand="0" w:oddHBand="0" w:evenHBand="0" w:firstRowFirstColumn="0" w:firstRowLastColumn="0" w:lastRowFirstColumn="0" w:lastRowLastColumn="0"/>
+            </w:pPr>
+            <w:r>
+              <w:t>Naïve Bayes Classifiers</w:t>
+            </w:r>
+          </w:p>
+        </w:tc>
+      </w:tr>
+      <w:tr>
+        <w:trPr>
+          <w:cnfStyle w:val="000000100000" w:firstRow="0" w:lastRow="0" w:firstColumn="0" w:lastColumn="0" w:oddVBand="0" w:evenVBand="0" w:oddHBand="1" w:evenHBand="0" w:firstRowFirstColumn="0" w:firstRowLastColumn="0" w:lastRowFirstColumn="0" w:lastRowLastColumn="0"/>
+        </w:trPr>
+        <w:tc>
+          <w:tcPr>
+            <w:cnfStyle w:val="001000000000" w:firstRow="0" w:lastRow="0" w:firstColumn="1" w:lastColumn="0" w:oddVBand="0" w:evenVBand="0" w:oddHBand="0" w:evenHBand="0" w:firstRowFirstColumn="0" w:firstRowLastColumn="0" w:lastRowFirstColumn="0" w:lastRowLastColumn="0"/>
+            <w:tcW w:w="3005" w:type="dxa"/>
+          </w:tcPr>
+          <w:p>
+            <w:pPr>
+              <w:tabs>
+                <w:tab w:val="left" w:pos="5560"/>
+              </w:tabs>
+            </w:pPr>
+            <w:r>
+              <w:t>Prior Probabilities</w:t>
+            </w:r>
+          </w:p>
+        </w:tc>
+        <w:tc>
+          <w:tcPr>
+            <w:tcW w:w="3005" w:type="dxa"/>
+          </w:tcPr>
+          <w:p>
+            <w:pPr>
+              <w:tabs>
+                <w:tab w:val="left" w:pos="5560"/>
+              </w:tabs>
+              <w:cnfStyle w:val="000000100000" w:firstRow="0" w:lastRow="0" w:firstColumn="0" w:lastColumn="0" w:oddVBand="0" w:evenVBand="0" w:oddHBand="1" w:evenHBand="0" w:firstRowFirstColumn="0" w:firstRowLastColumn="0" w:lastRowFirstColumn="0" w:lastRowLastColumn="0"/>
+            </w:pPr>
+            <w:r>
+              <w:t>Used as a starting point in inferences as evidence that has already been observed</w:t>
+            </w:r>
+          </w:p>
+        </w:tc>
+        <w:tc>
+          <w:tcPr>
+            <w:tcW w:w="3006" w:type="dxa"/>
+          </w:tcPr>
+          <w:p>
+            <w:pPr>
+              <w:tabs>
+                <w:tab w:val="left" w:pos="5560"/>
+              </w:tabs>
+              <w:cnfStyle w:val="000000100000" w:firstRow="0" w:lastRow="0" w:firstColumn="0" w:lastColumn="0" w:oddVBand="0" w:evenVBand="0" w:oddHBand="1" w:evenHBand="0" w:firstRowFirstColumn="0" w:firstRowLastColumn="0" w:lastRowFirstColumn="0" w:lastRowLastColumn="0"/>
+            </w:pPr>
+            <w:r>
+              <w:t>Again, used as a baseline and is all the information that we have about a class before any observations.</w:t>
+            </w:r>
+          </w:p>
+        </w:tc>
+      </w:tr>
+      <w:tr>
+        <w:tc>
+          <w:tcPr>
+            <w:cnfStyle w:val="001000000000" w:firstRow="0" w:lastRow="0" w:firstColumn="1" w:lastColumn="0" w:oddVBand="0" w:evenVBand="0" w:oddHBand="0" w:evenHBand="0" w:firstRowFirstColumn="0" w:firstRowLastColumn="0" w:lastRowFirstColumn="0" w:lastRowLastColumn="0"/>
+            <w:tcW w:w="3005" w:type="dxa"/>
+          </w:tcPr>
+          <w:p>
+            <w:pPr>
+              <w:tabs>
+                <w:tab w:val="left" w:pos="5560"/>
+              </w:tabs>
+            </w:pPr>
+            <w:r>
+              <w:t>Probability of Evidence</w:t>
+            </w:r>
+          </w:p>
+        </w:tc>
+        <w:tc>
+          <w:tcPr>
+            <w:tcW w:w="3005" w:type="dxa"/>
+          </w:tcPr>
+          <w:p>
+            <w:pPr>
+              <w:tabs>
+                <w:tab w:val="left" w:pos="5560"/>
+              </w:tabs>
+              <w:cnfStyle w:val="000000000000" w:firstRow="0" w:lastRow="0" w:firstColumn="0" w:lastColumn="0" w:oddVBand="0" w:evenVBand="0" w:oddHBand="0" w:evenHBand="0" w:firstRowFirstColumn="0" w:firstRowLastColumn="0" w:lastRowFirstColumn="0" w:lastRowLastColumn="0"/>
+            </w:pPr>
+            <w:r>
+              <w:t>The full joint probability of separate observations</w:t>
+            </w:r>
+          </w:p>
+        </w:tc>
+        <w:tc>
+          <w:tcPr>
+            <w:tcW w:w="3006" w:type="dxa"/>
+          </w:tcPr>
+          <w:p>
+            <w:pPr>
+              <w:tabs>
+                <w:tab w:val="left" w:pos="5560"/>
+              </w:tabs>
+              <w:cnfStyle w:val="000000000000" w:firstRow="0" w:lastRow="0" w:firstColumn="0" w:lastColumn="0" w:oddVBand="0" w:evenVBand="0" w:oddHBand="0" w:evenHBand="0" w:firstRowFirstColumn="0" w:firstRowLastColumn="0" w:lastRowFirstColumn="0" w:lastRowLastColumn="0"/>
+            </w:pPr>
+            <w:r>
+              <w:t>Used to normalise queries</w:t>
+            </w:r>
+          </w:p>
+        </w:tc>
+      </w:tr>
+      <w:tr>
+        <w:trPr>
+          <w:cnfStyle w:val="000000100000" w:firstRow="0" w:lastRow="0" w:firstColumn="0" w:lastColumn="0" w:oddVBand="0" w:evenVBand="0" w:oddHBand="1" w:evenHBand="0" w:firstRowFirstColumn="0" w:firstRowLastColumn="0" w:lastRowFirstColumn="0" w:lastRowLastColumn="0"/>
+        </w:trPr>
+        <w:tc>
+          <w:tcPr>
+            <w:cnfStyle w:val="001000000000" w:firstRow="0" w:lastRow="0" w:firstColumn="1" w:lastColumn="0" w:oddVBand="0" w:evenVBand="0" w:oddHBand="0" w:evenHBand="0" w:firstRowFirstColumn="0" w:firstRowLastColumn="0" w:lastRowFirstColumn="0" w:lastRowLastColumn="0"/>
+            <w:tcW w:w="3005" w:type="dxa"/>
+          </w:tcPr>
+          <w:p>
+            <w:pPr>
+              <w:tabs>
+                <w:tab w:val="left" w:pos="5560"/>
+              </w:tabs>
+            </w:pPr>
+            <w:r>
+              <w:t>Likelihood of Evidence</w:t>
+            </w:r>
+          </w:p>
+        </w:tc>
+        <w:tc>
+          <w:tcPr>
+            <w:tcW w:w="3005" w:type="dxa"/>
+          </w:tcPr>
+          <w:p>
+            <w:pPr>
+              <w:tabs>
+                <w:tab w:val="left" w:pos="5560"/>
+              </w:tabs>
+              <w:cnfStyle w:val="000000100000" w:firstRow="0" w:lastRow="0" w:firstColumn="0" w:lastColumn="0" w:oddVBand="0" w:evenVBand="0" w:oddHBand="1" w:evenHBand="0" w:firstRowFirstColumn="0" w:firstRowLastColumn="0" w:lastRowFirstColumn="0" w:lastRowLastColumn="0"/>
+            </w:pPr>
+            <w:r>
+              <w:t xml:space="preserve">This is the probability across the network of </w:t>
+            </w:r>
+            <w:r>
+              <w:lastRenderedPageBreak/>
+              <w:t>observing evidence E given a hypothesis H</w:t>
+            </w:r>
+          </w:p>
+        </w:tc>
+        <w:tc>
+          <w:tcPr>
+            <w:tcW w:w="3006" w:type="dxa"/>
+          </w:tcPr>
+          <w:p>
+            <w:pPr>
+              <w:tabs>
+                <w:tab w:val="left" w:pos="5560"/>
+              </w:tabs>
+              <w:cnfStyle w:val="000000100000" w:firstRow="0" w:lastRow="0" w:firstColumn="0" w:lastColumn="0" w:oddVBand="0" w:evenVBand="0" w:oddHBand="1" w:evenHBand="0" w:firstRowFirstColumn="0" w:firstRowLastColumn="0" w:lastRowFirstColumn="0" w:lastRowLastColumn="0"/>
+            </w:pPr>
+            <w:r>
+              <w:lastRenderedPageBreak/>
+              <w:t>The product of feature probabilities given a class</w:t>
+            </w:r>
+          </w:p>
+        </w:tc>
+      </w:tr>
+    </w:tbl>
+    <w:p>
+      <w:pPr>
+        <w:tabs>
+          <w:tab w:val="left" w:pos="5560"/>
+        </w:tabs>
+        <w:ind w:left="360"/>
+      </w:pPr>
+    </w:p>
+    <w:p>
+      <w:pPr>
+        <w:tabs>
+          <w:tab w:val="left" w:pos="5560"/>
+        </w:tabs>
+      </w:pPr>
+    </w:p>
+    <w:p>
+      <w:pPr>
+        <w:tabs>
+          <w:tab w:val="left" w:pos="5560"/>
+        </w:tabs>
+        <w:rPr>
+          <w:b/>
+          <w:bCs/>
+        </w:rPr>
+      </w:pPr>
+      <w:r>
+        <w:rPr>
+          <w:b/>
+          <w:bCs/>
+        </w:rPr>
+        <w:t>Datasets</w:t>
+      </w:r>
+    </w:p>
+    <w:p>
+      <w:pPr>
+        <w:tabs>
+          <w:tab w:val="left" w:pos="5560"/>
+        </w:tabs>
+      </w:pPr>
+      <w:r>
+        <w:t xml:space="preserve">The Abalone dataset is not ideal for </w:t>
+      </w:r>
+      <w:r>
+        <w:t xml:space="preserve">Naïve Bayes classification tasks. As can be seen from the code required, nearly all of the attributes are continuous numeric attributes so they need to be </w:t>
+      </w:r>
+      <w:r>
+        <w:t>separated</w:t>
+      </w:r>
+      <w:r>
+        <w:t xml:space="preserve"> (binned) into categories. This is an arbitrary process, the parameters of which are not defined very well. Also, some of the dataset attributes are very closely correlated (i.e. length, diameter, and weight). The target for this dataset is generally predicting the age of an Abalone (i.e. number of rings), and this is also a numeric target, so proves difficult for Naïve Bayes.</w:t>
+      </w:r>
+    </w:p>
+    <w:p>
+      <w:pPr>
+        <w:tabs>
+          <w:tab w:val="left" w:pos="5560"/>
+        </w:tabs>
+      </w:pPr>
+      <w:r>
+        <w:t xml:space="preserve">The Car Evaluation dataset is much more </w:t>
+      </w:r>
+      <w:r>
+        <w:t>suited</w:t>
+      </w:r>
+      <w:r>
+        <w:t xml:space="preserve"> towards Naïve Bayes, </w:t>
+      </w:r>
+      <w:r>
+        <w:t>The target is to predict the acceptability of a car based on attributes like price, maintenance cost, number of doors, people capacity, boot size and safety. All of the features are categorical and independent of each other.  The small number of features (6) and classes (4) also make it ideal to reduce processing complexity and costs.</w:t>
+      </w:r>
+    </w:p>
+    <w:p>
+      <w:pPr>
+        <w:tabs>
+          <w:tab w:val="left" w:pos="5560"/>
+        </w:tabs>
+      </w:pPr>
+    </w:p>
+    <w:p>
+      <w:pPr>
+        <w:tabs>
+          <w:tab w:val="left" w:pos="5560"/>
+        </w:tabs>
+        <w:ind w:left="360"/>
+      </w:pPr>
+    </w:p>
+    <w:p>
+      <w:pPr>
+        <w:pStyle w:val="ListParagraph"/>
+        <w:numPr>
+          <w:ilvl w:val="2"/>
+          <w:numId w:val="9"/>
         </w:numPr>
         <w:tabs>
           <w:tab w:val="left" w:pos="5560"/>
@@ -5571,6 +5544,119 @@
     </w:lvl>
   </w:abstractNum>
   <w:abstractNum w:abstractNumId="3" w15:restartNumberingAfterBreak="0">
+    <w:nsid w:val="21F26CE2"/>
+    <w:multiLevelType w:val="multilevel"/>
+    <w:tmpl w:val="E27EC196"/>
+    <w:lvl w:ilvl="0">
+      <w:start w:val="1"/>
+      <w:numFmt w:val="decimal"/>
+      <w:lvlText w:val="%1"/>
+      <w:lvlJc w:val="left"/>
+      <w:pPr>
+        <w:ind w:left="520" w:hanging="520"/>
+      </w:pPr>
+      <w:rPr>
+        <w:rFonts w:hint="default"/>
+      </w:rPr>
+    </w:lvl>
+    <w:lvl w:ilvl="1">
+      <w:start w:val="3"/>
+      <w:numFmt w:val="decimal"/>
+      <w:lvlText w:val="%1.%2"/>
+      <w:lvlJc w:val="left"/>
+      <w:pPr>
+        <w:ind w:left="700" w:hanging="520"/>
+      </w:pPr>
+      <w:rPr>
+        <w:rFonts w:hint="default"/>
+      </w:rPr>
+    </w:lvl>
+    <w:lvl w:ilvl="2">
+      <w:start w:val="1"/>
+      <w:numFmt w:val="decimal"/>
+      <w:lvlText w:val="%1.%2.%3"/>
+      <w:lvlJc w:val="left"/>
+      <w:pPr>
+        <w:ind w:left="1080" w:hanging="720"/>
+      </w:pPr>
+      <w:rPr>
+        <w:rFonts w:hint="default"/>
+      </w:rPr>
+    </w:lvl>
+    <w:lvl w:ilvl="3">
+      <w:start w:val="1"/>
+      <w:numFmt w:val="decimal"/>
+      <w:lvlText w:val="%1.%2.%3.%4"/>
+      <w:lvlJc w:val="left"/>
+      <w:pPr>
+        <w:ind w:left="1620" w:hanging="1080"/>
+      </w:pPr>
+      <w:rPr>
+        <w:rFonts w:hint="default"/>
+      </w:rPr>
+    </w:lvl>
+    <w:lvl w:ilvl="4">
+      <w:start w:val="1"/>
+      <w:numFmt w:val="decimal"/>
+      <w:lvlText w:val="%1.%2.%3.%4.%5"/>
+      <w:lvlJc w:val="left"/>
+      <w:pPr>
+        <w:ind w:left="1800" w:hanging="1080"/>
+      </w:pPr>
+      <w:rPr>
+        <w:rFonts w:hint="default"/>
+      </w:rPr>
+    </w:lvl>
+    <w:lvl w:ilvl="5">
+      <w:start w:val="1"/>
+      <w:numFmt w:val="decimal"/>
+      <w:lvlText w:val="%1.%2.%3.%4.%5.%6"/>
+      <w:lvlJc w:val="left"/>
+      <w:pPr>
+        <w:ind w:left="2340" w:hanging="1440"/>
+      </w:pPr>
+      <w:rPr>
+        <w:rFonts w:hint="default"/>
+      </w:rPr>
+    </w:lvl>
+    <w:lvl w:ilvl="6">
+      <w:start w:val="1"/>
+      <w:numFmt w:val="decimal"/>
+      <w:lvlText w:val="%1.%2.%3.%4.%5.%6.%7"/>
+      <w:lvlJc w:val="left"/>
+      <w:pPr>
+        <w:ind w:left="2520" w:hanging="1440"/>
+      </w:pPr>
+      <w:rPr>
+        <w:rFonts w:hint="default"/>
+      </w:rPr>
+    </w:lvl>
+    <w:lvl w:ilvl="7">
+      <w:start w:val="1"/>
+      <w:numFmt w:val="decimal"/>
+      <w:lvlText w:val="%1.%2.%3.%4.%5.%6.%7.%8"/>
+      <w:lvlJc w:val="left"/>
+      <w:pPr>
+        <w:ind w:left="3060" w:hanging="1800"/>
+      </w:pPr>
+      <w:rPr>
+        <w:rFonts w:hint="default"/>
+      </w:rPr>
+    </w:lvl>
+    <w:lvl w:ilvl="8">
+      <w:start w:val="1"/>
+      <w:numFmt w:val="decimal"/>
+      <w:lvlText w:val="%1.%2.%3.%4.%5.%6.%7.%8.%9"/>
+      <w:lvlJc w:val="left"/>
+      <w:pPr>
+        <w:ind w:left="3240" w:hanging="1800"/>
+      </w:pPr>
+      <w:rPr>
+        <w:rFonts w:hint="default"/>
+      </w:rPr>
+    </w:lvl>
+  </w:abstractNum>
+  <w:abstractNum w:abstractNumId="4" w15:restartNumberingAfterBreak="0">
     <w:nsid w:val="48A77BC7"/>
     <w:multiLevelType w:val="hybridMultilevel"/>
     <w:tmpl w:val="4BA442A0"/>
@@ -5659,7 +5745,7 @@
       </w:pPr>
     </w:lvl>
   </w:abstractNum>
-  <w:abstractNum w:abstractNumId="4" w15:restartNumberingAfterBreak="0">
+  <w:abstractNum w:abstractNumId="5" w15:restartNumberingAfterBreak="0">
     <w:nsid w:val="4F8017CB"/>
     <w:multiLevelType w:val="hybridMultilevel"/>
     <w:tmpl w:val="EAE05A4C"/>
@@ -5772,7 +5858,7 @@
       </w:rPr>
     </w:lvl>
   </w:abstractNum>
-  <w:abstractNum w:abstractNumId="5" w15:restartNumberingAfterBreak="0">
+  <w:abstractNum w:abstractNumId="6" w15:restartNumberingAfterBreak="0">
     <w:nsid w:val="56C32F0D"/>
     <w:multiLevelType w:val="hybridMultilevel"/>
     <w:tmpl w:val="9388486C"/>
@@ -5885,7 +5971,7 @@
       </w:rPr>
     </w:lvl>
   </w:abstractNum>
-  <w:abstractNum w:abstractNumId="6" w15:restartNumberingAfterBreak="0">
+  <w:abstractNum w:abstractNumId="7" w15:restartNumberingAfterBreak="0">
     <w:nsid w:val="69B221DD"/>
     <w:multiLevelType w:val="multilevel"/>
     <w:tmpl w:val="E24AE762"/>
@@ -6006,7 +6092,7 @@
       </w:rPr>
     </w:lvl>
   </w:abstractNum>
-  <w:abstractNum w:abstractNumId="7" w15:restartNumberingAfterBreak="0">
+  <w:abstractNum w:abstractNumId="8" w15:restartNumberingAfterBreak="0">
     <w:nsid w:val="6B212E96"/>
     <w:multiLevelType w:val="hybridMultilevel"/>
     <w:tmpl w:val="F1ACE154"/>
@@ -6129,18 +6215,21 @@
     <w:abstractNumId w:val="2"/>
   </w:num>
   <w:num w:numId="4" w16cid:durableId="1276903641">
+    <w:abstractNumId w:val="7"/>
+  </w:num>
+  <w:num w:numId="5" w16cid:durableId="663513180">
+    <w:abstractNumId w:val="5"/>
+  </w:num>
+  <w:num w:numId="6" w16cid:durableId="1229077893">
+    <w:abstractNumId w:val="8"/>
+  </w:num>
+  <w:num w:numId="7" w16cid:durableId="653529978">
     <w:abstractNumId w:val="6"/>
   </w:num>
-  <w:num w:numId="5" w16cid:durableId="663513180">
+  <w:num w:numId="8" w16cid:durableId="966856912">
     <w:abstractNumId w:val="4"/>
   </w:num>
-  <w:num w:numId="6" w16cid:durableId="1229077893">
-    <w:abstractNumId w:val="7"/>
-  </w:num>
-  <w:num w:numId="7" w16cid:durableId="653529978">
-    <w:abstractNumId w:val="5"/>
-  </w:num>
-  <w:num w:numId="8" w16cid:durableId="966856912">
+  <w:num w:numId="9" w16cid:durableId="570189264">
     <w:abstractNumId w:val="3"/>
   </w:num>
 </w:numbering>
@@ -7938,6 +8027,109 @@
       </w:tcPr>
     </w:tblStylePr>
   </w:style>
+  <w:style w:type="table" w:styleId="GridTable5Dark">
+    <w:name w:val="Grid Table 5 Dark"/>
+    <w:basedOn w:val="TableNormal"/>
+    <w:uiPriority w:val="50"/>
+    <w:rsid w:val="006F574D"/>
+    <w:tblPr>
+      <w:tblStyleRowBandSize w:val="1"/>
+      <w:tblStyleColBandSize w:val="1"/>
+      <w:tblBorders>
+        <w:top w:val="single" w:sz="4" w:space="0" w:color="FFFFFF" w:themeColor="background1"/>
+        <w:left w:val="single" w:sz="4" w:space="0" w:color="FFFFFF" w:themeColor="background1"/>
+        <w:bottom w:val="single" w:sz="4" w:space="0" w:color="FFFFFF" w:themeColor="background1"/>
+        <w:right w:val="single" w:sz="4" w:space="0" w:color="FFFFFF" w:themeColor="background1"/>
+        <w:insideH w:val="single" w:sz="4" w:space="0" w:color="FFFFFF" w:themeColor="background1"/>
+        <w:insideV w:val="single" w:sz="4" w:space="0" w:color="FFFFFF" w:themeColor="background1"/>
+      </w:tblBorders>
+    </w:tblPr>
+    <w:tcPr>
+      <w:shd w:val="clear" w:color="auto" w:fill="CCCCCC" w:themeFill="text1" w:themeFillTint="33"/>
+    </w:tcPr>
+    <w:tblStylePr w:type="firstRow">
+      <w:rPr>
+        <w:b/>
+        <w:bCs/>
+        <w:color w:val="FFFFFF" w:themeColor="background1"/>
+      </w:rPr>
+      <w:tblPr/>
+      <w:tcPr>
+        <w:tcBorders>
+          <w:top w:val="single" w:sz="4" w:space="0" w:color="FFFFFF" w:themeColor="background1"/>
+          <w:left w:val="single" w:sz="4" w:space="0" w:color="FFFFFF" w:themeColor="background1"/>
+          <w:right w:val="single" w:sz="4" w:space="0" w:color="FFFFFF" w:themeColor="background1"/>
+          <w:insideH w:val="nil"/>
+          <w:insideV w:val="nil"/>
+        </w:tcBorders>
+        <w:shd w:val="clear" w:color="auto" w:fill="000000" w:themeFill="text1"/>
+      </w:tcPr>
+    </w:tblStylePr>
+    <w:tblStylePr w:type="lastRow">
+      <w:rPr>
+        <w:b/>
+        <w:bCs/>
+        <w:color w:val="FFFFFF" w:themeColor="background1"/>
+      </w:rPr>
+      <w:tblPr/>
+      <w:tcPr>
+        <w:tcBorders>
+          <w:left w:val="single" w:sz="4" w:space="0" w:color="FFFFFF" w:themeColor="background1"/>
+          <w:bottom w:val="single" w:sz="4" w:space="0" w:color="FFFFFF" w:themeColor="background1"/>
+          <w:right w:val="single" w:sz="4" w:space="0" w:color="FFFFFF" w:themeColor="background1"/>
+          <w:insideH w:val="nil"/>
+          <w:insideV w:val="nil"/>
+        </w:tcBorders>
+        <w:shd w:val="clear" w:color="auto" w:fill="000000" w:themeFill="text1"/>
+      </w:tcPr>
+    </w:tblStylePr>
+    <w:tblStylePr w:type="firstCol">
+      <w:rPr>
+        <w:b/>
+        <w:bCs/>
+        <w:color w:val="FFFFFF" w:themeColor="background1"/>
+      </w:rPr>
+      <w:tblPr/>
+      <w:tcPr>
+        <w:tcBorders>
+          <w:top w:val="single" w:sz="4" w:space="0" w:color="FFFFFF" w:themeColor="background1"/>
+          <w:left w:val="single" w:sz="4" w:space="0" w:color="FFFFFF" w:themeColor="background1"/>
+          <w:bottom w:val="single" w:sz="4" w:space="0" w:color="FFFFFF" w:themeColor="background1"/>
+          <w:insideV w:val="nil"/>
+        </w:tcBorders>
+        <w:shd w:val="clear" w:color="auto" w:fill="000000" w:themeFill="text1"/>
+      </w:tcPr>
+    </w:tblStylePr>
+    <w:tblStylePr w:type="lastCol">
+      <w:rPr>
+        <w:b/>
+        <w:bCs/>
+        <w:color w:val="FFFFFF" w:themeColor="background1"/>
+      </w:rPr>
+      <w:tblPr/>
+      <w:tcPr>
+        <w:tcBorders>
+          <w:top w:val="single" w:sz="4" w:space="0" w:color="FFFFFF" w:themeColor="background1"/>
+          <w:bottom w:val="single" w:sz="4" w:space="0" w:color="FFFFFF" w:themeColor="background1"/>
+          <w:right w:val="single" w:sz="4" w:space="0" w:color="FFFFFF" w:themeColor="background1"/>
+          <w:insideV w:val="nil"/>
+        </w:tcBorders>
+        <w:shd w:val="clear" w:color="auto" w:fill="000000" w:themeFill="text1"/>
+      </w:tcPr>
+    </w:tblStylePr>
+    <w:tblStylePr w:type="band1Vert">
+      <w:tblPr/>
+      <w:tcPr>
+        <w:shd w:val="clear" w:color="auto" w:fill="999999" w:themeFill="text1" w:themeFillTint="66"/>
+      </w:tcPr>
+    </w:tblStylePr>
+    <w:tblStylePr w:type="band1Horz">
+      <w:tblPr/>
+      <w:tcPr>
+        <w:shd w:val="clear" w:color="auto" w:fill="999999" w:themeFill="text1" w:themeFillTint="66"/>
+      </w:tcPr>
+    </w:tblStylePr>
+  </w:style>
 </w:styles>
 </file>
 

</xml_diff>